<commit_message>
Authentic Series doc extended to SL_31-54 (24 posts, calendar Dec 14 - Feb 10) + standalone authentic zip D5
</commit_message>
<xml_diff>
--- a/downloads/SL_Authentic_Install_Series.docx
+++ b/downloads/SL_Authentic_Install_Series.docx
@@ -67,7 +67,7 @@
           <w:color w:val="B8860B"/>
           <w:sz w:val="26"/>
         </w:rPr>
-        <w:t>Thirteen real customer installs, photographed by our own crews</w:t>
+        <w:t>Twenty-four real customer installs, photographed by our own crews</w:t>
       </w:r>
     </w:p>
     <w:p>
@@ -1513,6 +1513,1073 @@
           </w:p>
         </w:tc>
       </w:tr>
+      <w:tr>
+        <w:tc>
+          <w:tcPr>
+            <w:tcW w:type="dxa" w:w="1728"/>
+          </w:tcPr>
+          <w:p>
+            <w:r>
+              <w:drawing>
+                <wp:inline xmlns:a="http://schemas.openxmlformats.org/drawingml/2006/main" xmlns:pic="http://schemas.openxmlformats.org/drawingml/2006/picture">
+                  <wp:extent cx="960120" cy="960120"/>
+                  <wp:docPr id="14" name="Picture 14"/>
+                  <wp:cNvGraphicFramePr>
+                    <a:graphicFrameLocks noChangeAspect="1"/>
+                  </wp:cNvGraphicFramePr>
+                  <a:graphic>
+                    <a:graphicData uri="http://schemas.openxmlformats.org/drawingml/2006/picture">
+                      <pic:pic>
+                        <pic:nvPicPr>
+                          <pic:cNvPr id="0" name="SL_44.jpg"/>
+                          <pic:cNvPicPr/>
+                        </pic:nvPicPr>
+                        <pic:blipFill>
+                          <a:blip r:embed="rId22"/>
+                          <a:stretch>
+                            <a:fillRect/>
+                          </a:stretch>
+                        </pic:blipFill>
+                        <pic:spPr>
+                          <a:xfrm>
+                            <a:off x="0" y="0"/>
+                            <a:ext cx="960120" cy="960120"/>
+                          </a:xfrm>
+                          <a:prstGeom prst="rect"/>
+                        </pic:spPr>
+                      </pic:pic>
+                    </a:graphicData>
+                  </a:graphic>
+                </wp:inline>
+              </w:drawing>
+            </w:r>
+          </w:p>
+        </w:tc>
+        <w:tc>
+          <w:tcPr>
+            <w:tcW w:type="dxa" w:w="1656"/>
+          </w:tcPr>
+          <w:p>
+            <w:r/>
+            <w:r>
+              <w:rPr>
+                <w:b/>
+                <w:color w:val="666666"/>
+                <w:sz w:val="19"/>
+              </w:rPr>
+              <w:t>Mon Jan 18</w:t>
+            </w:r>
+          </w:p>
+        </w:tc>
+        <w:tc>
+          <w:tcPr>
+            <w:tcW w:type="dxa" w:w="1656"/>
+          </w:tcPr>
+          <w:p>
+            <w:r/>
+            <w:r>
+              <w:rPr>
+                <w:b/>
+                <w:color w:val="7AB02E"/>
+                <w:sz w:val="19"/>
+              </w:rPr>
+              <w:t>Residential</w:t>
+            </w:r>
+          </w:p>
+        </w:tc>
+        <w:tc>
+          <w:tcPr>
+            <w:tcW w:type="dxa" w:w="4896"/>
+          </w:tcPr>
+          <w:p>
+            <w:r/>
+            <w:r>
+              <w:rPr>
+                <w:b/>
+                <w:color w:val="1E4620"/>
+                <w:sz w:val="19"/>
+              </w:rPr>
+              <w:t xml:space="preserve">SL_44  </w:t>
+            </w:r>
+            <w:r>
+              <w:rPr>
+                <w:sz w:val="19"/>
+              </w:rPr>
+              <w:t>Storybook cottage, dormers lit</w:t>
+            </w:r>
+          </w:p>
+        </w:tc>
+      </w:tr>
+      <w:tr>
+        <w:tc>
+          <w:tcPr>
+            <w:tcW w:type="dxa" w:w="1728"/>
+          </w:tcPr>
+          <w:p>
+            <w:r>
+              <w:drawing>
+                <wp:inline xmlns:a="http://schemas.openxmlformats.org/drawingml/2006/main" xmlns:pic="http://schemas.openxmlformats.org/drawingml/2006/picture">
+                  <wp:extent cx="960120" cy="960120"/>
+                  <wp:docPr id="15" name="Picture 15"/>
+                  <wp:cNvGraphicFramePr>
+                    <a:graphicFrameLocks noChangeAspect="1"/>
+                  </wp:cNvGraphicFramePr>
+                  <a:graphic>
+                    <a:graphicData uri="http://schemas.openxmlformats.org/drawingml/2006/picture">
+                      <pic:pic>
+                        <pic:nvPicPr>
+                          <pic:cNvPr id="0" name="SL_45.jpg"/>
+                          <pic:cNvPicPr/>
+                        </pic:nvPicPr>
+                        <pic:blipFill>
+                          <a:blip r:embed="rId23"/>
+                          <a:stretch>
+                            <a:fillRect/>
+                          </a:stretch>
+                        </pic:blipFill>
+                        <pic:spPr>
+                          <a:xfrm>
+                            <a:off x="0" y="0"/>
+                            <a:ext cx="960120" cy="960120"/>
+                          </a:xfrm>
+                          <a:prstGeom prst="rect"/>
+                        </pic:spPr>
+                      </pic:pic>
+                    </a:graphicData>
+                  </a:graphic>
+                </wp:inline>
+              </w:drawing>
+            </w:r>
+          </w:p>
+        </w:tc>
+        <w:tc>
+          <w:tcPr>
+            <w:tcW w:type="dxa" w:w="1656"/>
+          </w:tcPr>
+          <w:p>
+            <w:r/>
+            <w:r>
+              <w:rPr>
+                <w:b/>
+                <w:color w:val="666666"/>
+                <w:sz w:val="19"/>
+              </w:rPr>
+              <w:t>Wed Jan 20</w:t>
+            </w:r>
+          </w:p>
+        </w:tc>
+        <w:tc>
+          <w:tcPr>
+            <w:tcW w:type="dxa" w:w="1656"/>
+          </w:tcPr>
+          <w:p>
+            <w:r/>
+            <w:r>
+              <w:rPr>
+                <w:b/>
+                <w:color w:val="7AB02E"/>
+                <w:sz w:val="19"/>
+              </w:rPr>
+              <w:t>Residential</w:t>
+            </w:r>
+          </w:p>
+        </w:tc>
+        <w:tc>
+          <w:tcPr>
+            <w:tcW w:type="dxa" w:w="4896"/>
+          </w:tcPr>
+          <w:p>
+            <w:r/>
+            <w:r>
+              <w:rPr>
+                <w:b/>
+                <w:color w:val="1E4620"/>
+                <w:sz w:val="19"/>
+              </w:rPr>
+              <w:t xml:space="preserve">SL_45  </w:t>
+            </w:r>
+            <w:r>
+              <w:rPr>
+                <w:sz w:val="19"/>
+              </w:rPr>
+              <w:t>Hanging snowflakes in the big oak</w:t>
+            </w:r>
+          </w:p>
+        </w:tc>
+      </w:tr>
+      <w:tr>
+        <w:tc>
+          <w:tcPr>
+            <w:tcW w:type="dxa" w:w="1728"/>
+          </w:tcPr>
+          <w:p>
+            <w:r>
+              <w:drawing>
+                <wp:inline xmlns:a="http://schemas.openxmlformats.org/drawingml/2006/main" xmlns:pic="http://schemas.openxmlformats.org/drawingml/2006/picture">
+                  <wp:extent cx="960120" cy="960120"/>
+                  <wp:docPr id="16" name="Picture 16"/>
+                  <wp:cNvGraphicFramePr>
+                    <a:graphicFrameLocks noChangeAspect="1"/>
+                  </wp:cNvGraphicFramePr>
+                  <a:graphic>
+                    <a:graphicData uri="http://schemas.openxmlformats.org/drawingml/2006/picture">
+                      <pic:pic>
+                        <pic:nvPicPr>
+                          <pic:cNvPr id="0" name="SL_46.jpg"/>
+                          <pic:cNvPicPr/>
+                        </pic:nvPicPr>
+                        <pic:blipFill>
+                          <a:blip r:embed="rId24"/>
+                          <a:stretch>
+                            <a:fillRect/>
+                          </a:stretch>
+                        </pic:blipFill>
+                        <pic:spPr>
+                          <a:xfrm>
+                            <a:off x="0" y="0"/>
+                            <a:ext cx="960120" cy="960120"/>
+                          </a:xfrm>
+                          <a:prstGeom prst="rect"/>
+                        </pic:spPr>
+                      </pic:pic>
+                    </a:graphicData>
+                  </a:graphic>
+                </wp:inline>
+              </w:drawing>
+            </w:r>
+          </w:p>
+        </w:tc>
+        <w:tc>
+          <w:tcPr>
+            <w:tcW w:type="dxa" w:w="1656"/>
+          </w:tcPr>
+          <w:p>
+            <w:r/>
+            <w:r>
+              <w:rPr>
+                <w:b/>
+                <w:color w:val="666666"/>
+                <w:sz w:val="19"/>
+              </w:rPr>
+              <w:t>Fri Jan 22</w:t>
+            </w:r>
+          </w:p>
+        </w:tc>
+        <w:tc>
+          <w:tcPr>
+            <w:tcW w:type="dxa" w:w="1656"/>
+          </w:tcPr>
+          <w:p>
+            <w:r/>
+            <w:r>
+              <w:rPr>
+                <w:b/>
+                <w:color w:val="7AB02E"/>
+                <w:sz w:val="19"/>
+              </w:rPr>
+              <w:t>Residential</w:t>
+            </w:r>
+          </w:p>
+        </w:tc>
+        <w:tc>
+          <w:tcPr>
+            <w:tcW w:type="dxa" w:w="4896"/>
+          </w:tcPr>
+          <w:p>
+            <w:r/>
+            <w:r>
+              <w:rPr>
+                <w:b/>
+                <w:color w:val="1E4620"/>
+                <w:sz w:val="19"/>
+              </w:rPr>
+              <w:t xml:space="preserve">SL_46  </w:t>
+            </w:r>
+            <w:r>
+              <w:rPr>
+                <w:sz w:val="19"/>
+              </w:rPr>
+              <w:t>Dormer wreaths, full roofline trace</w:t>
+            </w:r>
+          </w:p>
+        </w:tc>
+      </w:tr>
+      <w:tr>
+        <w:tc>
+          <w:tcPr>
+            <w:tcW w:type="dxa" w:w="1728"/>
+          </w:tcPr>
+          <w:p>
+            <w:r>
+              <w:drawing>
+                <wp:inline xmlns:a="http://schemas.openxmlformats.org/drawingml/2006/main" xmlns:pic="http://schemas.openxmlformats.org/drawingml/2006/picture">
+                  <wp:extent cx="960120" cy="960120"/>
+                  <wp:docPr id="17" name="Picture 17"/>
+                  <wp:cNvGraphicFramePr>
+                    <a:graphicFrameLocks noChangeAspect="1"/>
+                  </wp:cNvGraphicFramePr>
+                  <a:graphic>
+                    <a:graphicData uri="http://schemas.openxmlformats.org/drawingml/2006/picture">
+                      <pic:pic>
+                        <pic:nvPicPr>
+                          <pic:cNvPr id="0" name="SL_47.jpg"/>
+                          <pic:cNvPicPr/>
+                        </pic:nvPicPr>
+                        <pic:blipFill>
+                          <a:blip r:embed="rId25"/>
+                          <a:stretch>
+                            <a:fillRect/>
+                          </a:stretch>
+                        </pic:blipFill>
+                        <pic:spPr>
+                          <a:xfrm>
+                            <a:off x="0" y="0"/>
+                            <a:ext cx="960120" cy="960120"/>
+                          </a:xfrm>
+                          <a:prstGeom prst="rect"/>
+                        </pic:spPr>
+                      </pic:pic>
+                    </a:graphicData>
+                  </a:graphic>
+                </wp:inline>
+              </w:drawing>
+            </w:r>
+          </w:p>
+        </w:tc>
+        <w:tc>
+          <w:tcPr>
+            <w:tcW w:type="dxa" w:w="1656"/>
+          </w:tcPr>
+          <w:p>
+            <w:r/>
+            <w:r>
+              <w:rPr>
+                <w:b/>
+                <w:color w:val="666666"/>
+                <w:sz w:val="19"/>
+              </w:rPr>
+              <w:t>Mon Jan 25</w:t>
+            </w:r>
+          </w:p>
+        </w:tc>
+        <w:tc>
+          <w:tcPr>
+            <w:tcW w:type="dxa" w:w="1656"/>
+          </w:tcPr>
+          <w:p>
+            <w:r/>
+            <w:r>
+              <w:rPr>
+                <w:b/>
+                <w:color w:val="7AB02E"/>
+                <w:sz w:val="19"/>
+              </w:rPr>
+              <w:t>Residential</w:t>
+            </w:r>
+          </w:p>
+        </w:tc>
+        <w:tc>
+          <w:tcPr>
+            <w:tcW w:type="dxa" w:w="4896"/>
+          </w:tcPr>
+          <w:p>
+            <w:r/>
+            <w:r>
+              <w:rPr>
+                <w:b/>
+                <w:color w:val="1E4620"/>
+                <w:sz w:val="19"/>
+              </w:rPr>
+              <w:t xml:space="preserve">SL_47  </w:t>
+            </w:r>
+            <w:r>
+              <w:rPr>
+                <w:sz w:val="19"/>
+              </w:rPr>
+              <w:t>The estate from the long drive</w:t>
+            </w:r>
+          </w:p>
+        </w:tc>
+      </w:tr>
+      <w:tr>
+        <w:tc>
+          <w:tcPr>
+            <w:tcW w:type="dxa" w:w="1728"/>
+          </w:tcPr>
+          <w:p>
+            <w:r>
+              <w:drawing>
+                <wp:inline xmlns:a="http://schemas.openxmlformats.org/drawingml/2006/main" xmlns:pic="http://schemas.openxmlformats.org/drawingml/2006/picture">
+                  <wp:extent cx="960120" cy="960120"/>
+                  <wp:docPr id="18" name="Picture 18"/>
+                  <wp:cNvGraphicFramePr>
+                    <a:graphicFrameLocks noChangeAspect="1"/>
+                  </wp:cNvGraphicFramePr>
+                  <a:graphic>
+                    <a:graphicData uri="http://schemas.openxmlformats.org/drawingml/2006/picture">
+                      <pic:pic>
+                        <pic:nvPicPr>
+                          <pic:cNvPr id="0" name="SL_48.jpg"/>
+                          <pic:cNvPicPr/>
+                        </pic:nvPicPr>
+                        <pic:blipFill>
+                          <a:blip r:embed="rId26"/>
+                          <a:stretch>
+                            <a:fillRect/>
+                          </a:stretch>
+                        </pic:blipFill>
+                        <pic:spPr>
+                          <a:xfrm>
+                            <a:off x="0" y="0"/>
+                            <a:ext cx="960120" cy="960120"/>
+                          </a:xfrm>
+                          <a:prstGeom prst="rect"/>
+                        </pic:spPr>
+                      </pic:pic>
+                    </a:graphicData>
+                  </a:graphic>
+                </wp:inline>
+              </w:drawing>
+            </w:r>
+          </w:p>
+        </w:tc>
+        <w:tc>
+          <w:tcPr>
+            <w:tcW w:type="dxa" w:w="1656"/>
+          </w:tcPr>
+          <w:p>
+            <w:r/>
+            <w:r>
+              <w:rPr>
+                <w:b/>
+                <w:color w:val="666666"/>
+                <w:sz w:val="19"/>
+              </w:rPr>
+              <w:t>Wed Jan 27</w:t>
+            </w:r>
+          </w:p>
+        </w:tc>
+        <w:tc>
+          <w:tcPr>
+            <w:tcW w:type="dxa" w:w="1656"/>
+          </w:tcPr>
+          <w:p>
+            <w:r/>
+            <w:r>
+              <w:rPr>
+                <w:b/>
+                <w:color w:val="7AB02E"/>
+                <w:sz w:val="19"/>
+              </w:rPr>
+              <w:t>Residential</w:t>
+            </w:r>
+          </w:p>
+        </w:tc>
+        <w:tc>
+          <w:tcPr>
+            <w:tcW w:type="dxa" w:w="4896"/>
+          </w:tcPr>
+          <w:p>
+            <w:r/>
+            <w:r>
+              <w:rPr>
+                <w:b/>
+                <w:color w:val="1E4620"/>
+                <w:sz w:val="19"/>
+              </w:rPr>
+              <w:t xml:space="preserve">SL_48  </w:t>
+            </w:r>
+            <w:r>
+              <w:rPr>
+                <w:sz w:val="19"/>
+              </w:rPr>
+              <w:t>House trace plus the giant oak wrap</w:t>
+            </w:r>
+          </w:p>
+        </w:tc>
+      </w:tr>
+      <w:tr>
+        <w:tc>
+          <w:tcPr>
+            <w:tcW w:type="dxa" w:w="1728"/>
+          </w:tcPr>
+          <w:p>
+            <w:r>
+              <w:drawing>
+                <wp:inline xmlns:a="http://schemas.openxmlformats.org/drawingml/2006/main" xmlns:pic="http://schemas.openxmlformats.org/drawingml/2006/picture">
+                  <wp:extent cx="960120" cy="960120"/>
+                  <wp:docPr id="19" name="Picture 19"/>
+                  <wp:cNvGraphicFramePr>
+                    <a:graphicFrameLocks noChangeAspect="1"/>
+                  </wp:cNvGraphicFramePr>
+                  <a:graphic>
+                    <a:graphicData uri="http://schemas.openxmlformats.org/drawingml/2006/picture">
+                      <pic:pic>
+                        <pic:nvPicPr>
+                          <pic:cNvPr id="0" name="SL_49.jpg"/>
+                          <pic:cNvPicPr/>
+                        </pic:nvPicPr>
+                        <pic:blipFill>
+                          <a:blip r:embed="rId27"/>
+                          <a:stretch>
+                            <a:fillRect/>
+                          </a:stretch>
+                        </pic:blipFill>
+                        <pic:spPr>
+                          <a:xfrm>
+                            <a:off x="0" y="0"/>
+                            <a:ext cx="960120" cy="960120"/>
+                          </a:xfrm>
+                          <a:prstGeom prst="rect"/>
+                        </pic:spPr>
+                      </pic:pic>
+                    </a:graphicData>
+                  </a:graphic>
+                </wp:inline>
+              </w:drawing>
+            </w:r>
+          </w:p>
+        </w:tc>
+        <w:tc>
+          <w:tcPr>
+            <w:tcW w:type="dxa" w:w="1656"/>
+          </w:tcPr>
+          <w:p>
+            <w:r/>
+            <w:r>
+              <w:rPr>
+                <w:b/>
+                <w:color w:val="666666"/>
+                <w:sz w:val="19"/>
+              </w:rPr>
+              <w:t>Fri Jan 29</w:t>
+            </w:r>
+          </w:p>
+        </w:tc>
+        <w:tc>
+          <w:tcPr>
+            <w:tcW w:type="dxa" w:w="1656"/>
+          </w:tcPr>
+          <w:p>
+            <w:r/>
+            <w:r>
+              <w:rPr>
+                <w:b/>
+                <w:color w:val="7AB02E"/>
+                <w:sz w:val="19"/>
+              </w:rPr>
+              <w:t>Residential</w:t>
+            </w:r>
+          </w:p>
+        </w:tc>
+        <w:tc>
+          <w:tcPr>
+            <w:tcW w:type="dxa" w:w="4896"/>
+          </w:tcPr>
+          <w:p>
+            <w:r/>
+            <w:r>
+              <w:rPr>
+                <w:b/>
+                <w:color w:val="1E4620"/>
+                <w:sz w:val="19"/>
+              </w:rPr>
+              <w:t xml:space="preserve">SL_49  </w:t>
+            </w:r>
+            <w:r>
+              <w:rPr>
+                <w:sz w:val="19"/>
+              </w:rPr>
+              <w:t>White brick, bright gables</w:t>
+            </w:r>
+          </w:p>
+        </w:tc>
+      </w:tr>
+      <w:tr>
+        <w:tc>
+          <w:tcPr>
+            <w:tcW w:type="dxa" w:w="1728"/>
+          </w:tcPr>
+          <w:p>
+            <w:r>
+              <w:drawing>
+                <wp:inline xmlns:a="http://schemas.openxmlformats.org/drawingml/2006/main" xmlns:pic="http://schemas.openxmlformats.org/drawingml/2006/picture">
+                  <wp:extent cx="960120" cy="960120"/>
+                  <wp:docPr id="20" name="Picture 20"/>
+                  <wp:cNvGraphicFramePr>
+                    <a:graphicFrameLocks noChangeAspect="1"/>
+                  </wp:cNvGraphicFramePr>
+                  <a:graphic>
+                    <a:graphicData uri="http://schemas.openxmlformats.org/drawingml/2006/picture">
+                      <pic:pic>
+                        <pic:nvPicPr>
+                          <pic:cNvPr id="0" name="SL_50.jpg"/>
+                          <pic:cNvPicPr/>
+                        </pic:nvPicPr>
+                        <pic:blipFill>
+                          <a:blip r:embed="rId28"/>
+                          <a:stretch>
+                            <a:fillRect/>
+                          </a:stretch>
+                        </pic:blipFill>
+                        <pic:spPr>
+                          <a:xfrm>
+                            <a:off x="0" y="0"/>
+                            <a:ext cx="960120" cy="960120"/>
+                          </a:xfrm>
+                          <a:prstGeom prst="rect"/>
+                        </pic:spPr>
+                      </pic:pic>
+                    </a:graphicData>
+                  </a:graphic>
+                </wp:inline>
+              </w:drawing>
+            </w:r>
+          </w:p>
+        </w:tc>
+        <w:tc>
+          <w:tcPr>
+            <w:tcW w:type="dxa" w:w="1656"/>
+          </w:tcPr>
+          <w:p>
+            <w:r/>
+            <w:r>
+              <w:rPr>
+                <w:b/>
+                <w:color w:val="666666"/>
+                <w:sz w:val="19"/>
+              </w:rPr>
+              <w:t>Mon Feb 1</w:t>
+            </w:r>
+          </w:p>
+        </w:tc>
+        <w:tc>
+          <w:tcPr>
+            <w:tcW w:type="dxa" w:w="1656"/>
+          </w:tcPr>
+          <w:p>
+            <w:r/>
+            <w:r>
+              <w:rPr>
+                <w:b/>
+                <w:color w:val="7AB02E"/>
+                <w:sz w:val="19"/>
+              </w:rPr>
+              <w:t>Residential</w:t>
+            </w:r>
+          </w:p>
+        </w:tc>
+        <w:tc>
+          <w:tcPr>
+            <w:tcW w:type="dxa" w:w="4896"/>
+          </w:tcPr>
+          <w:p>
+            <w:r/>
+            <w:r>
+              <w:rPr>
+                <w:b/>
+                <w:color w:val="1E4620"/>
+                <w:sz w:val="19"/>
+              </w:rPr>
+              <w:t xml:space="preserve">SL_50  </w:t>
+            </w:r>
+            <w:r>
+              <w:rPr>
+                <w:sz w:val="19"/>
+              </w:rPr>
+              <w:t>Blue hour on the modern farmhouse</w:t>
+            </w:r>
+          </w:p>
+        </w:tc>
+      </w:tr>
+      <w:tr>
+        <w:tc>
+          <w:tcPr>
+            <w:tcW w:type="dxa" w:w="1728"/>
+          </w:tcPr>
+          <w:p>
+            <w:r>
+              <w:drawing>
+                <wp:inline xmlns:a="http://schemas.openxmlformats.org/drawingml/2006/main" xmlns:pic="http://schemas.openxmlformats.org/drawingml/2006/picture">
+                  <wp:extent cx="960120" cy="960120"/>
+                  <wp:docPr id="21" name="Picture 21"/>
+                  <wp:cNvGraphicFramePr>
+                    <a:graphicFrameLocks noChangeAspect="1"/>
+                  </wp:cNvGraphicFramePr>
+                  <a:graphic>
+                    <a:graphicData uri="http://schemas.openxmlformats.org/drawingml/2006/picture">
+                      <pic:pic>
+                        <pic:nvPicPr>
+                          <pic:cNvPr id="0" name="SL_51.jpg"/>
+                          <pic:cNvPicPr/>
+                        </pic:nvPicPr>
+                        <pic:blipFill>
+                          <a:blip r:embed="rId29"/>
+                          <a:stretch>
+                            <a:fillRect/>
+                          </a:stretch>
+                        </pic:blipFill>
+                        <pic:spPr>
+                          <a:xfrm>
+                            <a:off x="0" y="0"/>
+                            <a:ext cx="960120" cy="960120"/>
+                          </a:xfrm>
+                          <a:prstGeom prst="rect"/>
+                        </pic:spPr>
+                      </pic:pic>
+                    </a:graphicData>
+                  </a:graphic>
+                </wp:inline>
+              </w:drawing>
+            </w:r>
+          </w:p>
+        </w:tc>
+        <w:tc>
+          <w:tcPr>
+            <w:tcW w:type="dxa" w:w="1656"/>
+          </w:tcPr>
+          <w:p>
+            <w:r/>
+            <w:r>
+              <w:rPr>
+                <w:b/>
+                <w:color w:val="666666"/>
+                <w:sz w:val="19"/>
+              </w:rPr>
+              <w:t>Wed Feb 3</w:t>
+            </w:r>
+          </w:p>
+        </w:tc>
+        <w:tc>
+          <w:tcPr>
+            <w:tcW w:type="dxa" w:w="1656"/>
+          </w:tcPr>
+          <w:p>
+            <w:r/>
+            <w:r>
+              <w:rPr>
+                <w:b/>
+                <w:color w:val="7AB02E"/>
+                <w:sz w:val="19"/>
+              </w:rPr>
+              <w:t>Residential</w:t>
+            </w:r>
+          </w:p>
+        </w:tc>
+        <w:tc>
+          <w:tcPr>
+            <w:tcW w:type="dxa" w:w="4896"/>
+          </w:tcPr>
+          <w:p>
+            <w:r/>
+            <w:r>
+              <w:rPr>
+                <w:b/>
+                <w:color w:val="1E4620"/>
+                <w:sz w:val="19"/>
+              </w:rPr>
+              <w:t xml:space="preserve">SL_51  </w:t>
+            </w:r>
+            <w:r>
+              <w:rPr>
+                <w:sz w:val="19"/>
+              </w:rPr>
+              <w:t>Every pitch traced, garage included</w:t>
+            </w:r>
+          </w:p>
+        </w:tc>
+      </w:tr>
+      <w:tr>
+        <w:tc>
+          <w:tcPr>
+            <w:tcW w:type="dxa" w:w="1728"/>
+          </w:tcPr>
+          <w:p>
+            <w:r>
+              <w:drawing>
+                <wp:inline xmlns:a="http://schemas.openxmlformats.org/drawingml/2006/main" xmlns:pic="http://schemas.openxmlformats.org/drawingml/2006/picture">
+                  <wp:extent cx="960120" cy="960120"/>
+                  <wp:docPr id="22" name="Picture 22"/>
+                  <wp:cNvGraphicFramePr>
+                    <a:graphicFrameLocks noChangeAspect="1"/>
+                  </wp:cNvGraphicFramePr>
+                  <a:graphic>
+                    <a:graphicData uri="http://schemas.openxmlformats.org/drawingml/2006/picture">
+                      <pic:pic>
+                        <pic:nvPicPr>
+                          <pic:cNvPr id="0" name="SL_52.jpg"/>
+                          <pic:cNvPicPr/>
+                        </pic:nvPicPr>
+                        <pic:blipFill>
+                          <a:blip r:embed="rId30"/>
+                          <a:stretch>
+                            <a:fillRect/>
+                          </a:stretch>
+                        </pic:blipFill>
+                        <pic:spPr>
+                          <a:xfrm>
+                            <a:off x="0" y="0"/>
+                            <a:ext cx="960120" cy="960120"/>
+                          </a:xfrm>
+                          <a:prstGeom prst="rect"/>
+                        </pic:spPr>
+                      </pic:pic>
+                    </a:graphicData>
+                  </a:graphic>
+                </wp:inline>
+              </w:drawing>
+            </w:r>
+          </w:p>
+        </w:tc>
+        <w:tc>
+          <w:tcPr>
+            <w:tcW w:type="dxa" w:w="1656"/>
+          </w:tcPr>
+          <w:p>
+            <w:r/>
+            <w:r>
+              <w:rPr>
+                <w:b/>
+                <w:color w:val="666666"/>
+                <w:sz w:val="19"/>
+              </w:rPr>
+              <w:t>Fri Feb 5</w:t>
+            </w:r>
+          </w:p>
+        </w:tc>
+        <w:tc>
+          <w:tcPr>
+            <w:tcW w:type="dxa" w:w="1656"/>
+          </w:tcPr>
+          <w:p>
+            <w:r/>
+            <w:r>
+              <w:rPr>
+                <w:b/>
+                <w:color w:val="7AB02E"/>
+                <w:sz w:val="19"/>
+              </w:rPr>
+              <w:t>Residential</w:t>
+            </w:r>
+          </w:p>
+        </w:tc>
+        <w:tc>
+          <w:tcPr>
+            <w:tcW w:type="dxa" w:w="4896"/>
+          </w:tcPr>
+          <w:p>
+            <w:r/>
+            <w:r>
+              <w:rPr>
+                <w:b/>
+                <w:color w:val="1E4620"/>
+                <w:sz w:val="19"/>
+              </w:rPr>
+              <w:t xml:space="preserve">SL_52  </w:t>
+            </w:r>
+            <w:r>
+              <w:rPr>
+                <w:sz w:val="19"/>
+              </w:rPr>
+              <w:t>Porch run with garland rails</w:t>
+            </w:r>
+          </w:p>
+        </w:tc>
+      </w:tr>
+      <w:tr>
+        <w:tc>
+          <w:tcPr>
+            <w:tcW w:type="dxa" w:w="1728"/>
+          </w:tcPr>
+          <w:p>
+            <w:r>
+              <w:drawing>
+                <wp:inline xmlns:a="http://schemas.openxmlformats.org/drawingml/2006/main" xmlns:pic="http://schemas.openxmlformats.org/drawingml/2006/picture">
+                  <wp:extent cx="960120" cy="960120"/>
+                  <wp:docPr id="23" name="Picture 23"/>
+                  <wp:cNvGraphicFramePr>
+                    <a:graphicFrameLocks noChangeAspect="1"/>
+                  </wp:cNvGraphicFramePr>
+                  <a:graphic>
+                    <a:graphicData uri="http://schemas.openxmlformats.org/drawingml/2006/picture">
+                      <pic:pic>
+                        <pic:nvPicPr>
+                          <pic:cNvPr id="0" name="SL_53.jpg"/>
+                          <pic:cNvPicPr/>
+                        </pic:nvPicPr>
+                        <pic:blipFill>
+                          <a:blip r:embed="rId31"/>
+                          <a:stretch>
+                            <a:fillRect/>
+                          </a:stretch>
+                        </pic:blipFill>
+                        <pic:spPr>
+                          <a:xfrm>
+                            <a:off x="0" y="0"/>
+                            <a:ext cx="960120" cy="960120"/>
+                          </a:xfrm>
+                          <a:prstGeom prst="rect"/>
+                        </pic:spPr>
+                      </pic:pic>
+                    </a:graphicData>
+                  </a:graphic>
+                </wp:inline>
+              </w:drawing>
+            </w:r>
+          </w:p>
+        </w:tc>
+        <w:tc>
+          <w:tcPr>
+            <w:tcW w:type="dxa" w:w="1656"/>
+          </w:tcPr>
+          <w:p>
+            <w:r/>
+            <w:r>
+              <w:rPr>
+                <w:b/>
+                <w:color w:val="666666"/>
+                <w:sz w:val="19"/>
+              </w:rPr>
+              <w:t>Mon Feb 8</w:t>
+            </w:r>
+          </w:p>
+        </w:tc>
+        <w:tc>
+          <w:tcPr>
+            <w:tcW w:type="dxa" w:w="1656"/>
+          </w:tcPr>
+          <w:p>
+            <w:r/>
+            <w:r>
+              <w:rPr>
+                <w:b/>
+                <w:color w:val="7AB02E"/>
+                <w:sz w:val="19"/>
+              </w:rPr>
+              <w:t>Residential</w:t>
+            </w:r>
+          </w:p>
+        </w:tc>
+        <w:tc>
+          <w:tcPr>
+            <w:tcW w:type="dxa" w:w="4896"/>
+          </w:tcPr>
+          <w:p>
+            <w:r/>
+            <w:r>
+              <w:rPr>
+                <w:b/>
+                <w:color w:val="1E4620"/>
+                <w:sz w:val="19"/>
+              </w:rPr>
+              <w:t xml:space="preserve">SL_53  </w:t>
+            </w:r>
+            <w:r>
+              <w:rPr>
+                <w:sz w:val="19"/>
+              </w:rPr>
+              <w:t>Tall chimney, full gable trace</w:t>
+            </w:r>
+          </w:p>
+        </w:tc>
+      </w:tr>
+      <w:tr>
+        <w:tc>
+          <w:tcPr>
+            <w:tcW w:type="dxa" w:w="1728"/>
+          </w:tcPr>
+          <w:p>
+            <w:r>
+              <w:drawing>
+                <wp:inline xmlns:a="http://schemas.openxmlformats.org/drawingml/2006/main" xmlns:pic="http://schemas.openxmlformats.org/drawingml/2006/picture">
+                  <wp:extent cx="960120" cy="960120"/>
+                  <wp:docPr id="24" name="Picture 24"/>
+                  <wp:cNvGraphicFramePr>
+                    <a:graphicFrameLocks noChangeAspect="1"/>
+                  </wp:cNvGraphicFramePr>
+                  <a:graphic>
+                    <a:graphicData uri="http://schemas.openxmlformats.org/drawingml/2006/picture">
+                      <pic:pic>
+                        <pic:nvPicPr>
+                          <pic:cNvPr id="0" name="SL_54.jpg"/>
+                          <pic:cNvPicPr/>
+                        </pic:nvPicPr>
+                        <pic:blipFill>
+                          <a:blip r:embed="rId32"/>
+                          <a:stretch>
+                            <a:fillRect/>
+                          </a:stretch>
+                        </pic:blipFill>
+                        <pic:spPr>
+                          <a:xfrm>
+                            <a:off x="0" y="0"/>
+                            <a:ext cx="960120" cy="960120"/>
+                          </a:xfrm>
+                          <a:prstGeom prst="rect"/>
+                        </pic:spPr>
+                      </pic:pic>
+                    </a:graphicData>
+                  </a:graphic>
+                </wp:inline>
+              </w:drawing>
+            </w:r>
+          </w:p>
+        </w:tc>
+        <w:tc>
+          <w:tcPr>
+            <w:tcW w:type="dxa" w:w="1656"/>
+          </w:tcPr>
+          <w:p>
+            <w:r/>
+            <w:r>
+              <w:rPr>
+                <w:b/>
+                <w:color w:val="666666"/>
+                <w:sz w:val="19"/>
+              </w:rPr>
+              <w:t>Wed Feb 10</w:t>
+            </w:r>
+          </w:p>
+        </w:tc>
+        <w:tc>
+          <w:tcPr>
+            <w:tcW w:type="dxa" w:w="1656"/>
+          </w:tcPr>
+          <w:p>
+            <w:r/>
+            <w:r>
+              <w:rPr>
+                <w:b/>
+                <w:color w:val="7AB02E"/>
+                <w:sz w:val="19"/>
+              </w:rPr>
+              <w:t>Residential</w:t>
+            </w:r>
+          </w:p>
+        </w:tc>
+        <w:tc>
+          <w:tcPr>
+            <w:tcW w:type="dxa" w:w="4896"/>
+          </w:tcPr>
+          <w:p>
+            <w:r/>
+            <w:r>
+              <w:rPr>
+                <w:b/>
+                <w:color w:val="1E4620"/>
+                <w:sz w:val="19"/>
+              </w:rPr>
+              <w:t xml:space="preserve">SL_54  </w:t>
+            </w:r>
+            <w:r>
+              <w:rPr>
+                <w:sz w:val="19"/>
+              </w:rPr>
+              <w:t>Cottage dormers, wreath at the door</w:t>
+            </w:r>
+          </w:p>
+        </w:tc>
+      </w:tr>
     </w:tbl>
     <w:p>
       <w:pPr>
@@ -1578,7 +2645,7 @@
               <w:drawing>
                 <wp:inline xmlns:a="http://schemas.openxmlformats.org/drawingml/2006/main" xmlns:pic="http://schemas.openxmlformats.org/drawingml/2006/picture">
                   <wp:extent cx="1234440" cy="1234440"/>
-                  <wp:docPr id="14" name="Picture 14"/>
+                  <wp:docPr id="25" name="Picture 25"/>
                   <wp:cNvGraphicFramePr>
                     <a:graphicFrameLocks noChangeAspect="1"/>
                   </wp:cNvGraphicFramePr>
@@ -1688,7 +2755,7 @@
               <w:drawing>
                 <wp:inline xmlns:a="http://schemas.openxmlformats.org/drawingml/2006/main" xmlns:pic="http://schemas.openxmlformats.org/drawingml/2006/picture">
                   <wp:extent cx="1234440" cy="1234440"/>
-                  <wp:docPr id="15" name="Picture 15"/>
+                  <wp:docPr id="26" name="Picture 26"/>
                   <wp:cNvGraphicFramePr>
                     <a:graphicFrameLocks noChangeAspect="1"/>
                   </wp:cNvGraphicFramePr>
@@ -1798,7 +2865,7 @@
               <w:drawing>
                 <wp:inline xmlns:a="http://schemas.openxmlformats.org/drawingml/2006/main" xmlns:pic="http://schemas.openxmlformats.org/drawingml/2006/picture">
                   <wp:extent cx="1234440" cy="1234440"/>
-                  <wp:docPr id="16" name="Picture 16"/>
+                  <wp:docPr id="27" name="Picture 27"/>
                   <wp:cNvGraphicFramePr>
                     <a:graphicFrameLocks noChangeAspect="1"/>
                   </wp:cNvGraphicFramePr>
@@ -1908,7 +2975,7 @@
               <w:drawing>
                 <wp:inline xmlns:a="http://schemas.openxmlformats.org/drawingml/2006/main" xmlns:pic="http://schemas.openxmlformats.org/drawingml/2006/picture">
                   <wp:extent cx="1234440" cy="1234440"/>
-                  <wp:docPr id="17" name="Picture 17"/>
+                  <wp:docPr id="28" name="Picture 28"/>
                   <wp:cNvGraphicFramePr>
                     <a:graphicFrameLocks noChangeAspect="1"/>
                   </wp:cNvGraphicFramePr>
@@ -2018,7 +3085,7 @@
               <w:drawing>
                 <wp:inline xmlns:a="http://schemas.openxmlformats.org/drawingml/2006/main" xmlns:pic="http://schemas.openxmlformats.org/drawingml/2006/picture">
                   <wp:extent cx="1234440" cy="1234440"/>
-                  <wp:docPr id="18" name="Picture 18"/>
+                  <wp:docPr id="29" name="Picture 29"/>
                   <wp:cNvGraphicFramePr>
                     <a:graphicFrameLocks noChangeAspect="1"/>
                   </wp:cNvGraphicFramePr>
@@ -2128,7 +3195,7 @@
               <w:drawing>
                 <wp:inline xmlns:a="http://schemas.openxmlformats.org/drawingml/2006/main" xmlns:pic="http://schemas.openxmlformats.org/drawingml/2006/picture">
                   <wp:extent cx="1234440" cy="1234440"/>
-                  <wp:docPr id="19" name="Picture 19"/>
+                  <wp:docPr id="30" name="Picture 30"/>
                   <wp:cNvGraphicFramePr>
                     <a:graphicFrameLocks noChangeAspect="1"/>
                   </wp:cNvGraphicFramePr>
@@ -2238,7 +3305,7 @@
               <w:drawing>
                 <wp:inline xmlns:a="http://schemas.openxmlformats.org/drawingml/2006/main" xmlns:pic="http://schemas.openxmlformats.org/drawingml/2006/picture">
                   <wp:extent cx="1234440" cy="1234440"/>
-                  <wp:docPr id="20" name="Picture 20"/>
+                  <wp:docPr id="31" name="Picture 31"/>
                   <wp:cNvGraphicFramePr>
                     <a:graphicFrameLocks noChangeAspect="1"/>
                   </wp:cNvGraphicFramePr>
@@ -2348,7 +3415,7 @@
               <w:drawing>
                 <wp:inline xmlns:a="http://schemas.openxmlformats.org/drawingml/2006/main" xmlns:pic="http://schemas.openxmlformats.org/drawingml/2006/picture">
                   <wp:extent cx="1234440" cy="1234440"/>
-                  <wp:docPr id="21" name="Picture 21"/>
+                  <wp:docPr id="32" name="Picture 32"/>
                   <wp:cNvGraphicFramePr>
                     <a:graphicFrameLocks noChangeAspect="1"/>
                   </wp:cNvGraphicFramePr>
@@ -2458,7 +3525,7 @@
               <w:drawing>
                 <wp:inline xmlns:a="http://schemas.openxmlformats.org/drawingml/2006/main" xmlns:pic="http://schemas.openxmlformats.org/drawingml/2006/picture">
                   <wp:extent cx="1234440" cy="1234440"/>
-                  <wp:docPr id="22" name="Picture 22"/>
+                  <wp:docPr id="33" name="Picture 33"/>
                   <wp:cNvGraphicFramePr>
                     <a:graphicFrameLocks noChangeAspect="1"/>
                   </wp:cNvGraphicFramePr>
@@ -2568,7 +3635,7 @@
               <w:drawing>
                 <wp:inline xmlns:a="http://schemas.openxmlformats.org/drawingml/2006/main" xmlns:pic="http://schemas.openxmlformats.org/drawingml/2006/picture">
                   <wp:extent cx="1234440" cy="1234440"/>
-                  <wp:docPr id="23" name="Picture 23"/>
+                  <wp:docPr id="34" name="Picture 34"/>
                   <wp:cNvGraphicFramePr>
                     <a:graphicFrameLocks noChangeAspect="1"/>
                   </wp:cNvGraphicFramePr>
@@ -2678,7 +3745,7 @@
               <w:drawing>
                 <wp:inline xmlns:a="http://schemas.openxmlformats.org/drawingml/2006/main" xmlns:pic="http://schemas.openxmlformats.org/drawingml/2006/picture">
                   <wp:extent cx="1234440" cy="1234440"/>
-                  <wp:docPr id="24" name="Picture 24"/>
+                  <wp:docPr id="35" name="Picture 35"/>
                   <wp:cNvGraphicFramePr>
                     <a:graphicFrameLocks noChangeAspect="1"/>
                   </wp:cNvGraphicFramePr>
@@ -2788,7 +3855,7 @@
               <w:drawing>
                 <wp:inline xmlns:a="http://schemas.openxmlformats.org/drawingml/2006/main" xmlns:pic="http://schemas.openxmlformats.org/drawingml/2006/picture">
                   <wp:extent cx="1234440" cy="1234440"/>
-                  <wp:docPr id="25" name="Picture 25"/>
+                  <wp:docPr id="36" name="Picture 36"/>
                   <wp:cNvGraphicFramePr>
                     <a:graphicFrameLocks noChangeAspect="1"/>
                   </wp:cNvGraphicFramePr>
@@ -2898,7 +3965,7 @@
               <w:drawing>
                 <wp:inline xmlns:a="http://schemas.openxmlformats.org/drawingml/2006/main" xmlns:pic="http://schemas.openxmlformats.org/drawingml/2006/picture">
                   <wp:extent cx="1234440" cy="1234440"/>
-                  <wp:docPr id="26" name="Picture 26"/>
+                  <wp:docPr id="37" name="Picture 37"/>
                   <wp:cNvGraphicFramePr>
                     <a:graphicFrameLocks noChangeAspect="1"/>
                   </wp:cNvGraphicFramePr>
@@ -2978,6 +4045,1216 @@
                 <w:sz w:val="18"/>
               </w:rPr>
               <w:t>#SpruceLights #RealInstall #AuthenticChristmas #ClassicChristmas #RedAndGreen #HolidayLighting #ChristmasLightInstallation #Uplighting #RealHomes #Tradition</w:t>
+            </w:r>
+          </w:p>
+        </w:tc>
+      </w:tr>
+    </w:tbl>
+    <w:p>
+      <w:pPr>
+        <w:spacing w:after="0"/>
+      </w:pPr>
+    </w:p>
+    <w:tbl>
+      <w:tblPr>
+        <w:tblW w:type="auto" w:w="0"/>
+        <w:tblLayout w:type="fixed"/>
+        <w:tblLook w:firstColumn="1" w:firstRow="1" w:lastColumn="0" w:lastRow="0" w:noHBand="0" w:noVBand="1" w:val="04A0"/>
+      </w:tblPr>
+      <w:tblGrid>
+        <w:gridCol w:w="5112"/>
+        <w:gridCol w:w="5112"/>
+      </w:tblGrid>
+      <w:tr>
+        <w:tc>
+          <w:tcPr>
+            <w:tcW w:type="dxa" w:w="2160"/>
+          </w:tcPr>
+          <w:p>
+            <w:r>
+              <w:drawing>
+                <wp:inline xmlns:a="http://schemas.openxmlformats.org/drawingml/2006/main" xmlns:pic="http://schemas.openxmlformats.org/drawingml/2006/picture">
+                  <wp:extent cx="1234440" cy="1234440"/>
+                  <wp:docPr id="38" name="Picture 38"/>
+                  <wp:cNvGraphicFramePr>
+                    <a:graphicFrameLocks noChangeAspect="1"/>
+                  </wp:cNvGraphicFramePr>
+                  <a:graphic>
+                    <a:graphicData uri="http://schemas.openxmlformats.org/drawingml/2006/picture">
+                      <pic:pic>
+                        <pic:nvPicPr>
+                          <pic:cNvPr id="0" name="SL_44.jpg"/>
+                          <pic:cNvPicPr/>
+                        </pic:nvPicPr>
+                        <pic:blipFill>
+                          <a:blip r:embed="rId22"/>
+                          <a:stretch>
+                            <a:fillRect/>
+                          </a:stretch>
+                        </pic:blipFill>
+                        <pic:spPr>
+                          <a:xfrm>
+                            <a:off x="0" y="0"/>
+                            <a:ext cx="1234440" cy="1234440"/>
+                          </a:xfrm>
+                          <a:prstGeom prst="rect"/>
+                        </pic:spPr>
+                      </pic:pic>
+                    </a:graphicData>
+                  </a:graphic>
+                </wp:inline>
+              </w:drawing>
+            </w:r>
+          </w:p>
+        </w:tc>
+        <w:tc>
+          <w:tcPr>
+            <w:tcW w:type="dxa" w:w="7776"/>
+            <w:shd w:val="clear" w:fill="FAF7F0"/>
+          </w:tcPr>
+          <w:p>
+            <w:pPr>
+              <w:spacing w:after="60"/>
+            </w:pPr>
+            <w:r/>
+            <w:r>
+              <w:rPr>
+                <w:b/>
+                <w:color w:val="1E4620"/>
+                <w:sz w:val="22"/>
+              </w:rPr>
+              <w:t xml:space="preserve">SL_44  ·  A Storybook Christmas   </w:t>
+            </w:r>
+            <w:r>
+              <w:rPr>
+                <w:b/>
+                <w:color w:val="7AB02E"/>
+                <w:sz w:val="18"/>
+              </w:rPr>
+              <w:t>RESIDENTIAL</w:t>
+            </w:r>
+          </w:p>
+          <w:p>
+            <w:pPr>
+              <w:spacing w:after="60"/>
+            </w:pPr>
+            <w:r>
+              <w:rPr>
+                <w:sz w:val="21"/>
+              </w:rPr>
+              <w:t>Storybook cottages were made for this. Two lit dormers, a wreath on the door, and warm white tracing every edge of the roof. This one is a real install from this season, photographed the night we finished and left the lights to do the talking.</w:t>
+            </w:r>
+          </w:p>
+          <w:p>
+            <w:pPr>
+              <w:spacing w:after="40"/>
+            </w:pPr>
+            <w:r>
+              <w:rPr>
+                <w:color w:val="666666"/>
+                <w:sz w:val="18"/>
+              </w:rPr>
+              <w:t>#SpruceLights #RealInstall #AuthenticChristmas #StorybookChristmas #CottageChristmas #ChristmasLightInstallation #HolidayLighting #DormerLights #RealHomes #CurbAppeal</w:t>
+            </w:r>
+          </w:p>
+        </w:tc>
+      </w:tr>
+    </w:tbl>
+    <w:p>
+      <w:pPr>
+        <w:spacing w:after="0"/>
+      </w:pPr>
+    </w:p>
+    <w:tbl>
+      <w:tblPr>
+        <w:tblW w:type="auto" w:w="0"/>
+        <w:tblLayout w:type="fixed"/>
+        <w:tblLook w:firstColumn="1" w:firstRow="1" w:lastColumn="0" w:lastRow="0" w:noHBand="0" w:noVBand="1" w:val="04A0"/>
+      </w:tblPr>
+      <w:tblGrid>
+        <w:gridCol w:w="5112"/>
+        <w:gridCol w:w="5112"/>
+      </w:tblGrid>
+      <w:tr>
+        <w:tc>
+          <w:tcPr>
+            <w:tcW w:type="dxa" w:w="2160"/>
+          </w:tcPr>
+          <w:p>
+            <w:r>
+              <w:drawing>
+                <wp:inline xmlns:a="http://schemas.openxmlformats.org/drawingml/2006/main" xmlns:pic="http://schemas.openxmlformats.org/drawingml/2006/picture">
+                  <wp:extent cx="1234440" cy="1234440"/>
+                  <wp:docPr id="39" name="Picture 39"/>
+                  <wp:cNvGraphicFramePr>
+                    <a:graphicFrameLocks noChangeAspect="1"/>
+                  </wp:cNvGraphicFramePr>
+                  <a:graphic>
+                    <a:graphicData uri="http://schemas.openxmlformats.org/drawingml/2006/picture">
+                      <pic:pic>
+                        <pic:nvPicPr>
+                          <pic:cNvPr id="0" name="SL_45.jpg"/>
+                          <pic:cNvPicPr/>
+                        </pic:nvPicPr>
+                        <pic:blipFill>
+                          <a:blip r:embed="rId23"/>
+                          <a:stretch>
+                            <a:fillRect/>
+                          </a:stretch>
+                        </pic:blipFill>
+                        <pic:spPr>
+                          <a:xfrm>
+                            <a:off x="0" y="0"/>
+                            <a:ext cx="1234440" cy="1234440"/>
+                          </a:xfrm>
+                          <a:prstGeom prst="rect"/>
+                        </pic:spPr>
+                      </pic:pic>
+                    </a:graphicData>
+                  </a:graphic>
+                </wp:inline>
+              </w:drawing>
+            </w:r>
+          </w:p>
+        </w:tc>
+        <w:tc>
+          <w:tcPr>
+            <w:tcW w:type="dxa" w:w="7776"/>
+            <w:shd w:val="clear" w:fill="FAF7F0"/>
+          </w:tcPr>
+          <w:p>
+            <w:pPr>
+              <w:spacing w:after="60"/>
+            </w:pPr>
+            <w:r/>
+            <w:r>
+              <w:rPr>
+                <w:b/>
+                <w:color w:val="1E4620"/>
+                <w:sz w:val="22"/>
+              </w:rPr>
+              <w:t xml:space="preserve">SL_45  ·  Snowflakes That Never Melt   </w:t>
+            </w:r>
+            <w:r>
+              <w:rPr>
+                <w:b/>
+                <w:color w:val="7AB02E"/>
+                <w:sz w:val="18"/>
+              </w:rPr>
+              <w:t>RESIDENTIAL</w:t>
+            </w:r>
+          </w:p>
+          <w:p>
+            <w:pPr>
+              <w:spacing w:after="60"/>
+            </w:pPr>
+            <w:r>
+              <w:rPr>
+                <w:sz w:val="21"/>
+              </w:rPr>
+              <w:t>Full disclosure, we climbed into a very large oak to hang these. A dozen glowing snowflakes now float between the branches like the forecast finally cooperated. Real tree, real install, and yes, they come down just as carefully as they went up.</w:t>
+            </w:r>
+          </w:p>
+          <w:p>
+            <w:pPr>
+              <w:spacing w:after="40"/>
+            </w:pPr>
+            <w:r>
+              <w:rPr>
+                <w:color w:val="666666"/>
+                <w:sz w:val="18"/>
+              </w:rPr>
+              <w:t>#SpruceLights #RealInstall #AuthenticChristmas #SnowflakeLights #TreeLighting #HolidayLighting #ChristmasLightInstallation #YardGoals #RealHomes #WinterWonderland</w:t>
+            </w:r>
+          </w:p>
+        </w:tc>
+      </w:tr>
+    </w:tbl>
+    <w:p>
+      <w:pPr>
+        <w:spacing w:after="0"/>
+      </w:pPr>
+    </w:p>
+    <w:tbl>
+      <w:tblPr>
+        <w:tblW w:type="auto" w:w="0"/>
+        <w:tblLayout w:type="fixed"/>
+        <w:tblLook w:firstColumn="1" w:firstRow="1" w:lastColumn="0" w:lastRow="0" w:noHBand="0" w:noVBand="1" w:val="04A0"/>
+      </w:tblPr>
+      <w:tblGrid>
+        <w:gridCol w:w="5112"/>
+        <w:gridCol w:w="5112"/>
+      </w:tblGrid>
+      <w:tr>
+        <w:tc>
+          <w:tcPr>
+            <w:tcW w:type="dxa" w:w="2160"/>
+          </w:tcPr>
+          <w:p>
+            <w:r>
+              <w:drawing>
+                <wp:inline xmlns:a="http://schemas.openxmlformats.org/drawingml/2006/main" xmlns:pic="http://schemas.openxmlformats.org/drawingml/2006/picture">
+                  <wp:extent cx="1234440" cy="1234440"/>
+                  <wp:docPr id="40" name="Picture 40"/>
+                  <wp:cNvGraphicFramePr>
+                    <a:graphicFrameLocks noChangeAspect="1"/>
+                  </wp:cNvGraphicFramePr>
+                  <a:graphic>
+                    <a:graphicData uri="http://schemas.openxmlformats.org/drawingml/2006/picture">
+                      <pic:pic>
+                        <pic:nvPicPr>
+                          <pic:cNvPr id="0" name="SL_46.jpg"/>
+                          <pic:cNvPicPr/>
+                        </pic:nvPicPr>
+                        <pic:blipFill>
+                          <a:blip r:embed="rId24"/>
+                          <a:stretch>
+                            <a:fillRect/>
+                          </a:stretch>
+                        </pic:blipFill>
+                        <pic:spPr>
+                          <a:xfrm>
+                            <a:off x="0" y="0"/>
+                            <a:ext cx="1234440" cy="1234440"/>
+                          </a:xfrm>
+                          <a:prstGeom prst="rect"/>
+                        </pic:spPr>
+                      </pic:pic>
+                    </a:graphicData>
+                  </a:graphic>
+                </wp:inline>
+              </w:drawing>
+            </w:r>
+          </w:p>
+        </w:tc>
+        <w:tc>
+          <w:tcPr>
+            <w:tcW w:type="dxa" w:w="7776"/>
+            <w:shd w:val="clear" w:fill="FAF7F0"/>
+          </w:tcPr>
+          <w:p>
+            <w:pPr>
+              <w:spacing w:after="60"/>
+            </w:pPr>
+            <w:r/>
+            <w:r>
+              <w:rPr>
+                <w:b/>
+                <w:color w:val="1E4620"/>
+                <w:sz w:val="22"/>
+              </w:rPr>
+              <w:t xml:space="preserve">SL_46  ·  Every Arch, Every Column   </w:t>
+            </w:r>
+            <w:r>
+              <w:rPr>
+                <w:b/>
+                <w:color w:val="7AB02E"/>
+                <w:sz w:val="18"/>
+              </w:rPr>
+              <w:t>RESIDENTIAL</w:t>
+            </w:r>
+          </w:p>
+          <w:p>
+            <w:pPr>
+              <w:spacing w:after="60"/>
+            </w:pPr>
+            <w:r>
+              <w:rPr>
+                <w:sz w:val="21"/>
+              </w:rPr>
+              <w:t>Three dormer windows, three fresh wreaths with red bows, and a roofline traced in warm white over the whole thing. Add the lit tree by the drive and the house reads festive from every direction. Our photo from install night, untouched except for a little polish.</w:t>
+            </w:r>
+          </w:p>
+          <w:p>
+            <w:pPr>
+              <w:spacing w:after="40"/>
+            </w:pPr>
+            <w:r>
+              <w:rPr>
+                <w:color w:val="666666"/>
+                <w:sz w:val="18"/>
+              </w:rPr>
+              <w:t>#SpruceLights #RealInstall #AuthenticChristmas #DormerGoals #Wreaths #RooflineLighting #HolidayLighting #ChristmasLightInstallation #RealHomes #ClassicChristmas</w:t>
+            </w:r>
+          </w:p>
+        </w:tc>
+      </w:tr>
+    </w:tbl>
+    <w:p>
+      <w:pPr>
+        <w:spacing w:after="0"/>
+      </w:pPr>
+    </w:p>
+    <w:tbl>
+      <w:tblPr>
+        <w:tblW w:type="auto" w:w="0"/>
+        <w:tblLayout w:type="fixed"/>
+        <w:tblLook w:firstColumn="1" w:firstRow="1" w:lastColumn="0" w:lastRow="0" w:noHBand="0" w:noVBand="1" w:val="04A0"/>
+      </w:tblPr>
+      <w:tblGrid>
+        <w:gridCol w:w="5112"/>
+        <w:gridCol w:w="5112"/>
+      </w:tblGrid>
+      <w:tr>
+        <w:tc>
+          <w:tcPr>
+            <w:tcW w:type="dxa" w:w="2160"/>
+          </w:tcPr>
+          <w:p>
+            <w:r>
+              <w:drawing>
+                <wp:inline xmlns:a="http://schemas.openxmlformats.org/drawingml/2006/main" xmlns:pic="http://schemas.openxmlformats.org/drawingml/2006/picture">
+                  <wp:extent cx="1234440" cy="1234440"/>
+                  <wp:docPr id="41" name="Picture 41"/>
+                  <wp:cNvGraphicFramePr>
+                    <a:graphicFrameLocks noChangeAspect="1"/>
+                  </wp:cNvGraphicFramePr>
+                  <a:graphic>
+                    <a:graphicData uri="http://schemas.openxmlformats.org/drawingml/2006/picture">
+                      <pic:pic>
+                        <pic:nvPicPr>
+                          <pic:cNvPr id="0" name="SL_47.jpg"/>
+                          <pic:cNvPicPr/>
+                        </pic:nvPicPr>
+                        <pic:blipFill>
+                          <a:blip r:embed="rId25"/>
+                          <a:stretch>
+                            <a:fillRect/>
+                          </a:stretch>
+                        </pic:blipFill>
+                        <pic:spPr>
+                          <a:xfrm>
+                            <a:off x="0" y="0"/>
+                            <a:ext cx="1234440" cy="1234440"/>
+                          </a:xfrm>
+                          <a:prstGeom prst="rect"/>
+                        </pic:spPr>
+                      </pic:pic>
+                    </a:graphicData>
+                  </a:graphic>
+                </wp:inline>
+              </w:drawing>
+            </w:r>
+          </w:p>
+        </w:tc>
+        <w:tc>
+          <w:tcPr>
+            <w:tcW w:type="dxa" w:w="7776"/>
+            <w:shd w:val="clear" w:fill="FAF7F0"/>
+          </w:tcPr>
+          <w:p>
+            <w:pPr>
+              <w:spacing w:after="60"/>
+            </w:pPr>
+            <w:r/>
+            <w:r>
+              <w:rPr>
+                <w:b/>
+                <w:color w:val="1E4620"/>
+                <w:sz w:val="22"/>
+              </w:rPr>
+              <w:t xml:space="preserve">SL_47  ·  The Whole Estate, Aglow   </w:t>
+            </w:r>
+            <w:r>
+              <w:rPr>
+                <w:b/>
+                <w:color w:val="7AB02E"/>
+                <w:sz w:val="18"/>
+              </w:rPr>
+              <w:t>RESIDENTIAL</w:t>
+            </w:r>
+          </w:p>
+          <w:p>
+            <w:pPr>
+              <w:spacing w:after="60"/>
+            </w:pPr>
+            <w:r>
+              <w:rPr>
+                <w:sz w:val="21"/>
+              </w:rPr>
+              <w:t>When the driveway is this long, you know the install was a conversation. Rooflines, columned entry, hedges and mature trees all glowing in the same warm white. Large homes are a specialty, and this real install is the proof.</w:t>
+            </w:r>
+          </w:p>
+          <w:p>
+            <w:pPr>
+              <w:spacing w:after="40"/>
+            </w:pPr>
+            <w:r>
+              <w:rPr>
+                <w:color w:val="666666"/>
+                <w:sz w:val="18"/>
+              </w:rPr>
+              <w:t>#SpruceLights #RealInstall #AuthenticChristmas #EstateLighting #LuxuryChristmas #HolidayLighting #ChristmasLightInstallation #GrandEntrance #RealHomes #BookNextSeason</w:t>
+            </w:r>
+          </w:p>
+        </w:tc>
+      </w:tr>
+    </w:tbl>
+    <w:p>
+      <w:pPr>
+        <w:spacing w:after="0"/>
+      </w:pPr>
+    </w:p>
+    <w:tbl>
+      <w:tblPr>
+        <w:tblW w:type="auto" w:w="0"/>
+        <w:tblLayout w:type="fixed"/>
+        <w:tblLook w:firstColumn="1" w:firstRow="1" w:lastColumn="0" w:lastRow="0" w:noHBand="0" w:noVBand="1" w:val="04A0"/>
+      </w:tblPr>
+      <w:tblGrid>
+        <w:gridCol w:w="5112"/>
+        <w:gridCol w:w="5112"/>
+      </w:tblGrid>
+      <w:tr>
+        <w:tc>
+          <w:tcPr>
+            <w:tcW w:type="dxa" w:w="2160"/>
+          </w:tcPr>
+          <w:p>
+            <w:r>
+              <w:drawing>
+                <wp:inline xmlns:a="http://schemas.openxmlformats.org/drawingml/2006/main" xmlns:pic="http://schemas.openxmlformats.org/drawingml/2006/picture">
+                  <wp:extent cx="1234440" cy="1234440"/>
+                  <wp:docPr id="42" name="Picture 42"/>
+                  <wp:cNvGraphicFramePr>
+                    <a:graphicFrameLocks noChangeAspect="1"/>
+                  </wp:cNvGraphicFramePr>
+                  <a:graphic>
+                    <a:graphicData uri="http://schemas.openxmlformats.org/drawingml/2006/picture">
+                      <pic:pic>
+                        <pic:nvPicPr>
+                          <pic:cNvPr id="0" name="SL_48.jpg"/>
+                          <pic:cNvPicPr/>
+                        </pic:nvPicPr>
+                        <pic:blipFill>
+                          <a:blip r:embed="rId26"/>
+                          <a:stretch>
+                            <a:fillRect/>
+                          </a:stretch>
+                        </pic:blipFill>
+                        <pic:spPr>
+                          <a:xfrm>
+                            <a:off x="0" y="0"/>
+                            <a:ext cx="1234440" cy="1234440"/>
+                          </a:xfrm>
+                          <a:prstGeom prst="rect"/>
+                        </pic:spPr>
+                      </pic:pic>
+                    </a:graphicData>
+                  </a:graphic>
+                </wp:inline>
+              </w:drawing>
+            </w:r>
+          </w:p>
+        </w:tc>
+        <w:tc>
+          <w:tcPr>
+            <w:tcW w:type="dxa" w:w="7776"/>
+            <w:shd w:val="clear" w:fill="FAF7F0"/>
+          </w:tcPr>
+          <w:p>
+            <w:pPr>
+              <w:spacing w:after="60"/>
+            </w:pPr>
+            <w:r/>
+            <w:r>
+              <w:rPr>
+                <w:b/>
+                <w:color w:val="1E4620"/>
+                <w:sz w:val="22"/>
+              </w:rPr>
+              <w:t xml:space="preserve">SL_48  ·  Wrapped in Warm White   </w:t>
+            </w:r>
+            <w:r>
+              <w:rPr>
+                <w:b/>
+                <w:color w:val="7AB02E"/>
+                <w:sz w:val="18"/>
+              </w:rPr>
+              <w:t>RESIDENTIAL</w:t>
+            </w:r>
+          </w:p>
+          <w:p>
+            <w:pPr>
+              <w:spacing w:after="60"/>
+            </w:pPr>
+            <w:r>
+              <w:rPr>
+                <w:sz w:val="21"/>
+              </w:rPr>
+              <w:t>The house got the full trace and the giant oak out front got wrapped to the sky. Warm white from curb to canopy, this whole corner glows now. Real install, real customers, photographed the night we flipped the switch.</w:t>
+            </w:r>
+          </w:p>
+          <w:p>
+            <w:pPr>
+              <w:spacing w:after="40"/>
+            </w:pPr>
+            <w:r>
+              <w:rPr>
+                <w:color w:val="666666"/>
+                <w:sz w:val="18"/>
+              </w:rPr>
+              <w:t>#SpruceLights #RealInstall #AuthenticChristmas #TreeWrap #WarmWhiteLights #HolidayLighting #ChristmasLightInstallation #RooflineLighting #RealHomes #YardGoals</w:t>
+            </w:r>
+          </w:p>
+        </w:tc>
+      </w:tr>
+    </w:tbl>
+    <w:p>
+      <w:pPr>
+        <w:spacing w:after="0"/>
+      </w:pPr>
+    </w:p>
+    <w:tbl>
+      <w:tblPr>
+        <w:tblW w:type="auto" w:w="0"/>
+        <w:tblLayout w:type="fixed"/>
+        <w:tblLook w:firstColumn="1" w:firstRow="1" w:lastColumn="0" w:lastRow="0" w:noHBand="0" w:noVBand="1" w:val="04A0"/>
+      </w:tblPr>
+      <w:tblGrid>
+        <w:gridCol w:w="5112"/>
+        <w:gridCol w:w="5112"/>
+      </w:tblGrid>
+      <w:tr>
+        <w:tc>
+          <w:tcPr>
+            <w:tcW w:type="dxa" w:w="2160"/>
+          </w:tcPr>
+          <w:p>
+            <w:r>
+              <w:drawing>
+                <wp:inline xmlns:a="http://schemas.openxmlformats.org/drawingml/2006/main" xmlns:pic="http://schemas.openxmlformats.org/drawingml/2006/picture">
+                  <wp:extent cx="1234440" cy="1234440"/>
+                  <wp:docPr id="43" name="Picture 43"/>
+                  <wp:cNvGraphicFramePr>
+                    <a:graphicFrameLocks noChangeAspect="1"/>
+                  </wp:cNvGraphicFramePr>
+                  <a:graphic>
+                    <a:graphicData uri="http://schemas.openxmlformats.org/drawingml/2006/picture">
+                      <pic:pic>
+                        <pic:nvPicPr>
+                          <pic:cNvPr id="0" name="SL_49.jpg"/>
+                          <pic:cNvPicPr/>
+                        </pic:nvPicPr>
+                        <pic:blipFill>
+                          <a:blip r:embed="rId27"/>
+                          <a:stretch>
+                            <a:fillRect/>
+                          </a:stretch>
+                        </pic:blipFill>
+                        <pic:spPr>
+                          <a:xfrm>
+                            <a:off x="0" y="0"/>
+                            <a:ext cx="1234440" cy="1234440"/>
+                          </a:xfrm>
+                          <a:prstGeom prst="rect"/>
+                        </pic:spPr>
+                      </pic:pic>
+                    </a:graphicData>
+                  </a:graphic>
+                </wp:inline>
+              </w:drawing>
+            </w:r>
+          </w:p>
+        </w:tc>
+        <w:tc>
+          <w:tcPr>
+            <w:tcW w:type="dxa" w:w="7776"/>
+            <w:shd w:val="clear" w:fill="FAF7F0"/>
+          </w:tcPr>
+          <w:p>
+            <w:pPr>
+              <w:spacing w:after="60"/>
+            </w:pPr>
+            <w:r/>
+            <w:r>
+              <w:rPr>
+                <w:b/>
+                <w:color w:val="1E4620"/>
+                <w:sz w:val="22"/>
+              </w:rPr>
+              <w:t xml:space="preserve">SL_49  ·  Bright Gables, Warm Welcome   </w:t>
+            </w:r>
+            <w:r>
+              <w:rPr>
+                <w:b/>
+                <w:color w:val="7AB02E"/>
+                <w:sz w:val="18"/>
+              </w:rPr>
+              <w:t>RESIDENTIAL</w:t>
+            </w:r>
+          </w:p>
+          <w:p>
+            <w:pPr>
+              <w:spacing w:after="60"/>
+            </w:pPr>
+            <w:r>
+              <w:rPr>
+                <w:sz w:val="21"/>
+              </w:rPr>
+              <w:t>Bright gables up top, a lit wreath at the door, and warm white carrying clean across the whole roofline. White brick and holiday lights are a match made in December. Our photo, our install, first night live.</w:t>
+            </w:r>
+          </w:p>
+          <w:p>
+            <w:pPr>
+              <w:spacing w:after="40"/>
+            </w:pPr>
+            <w:r>
+              <w:rPr>
+                <w:color w:val="666666"/>
+                <w:sz w:val="18"/>
+              </w:rPr>
+              <w:t>#SpruceLights #RealInstall #AuthenticChristmas #WhiteBrick #GableLights #HolidayLighting #ChristmasLightInstallation #WarmWhiteLights #RealHomes #WelcomeHome</w:t>
+            </w:r>
+          </w:p>
+        </w:tc>
+      </w:tr>
+    </w:tbl>
+    <w:p>
+      <w:pPr>
+        <w:spacing w:after="0"/>
+      </w:pPr>
+    </w:p>
+    <w:tbl>
+      <w:tblPr>
+        <w:tblW w:type="auto" w:w="0"/>
+        <w:tblLayout w:type="fixed"/>
+        <w:tblLook w:firstColumn="1" w:firstRow="1" w:lastColumn="0" w:lastRow="0" w:noHBand="0" w:noVBand="1" w:val="04A0"/>
+      </w:tblPr>
+      <w:tblGrid>
+        <w:gridCol w:w="5112"/>
+        <w:gridCol w:w="5112"/>
+      </w:tblGrid>
+      <w:tr>
+        <w:tc>
+          <w:tcPr>
+            <w:tcW w:type="dxa" w:w="2160"/>
+          </w:tcPr>
+          <w:p>
+            <w:r>
+              <w:drawing>
+                <wp:inline xmlns:a="http://schemas.openxmlformats.org/drawingml/2006/main" xmlns:pic="http://schemas.openxmlformats.org/drawingml/2006/picture">
+                  <wp:extent cx="1234440" cy="1234440"/>
+                  <wp:docPr id="44" name="Picture 44"/>
+                  <wp:cNvGraphicFramePr>
+                    <a:graphicFrameLocks noChangeAspect="1"/>
+                  </wp:cNvGraphicFramePr>
+                  <a:graphic>
+                    <a:graphicData uri="http://schemas.openxmlformats.org/drawingml/2006/picture">
+                      <pic:pic>
+                        <pic:nvPicPr>
+                          <pic:cNvPr id="0" name="SL_50.jpg"/>
+                          <pic:cNvPicPr/>
+                        </pic:nvPicPr>
+                        <pic:blipFill>
+                          <a:blip r:embed="rId28"/>
+                          <a:stretch>
+                            <a:fillRect/>
+                          </a:stretch>
+                        </pic:blipFill>
+                        <pic:spPr>
+                          <a:xfrm>
+                            <a:off x="0" y="0"/>
+                            <a:ext cx="1234440" cy="1234440"/>
+                          </a:xfrm>
+                          <a:prstGeom prst="rect"/>
+                        </pic:spPr>
+                      </pic:pic>
+                    </a:graphicData>
+                  </a:graphic>
+                </wp:inline>
+              </w:drawing>
+            </w:r>
+          </w:p>
+        </w:tc>
+        <w:tc>
+          <w:tcPr>
+            <w:tcW w:type="dxa" w:w="7776"/>
+            <w:shd w:val="clear" w:fill="FAF7F0"/>
+          </w:tcPr>
+          <w:p>
+            <w:pPr>
+              <w:spacing w:after="60"/>
+            </w:pPr>
+            <w:r/>
+            <w:r>
+              <w:rPr>
+                <w:b/>
+                <w:color w:val="1E4620"/>
+                <w:sz w:val="22"/>
+              </w:rPr>
+              <w:t xml:space="preserve">SL_50  ·  The Modern Farmhouse Glow   </w:t>
+            </w:r>
+            <w:r>
+              <w:rPr>
+                <w:b/>
+                <w:color w:val="7AB02E"/>
+                <w:sz w:val="18"/>
+              </w:rPr>
+              <w:t>RESIDENTIAL</w:t>
+            </w:r>
+          </w:p>
+          <w:p>
+            <w:pPr>
+              <w:spacing w:after="60"/>
+            </w:pPr>
+            <w:r>
+              <w:rPr>
+                <w:sz w:val="21"/>
+              </w:rPr>
+              <w:t>Black windows, clean lines, and a warm white roofline that softens all of it. Modern farmhouses were practically designed for this look. Caught at blue hour right as the lights came on, which is exactly how we photograph every install we can.</w:t>
+            </w:r>
+          </w:p>
+          <w:p>
+            <w:pPr>
+              <w:spacing w:after="40"/>
+            </w:pPr>
+            <w:r>
+              <w:rPr>
+                <w:color w:val="666666"/>
+                <w:sz w:val="18"/>
+              </w:rPr>
+              <w:t>#SpruceLights #RealInstall #AuthenticChristmas #ModernFarmhouse #BlueHour #HolidayLighting #ChristmasLightInstallation #RooflineLighting #RealHomes #FarmhouseChristmas</w:t>
+            </w:r>
+          </w:p>
+        </w:tc>
+      </w:tr>
+    </w:tbl>
+    <w:p>
+      <w:pPr>
+        <w:spacing w:after="0"/>
+      </w:pPr>
+    </w:p>
+    <w:tbl>
+      <w:tblPr>
+        <w:tblW w:type="auto" w:w="0"/>
+        <w:tblLayout w:type="fixed"/>
+        <w:tblLook w:firstColumn="1" w:firstRow="1" w:lastColumn="0" w:lastRow="0" w:noHBand="0" w:noVBand="1" w:val="04A0"/>
+      </w:tblPr>
+      <w:tblGrid>
+        <w:gridCol w:w="5112"/>
+        <w:gridCol w:w="5112"/>
+      </w:tblGrid>
+      <w:tr>
+        <w:tc>
+          <w:tcPr>
+            <w:tcW w:type="dxa" w:w="2160"/>
+          </w:tcPr>
+          <w:p>
+            <w:r>
+              <w:drawing>
+                <wp:inline xmlns:a="http://schemas.openxmlformats.org/drawingml/2006/main" xmlns:pic="http://schemas.openxmlformats.org/drawingml/2006/picture">
+                  <wp:extent cx="1234440" cy="1234440"/>
+                  <wp:docPr id="45" name="Picture 45"/>
+                  <wp:cNvGraphicFramePr>
+                    <a:graphicFrameLocks noChangeAspect="1"/>
+                  </wp:cNvGraphicFramePr>
+                  <a:graphic>
+                    <a:graphicData uri="http://schemas.openxmlformats.org/drawingml/2006/picture">
+                      <pic:pic>
+                        <pic:nvPicPr>
+                          <pic:cNvPr id="0" name="SL_51.jpg"/>
+                          <pic:cNvPicPr/>
+                        </pic:nvPicPr>
+                        <pic:blipFill>
+                          <a:blip r:embed="rId29"/>
+                          <a:stretch>
+                            <a:fillRect/>
+                          </a:stretch>
+                        </pic:blipFill>
+                        <pic:spPr>
+                          <a:xfrm>
+                            <a:off x="0" y="0"/>
+                            <a:ext cx="1234440" cy="1234440"/>
+                          </a:xfrm>
+                          <a:prstGeom prst="rect"/>
+                        </pic:spPr>
+                      </pic:pic>
+                    </a:graphicData>
+                  </a:graphic>
+                </wp:inline>
+              </w:drawing>
+            </w:r>
+          </w:p>
+        </w:tc>
+        <w:tc>
+          <w:tcPr>
+            <w:tcW w:type="dxa" w:w="7776"/>
+            <w:shd w:val="clear" w:fill="FAF7F0"/>
+          </w:tcPr>
+          <w:p>
+            <w:pPr>
+              <w:spacing w:after="60"/>
+            </w:pPr>
+            <w:r/>
+            <w:r>
+              <w:rPr>
+                <w:b/>
+                <w:color w:val="1E4620"/>
+                <w:sz w:val="22"/>
+              </w:rPr>
+              <w:t xml:space="preserve">SL_51  ·  Every Angle Aglow   </w:t>
+            </w:r>
+            <w:r>
+              <w:rPr>
+                <w:b/>
+                <w:color w:val="7AB02E"/>
+                <w:sz w:val="18"/>
+              </w:rPr>
+              <w:t>RESIDENTIAL</w:t>
+            </w:r>
+          </w:p>
+          <w:p>
+            <w:pPr>
+              <w:spacing w:after="60"/>
+            </w:pPr>
+            <w:r>
+              <w:rPr>
+                <w:sz w:val="21"/>
+              </w:rPr>
+              <w:t>Garages count too. Every pitch and peak of this one got traced, so the whole front of the property glows instead of just the front door. Details like that are the difference between decorated and finished.</w:t>
+            </w:r>
+          </w:p>
+          <w:p>
+            <w:pPr>
+              <w:spacing w:after="40"/>
+            </w:pPr>
+            <w:r>
+              <w:rPr>
+                <w:color w:val="666666"/>
+                <w:sz w:val="18"/>
+              </w:rPr>
+              <w:t>#SpruceLights #RealInstall #AuthenticChristmas #GarageGoals #EveryAngle #HolidayLighting #ChristmasLightInstallation #RooflineLighting #RealHomes #FinishedLook</w:t>
+            </w:r>
+          </w:p>
+        </w:tc>
+      </w:tr>
+    </w:tbl>
+    <w:p>
+      <w:pPr>
+        <w:spacing w:after="0"/>
+      </w:pPr>
+    </w:p>
+    <w:tbl>
+      <w:tblPr>
+        <w:tblW w:type="auto" w:w="0"/>
+        <w:tblLayout w:type="fixed"/>
+        <w:tblLook w:firstColumn="1" w:firstRow="1" w:lastColumn="0" w:lastRow="0" w:noHBand="0" w:noVBand="1" w:val="04A0"/>
+      </w:tblPr>
+      <w:tblGrid>
+        <w:gridCol w:w="5112"/>
+        <w:gridCol w:w="5112"/>
+      </w:tblGrid>
+      <w:tr>
+        <w:tc>
+          <w:tcPr>
+            <w:tcW w:type="dxa" w:w="2160"/>
+          </w:tcPr>
+          <w:p>
+            <w:r>
+              <w:drawing>
+                <wp:inline xmlns:a="http://schemas.openxmlformats.org/drawingml/2006/main" xmlns:pic="http://schemas.openxmlformats.org/drawingml/2006/picture">
+                  <wp:extent cx="1234440" cy="1234440"/>
+                  <wp:docPr id="46" name="Picture 46"/>
+                  <wp:cNvGraphicFramePr>
+                    <a:graphicFrameLocks noChangeAspect="1"/>
+                  </wp:cNvGraphicFramePr>
+                  <a:graphic>
+                    <a:graphicData uri="http://schemas.openxmlformats.org/drawingml/2006/picture">
+                      <pic:pic>
+                        <pic:nvPicPr>
+                          <pic:cNvPr id="0" name="SL_52.jpg"/>
+                          <pic:cNvPicPr/>
+                        </pic:nvPicPr>
+                        <pic:blipFill>
+                          <a:blip r:embed="rId30"/>
+                          <a:stretch>
+                            <a:fillRect/>
+                          </a:stretch>
+                        </pic:blipFill>
+                        <pic:spPr>
+                          <a:xfrm>
+                            <a:off x="0" y="0"/>
+                            <a:ext cx="1234440" cy="1234440"/>
+                          </a:xfrm>
+                          <a:prstGeom prst="rect"/>
+                        </pic:spPr>
+                      </pic:pic>
+                    </a:graphicData>
+                  </a:graphic>
+                </wp:inline>
+              </w:drawing>
+            </w:r>
+          </w:p>
+        </w:tc>
+        <w:tc>
+          <w:tcPr>
+            <w:tcW w:type="dxa" w:w="7776"/>
+            <w:shd w:val="clear" w:fill="FAF7F0"/>
+          </w:tcPr>
+          <w:p>
+            <w:pPr>
+              <w:spacing w:after="60"/>
+            </w:pPr>
+            <w:r/>
+            <w:r>
+              <w:rPr>
+                <w:b/>
+                <w:color w:val="1E4620"/>
+                <w:sz w:val="22"/>
+              </w:rPr>
+              <w:t xml:space="preserve">SL_52  ·  The Porch Run, Garland and All   </w:t>
+            </w:r>
+            <w:r>
+              <w:rPr>
+                <w:b/>
+                <w:color w:val="7AB02E"/>
+                <w:sz w:val="18"/>
+              </w:rPr>
+              <w:t>RESIDENTIAL</w:t>
+            </w:r>
+          </w:p>
+          <w:p>
+            <w:pPr>
+              <w:spacing w:after="60"/>
+            </w:pPr>
+            <w:r>
+              <w:rPr>
+                <w:sz w:val="21"/>
+              </w:rPr>
+              <w:t>A porch run this long deserves backup, so the gables got traced and the rails got garland with warm white woven through. Blue hour, first light on, coffee going cold because nobody wanted to go inside. That is a real install night.</w:t>
+            </w:r>
+          </w:p>
+          <w:p>
+            <w:pPr>
+              <w:spacing w:after="40"/>
+            </w:pPr>
+            <w:r>
+              <w:rPr>
+                <w:color w:val="666666"/>
+                <w:sz w:val="18"/>
+              </w:rPr>
+              <w:t>#SpruceLights #RealInstall #AuthenticChristmas #PorchGoals #GarlandAndLights #BlueHour #HolidayLighting #ChristmasLightInstallation #RealHomes #FarmhouseStyle</w:t>
+            </w:r>
+          </w:p>
+        </w:tc>
+      </w:tr>
+    </w:tbl>
+    <w:p>
+      <w:pPr>
+        <w:spacing w:after="0"/>
+      </w:pPr>
+    </w:p>
+    <w:tbl>
+      <w:tblPr>
+        <w:tblW w:type="auto" w:w="0"/>
+        <w:tblLayout w:type="fixed"/>
+        <w:tblLook w:firstColumn="1" w:firstRow="1" w:lastColumn="0" w:lastRow="0" w:noHBand="0" w:noVBand="1" w:val="04A0"/>
+      </w:tblPr>
+      <w:tblGrid>
+        <w:gridCol w:w="5112"/>
+        <w:gridCol w:w="5112"/>
+      </w:tblGrid>
+      <w:tr>
+        <w:tc>
+          <w:tcPr>
+            <w:tcW w:type="dxa" w:w="2160"/>
+          </w:tcPr>
+          <w:p>
+            <w:r>
+              <w:drawing>
+                <wp:inline xmlns:a="http://schemas.openxmlformats.org/drawingml/2006/main" xmlns:pic="http://schemas.openxmlformats.org/drawingml/2006/picture">
+                  <wp:extent cx="1234440" cy="1234440"/>
+                  <wp:docPr id="47" name="Picture 47"/>
+                  <wp:cNvGraphicFramePr>
+                    <a:graphicFrameLocks noChangeAspect="1"/>
+                  </wp:cNvGraphicFramePr>
+                  <a:graphic>
+                    <a:graphicData uri="http://schemas.openxmlformats.org/drawingml/2006/picture">
+                      <pic:pic>
+                        <pic:nvPicPr>
+                          <pic:cNvPr id="0" name="SL_53.jpg"/>
+                          <pic:cNvPicPr/>
+                        </pic:nvPicPr>
+                        <pic:blipFill>
+                          <a:blip r:embed="rId31"/>
+                          <a:stretch>
+                            <a:fillRect/>
+                          </a:stretch>
+                        </pic:blipFill>
+                        <pic:spPr>
+                          <a:xfrm>
+                            <a:off x="0" y="0"/>
+                            <a:ext cx="1234440" cy="1234440"/>
+                          </a:xfrm>
+                          <a:prstGeom prst="rect"/>
+                        </pic:spPr>
+                      </pic:pic>
+                    </a:graphicData>
+                  </a:graphic>
+                </wp:inline>
+              </w:drawing>
+            </w:r>
+          </w:p>
+        </w:tc>
+        <w:tc>
+          <w:tcPr>
+            <w:tcW w:type="dxa" w:w="7776"/>
+            <w:shd w:val="clear" w:fill="FAF7F0"/>
+          </w:tcPr>
+          <w:p>
+            <w:pPr>
+              <w:spacing w:after="60"/>
+            </w:pPr>
+            <w:r/>
+            <w:r>
+              <w:rPr>
+                <w:b/>
+                <w:color w:val="1E4620"/>
+                <w:sz w:val="22"/>
+              </w:rPr>
+              <w:t xml:space="preserve">SL_53  ·  Even the Chimney Dresses Up   </w:t>
+            </w:r>
+            <w:r>
+              <w:rPr>
+                <w:b/>
+                <w:color w:val="7AB02E"/>
+                <w:sz w:val="18"/>
+              </w:rPr>
+              <w:t>RESIDENTIAL</w:t>
+            </w:r>
+          </w:p>
+          <w:p>
+            <w:pPr>
+              <w:spacing w:after="60"/>
+            </w:pPr>
+            <w:r>
+              <w:rPr>
+                <w:sz w:val="21"/>
+              </w:rPr>
+              <w:t>Tall chimney, every gable traced, hedges glowing below. Some homes ask for a little, this one asked for the full trace and wore it well. Our crews photograph installs like this one the night they go live, straight from the ladder.</w:t>
+            </w:r>
+          </w:p>
+          <w:p>
+            <w:pPr>
+              <w:spacing w:after="40"/>
+            </w:pPr>
+            <w:r>
+              <w:rPr>
+                <w:color w:val="666666"/>
+                <w:sz w:val="18"/>
+              </w:rPr>
+              <w:t>#SpruceLights #RealInstall #AuthenticChristmas #ChimneyGoals #RooflineLighting #HolidayLighting #ChristmasLightInstallation #WarmWhiteLights #RealHomes #Craftsmanship</w:t>
+            </w:r>
+          </w:p>
+        </w:tc>
+      </w:tr>
+    </w:tbl>
+    <w:p>
+      <w:pPr>
+        <w:spacing w:after="0"/>
+      </w:pPr>
+    </w:p>
+    <w:tbl>
+      <w:tblPr>
+        <w:tblW w:type="auto" w:w="0"/>
+        <w:tblLayout w:type="fixed"/>
+        <w:tblLook w:firstColumn="1" w:firstRow="1" w:lastColumn="0" w:lastRow="0" w:noHBand="0" w:noVBand="1" w:val="04A0"/>
+      </w:tblPr>
+      <w:tblGrid>
+        <w:gridCol w:w="5112"/>
+        <w:gridCol w:w="5112"/>
+      </w:tblGrid>
+      <w:tr>
+        <w:tc>
+          <w:tcPr>
+            <w:tcW w:type="dxa" w:w="2160"/>
+          </w:tcPr>
+          <w:p>
+            <w:r>
+              <w:drawing>
+                <wp:inline xmlns:a="http://schemas.openxmlformats.org/drawingml/2006/main" xmlns:pic="http://schemas.openxmlformats.org/drawingml/2006/picture">
+                  <wp:extent cx="1234440" cy="1234440"/>
+                  <wp:docPr id="48" name="Picture 48"/>
+                  <wp:cNvGraphicFramePr>
+                    <a:graphicFrameLocks noChangeAspect="1"/>
+                  </wp:cNvGraphicFramePr>
+                  <a:graphic>
+                    <a:graphicData uri="http://schemas.openxmlformats.org/drawingml/2006/picture">
+                      <pic:pic>
+                        <pic:nvPicPr>
+                          <pic:cNvPr id="0" name="SL_54.jpg"/>
+                          <pic:cNvPicPr/>
+                        </pic:nvPicPr>
+                        <pic:blipFill>
+                          <a:blip r:embed="rId32"/>
+                          <a:stretch>
+                            <a:fillRect/>
+                          </a:stretch>
+                        </pic:blipFill>
+                        <pic:spPr>
+                          <a:xfrm>
+                            <a:off x="0" y="0"/>
+                            <a:ext cx="1234440" cy="1234440"/>
+                          </a:xfrm>
+                          <a:prstGeom prst="rect"/>
+                        </pic:spPr>
+                      </pic:pic>
+                    </a:graphicData>
+                  </a:graphic>
+                </wp:inline>
+              </w:drawing>
+            </w:r>
+          </w:p>
+        </w:tc>
+        <w:tc>
+          <w:tcPr>
+            <w:tcW w:type="dxa" w:w="7776"/>
+            <w:shd w:val="clear" w:fill="FAF7F0"/>
+          </w:tcPr>
+          <w:p>
+            <w:pPr>
+              <w:spacing w:after="60"/>
+            </w:pPr>
+            <w:r/>
+            <w:r>
+              <w:rPr>
+                <w:b/>
+                <w:color w:val="1E4620"/>
+                <w:sz w:val="22"/>
+              </w:rPr>
+              <w:t xml:space="preserve">SL_54  ·  Dormers, Twinkling   </w:t>
+            </w:r>
+            <w:r>
+              <w:rPr>
+                <w:b/>
+                <w:color w:val="7AB02E"/>
+                <w:sz w:val="18"/>
+              </w:rPr>
+              <w:t>RESIDENTIAL</w:t>
+            </w:r>
+          </w:p>
+          <w:p>
+            <w:pPr>
+              <w:spacing w:after="60"/>
+            </w:pPr>
+            <w:r>
+              <w:rPr>
+                <w:sz w:val="21"/>
+              </w:rPr>
+              <w:t>Two lit dormers, a wreath by the walk, and warm white tracing every shingle line. Storybook houses like this one are why we love the small installs as much as the big ones. Real home, real install, straight off our crew lead's phone.</w:t>
+            </w:r>
+          </w:p>
+          <w:p>
+            <w:pPr>
+              <w:spacing w:after="40"/>
+            </w:pPr>
+            <w:r>
+              <w:rPr>
+                <w:color w:val="666666"/>
+                <w:sz w:val="18"/>
+              </w:rPr>
+              <w:t>#SpruceLights #RealInstall #AuthenticChristmas #CottageChristmas #DormerLights #HolidayLighting #ChristmasLightInstallation #StorybookStyle #RealHomes #CozySeason</w:t>
             </w:r>
           </w:p>
         </w:tc>
@@ -3079,7 +5356,26 @@
         <w:rPr>
           <w:sz w:val="21"/>
         </w:rPr>
-        <w:t>These are also your best performing ads. When you boost anything this season, boost these thirteen.</w:t>
+        <w:t>These are also your best performing ads. When you boost anything this season, boost these twenty-four.</w:t>
+      </w:r>
+    </w:p>
+    <w:p>
+      <w:pPr>
+        <w:spacing w:after="100"/>
+      </w:pPr>
+      <w:r>
+        <w:rPr>
+          <w:b/>
+          <w:color w:val="7AB02E"/>
+          <w:sz w:val="21"/>
+        </w:rPr>
+        <w:t xml:space="preserve">5.  </w:t>
+      </w:r>
+      <w:r>
+        <w:rPr>
+          <w:sz w:val="21"/>
+        </w:rPr>
+        <w:t>February slots are deliberate. By then every competitor has gone quiet, so these posts carry the booking message alone. Pair them with your early bird offer and answer comments fast.</w:t>
       </w:r>
     </w:p>
     <w:tbl>

</xml_diff>

<commit_message>
Authentic doc: card thumbnails matched to calendar size (1.5in uniform)
</commit_message>
<xml_diff>
--- a/downloads/SL_Authentic_Install_Series.docx
+++ b/downloads/SL_Authentic_Install_Series.docx
@@ -179,13 +179,13 @@
       <w:tr>
         <w:tc>
           <w:tcPr>
-            <w:tcW w:type="dxa" w:w="2952"/>
+            <w:tcW w:type="dxa" w:w="2376"/>
           </w:tcPr>
           <w:p>
             <w:r>
               <w:drawing>
                 <wp:inline xmlns:a="http://schemas.openxmlformats.org/drawingml/2006/main" xmlns:pic="http://schemas.openxmlformats.org/drawingml/2006/picture">
-                  <wp:extent cx="1691640" cy="1691640"/>
+                  <wp:extent cx="1371600" cy="1371600"/>
                   <wp:docPr id="1" name="Picture 1"/>
                   <wp:cNvGraphicFramePr>
                     <a:graphicFrameLocks noChangeAspect="1"/>
@@ -206,7 +206,7 @@
                         <pic:spPr>
                           <a:xfrm>
                             <a:off x="0" y="0"/>
-                            <a:ext cx="1691640" cy="1691640"/>
+                            <a:ext cx="1371600" cy="1371600"/>
                           </a:xfrm>
                           <a:prstGeom prst="rect"/>
                         </pic:spPr>
@@ -220,7 +220,7 @@
         </w:tc>
         <w:tc>
           <w:tcPr>
-            <w:tcW w:type="dxa" w:w="7272"/>
+            <w:tcW w:type="dxa" w:w="7848"/>
             <w:shd w:val="clear" w:fill="FAF7F0"/>
           </w:tcPr>
           <w:p>
@@ -289,13 +289,13 @@
       <w:tr>
         <w:tc>
           <w:tcPr>
-            <w:tcW w:type="dxa" w:w="2952"/>
+            <w:tcW w:type="dxa" w:w="2376"/>
           </w:tcPr>
           <w:p>
             <w:r>
               <w:drawing>
                 <wp:inline xmlns:a="http://schemas.openxmlformats.org/drawingml/2006/main" xmlns:pic="http://schemas.openxmlformats.org/drawingml/2006/picture">
-                  <wp:extent cx="1691640" cy="1691640"/>
+                  <wp:extent cx="1371600" cy="1371600"/>
                   <wp:docPr id="2" name="Picture 2"/>
                   <wp:cNvGraphicFramePr>
                     <a:graphicFrameLocks noChangeAspect="1"/>
@@ -316,7 +316,7 @@
                         <pic:spPr>
                           <a:xfrm>
                             <a:off x="0" y="0"/>
-                            <a:ext cx="1691640" cy="1691640"/>
+                            <a:ext cx="1371600" cy="1371600"/>
                           </a:xfrm>
                           <a:prstGeom prst="rect"/>
                         </pic:spPr>
@@ -330,7 +330,7 @@
         </w:tc>
         <w:tc>
           <w:tcPr>
-            <w:tcW w:type="dxa" w:w="7272"/>
+            <w:tcW w:type="dxa" w:w="7848"/>
             <w:shd w:val="clear" w:fill="FAF7F0"/>
           </w:tcPr>
           <w:p>
@@ -399,13 +399,13 @@
       <w:tr>
         <w:tc>
           <w:tcPr>
-            <w:tcW w:type="dxa" w:w="2952"/>
+            <w:tcW w:type="dxa" w:w="2376"/>
           </w:tcPr>
           <w:p>
             <w:r>
               <w:drawing>
                 <wp:inline xmlns:a="http://schemas.openxmlformats.org/drawingml/2006/main" xmlns:pic="http://schemas.openxmlformats.org/drawingml/2006/picture">
-                  <wp:extent cx="1691640" cy="1691640"/>
+                  <wp:extent cx="1371600" cy="1371600"/>
                   <wp:docPr id="3" name="Picture 3"/>
                   <wp:cNvGraphicFramePr>
                     <a:graphicFrameLocks noChangeAspect="1"/>
@@ -426,7 +426,7 @@
                         <pic:spPr>
                           <a:xfrm>
                             <a:off x="0" y="0"/>
-                            <a:ext cx="1691640" cy="1691640"/>
+                            <a:ext cx="1371600" cy="1371600"/>
                           </a:xfrm>
                           <a:prstGeom prst="rect"/>
                         </pic:spPr>
@@ -440,7 +440,7 @@
         </w:tc>
         <w:tc>
           <w:tcPr>
-            <w:tcW w:type="dxa" w:w="7272"/>
+            <w:tcW w:type="dxa" w:w="7848"/>
             <w:shd w:val="clear" w:fill="FAF7F0"/>
           </w:tcPr>
           <w:p>
@@ -509,13 +509,13 @@
       <w:tr>
         <w:tc>
           <w:tcPr>
-            <w:tcW w:type="dxa" w:w="2952"/>
+            <w:tcW w:type="dxa" w:w="2376"/>
           </w:tcPr>
           <w:p>
             <w:r>
               <w:drawing>
                 <wp:inline xmlns:a="http://schemas.openxmlformats.org/drawingml/2006/main" xmlns:pic="http://schemas.openxmlformats.org/drawingml/2006/picture">
-                  <wp:extent cx="1691640" cy="1691640"/>
+                  <wp:extent cx="1371600" cy="1371600"/>
                   <wp:docPr id="4" name="Picture 4"/>
                   <wp:cNvGraphicFramePr>
                     <a:graphicFrameLocks noChangeAspect="1"/>
@@ -536,7 +536,7 @@
                         <pic:spPr>
                           <a:xfrm>
                             <a:off x="0" y="0"/>
-                            <a:ext cx="1691640" cy="1691640"/>
+                            <a:ext cx="1371600" cy="1371600"/>
                           </a:xfrm>
                           <a:prstGeom prst="rect"/>
                         </pic:spPr>
@@ -550,7 +550,7 @@
         </w:tc>
         <w:tc>
           <w:tcPr>
-            <w:tcW w:type="dxa" w:w="7272"/>
+            <w:tcW w:type="dxa" w:w="7848"/>
             <w:shd w:val="clear" w:fill="FAF7F0"/>
           </w:tcPr>
           <w:p>
@@ -619,13 +619,13 @@
       <w:tr>
         <w:tc>
           <w:tcPr>
-            <w:tcW w:type="dxa" w:w="2952"/>
+            <w:tcW w:type="dxa" w:w="2376"/>
           </w:tcPr>
           <w:p>
             <w:r>
               <w:drawing>
                 <wp:inline xmlns:a="http://schemas.openxmlformats.org/drawingml/2006/main" xmlns:pic="http://schemas.openxmlformats.org/drawingml/2006/picture">
-                  <wp:extent cx="1691640" cy="1691640"/>
+                  <wp:extent cx="1371600" cy="1371600"/>
                   <wp:docPr id="5" name="Picture 5"/>
                   <wp:cNvGraphicFramePr>
                     <a:graphicFrameLocks noChangeAspect="1"/>
@@ -646,7 +646,7 @@
                         <pic:spPr>
                           <a:xfrm>
                             <a:off x="0" y="0"/>
-                            <a:ext cx="1691640" cy="1691640"/>
+                            <a:ext cx="1371600" cy="1371600"/>
                           </a:xfrm>
                           <a:prstGeom prst="rect"/>
                         </pic:spPr>
@@ -660,7 +660,7 @@
         </w:tc>
         <w:tc>
           <w:tcPr>
-            <w:tcW w:type="dxa" w:w="7272"/>
+            <w:tcW w:type="dxa" w:w="7848"/>
             <w:shd w:val="clear" w:fill="FAF7F0"/>
           </w:tcPr>
           <w:p>
@@ -729,13 +729,13 @@
       <w:tr>
         <w:tc>
           <w:tcPr>
-            <w:tcW w:type="dxa" w:w="2952"/>
+            <w:tcW w:type="dxa" w:w="2376"/>
           </w:tcPr>
           <w:p>
             <w:r>
               <w:drawing>
                 <wp:inline xmlns:a="http://schemas.openxmlformats.org/drawingml/2006/main" xmlns:pic="http://schemas.openxmlformats.org/drawingml/2006/picture">
-                  <wp:extent cx="1691640" cy="1691640"/>
+                  <wp:extent cx="1371600" cy="1371600"/>
                   <wp:docPr id="6" name="Picture 6"/>
                   <wp:cNvGraphicFramePr>
                     <a:graphicFrameLocks noChangeAspect="1"/>
@@ -756,7 +756,7 @@
                         <pic:spPr>
                           <a:xfrm>
                             <a:off x="0" y="0"/>
-                            <a:ext cx="1691640" cy="1691640"/>
+                            <a:ext cx="1371600" cy="1371600"/>
                           </a:xfrm>
                           <a:prstGeom prst="rect"/>
                         </pic:spPr>
@@ -770,7 +770,7 @@
         </w:tc>
         <w:tc>
           <w:tcPr>
-            <w:tcW w:type="dxa" w:w="7272"/>
+            <w:tcW w:type="dxa" w:w="7848"/>
             <w:shd w:val="clear" w:fill="FAF7F0"/>
           </w:tcPr>
           <w:p>
@@ -839,13 +839,13 @@
       <w:tr>
         <w:tc>
           <w:tcPr>
-            <w:tcW w:type="dxa" w:w="2952"/>
+            <w:tcW w:type="dxa" w:w="2376"/>
           </w:tcPr>
           <w:p>
             <w:r>
               <w:drawing>
                 <wp:inline xmlns:a="http://schemas.openxmlformats.org/drawingml/2006/main" xmlns:pic="http://schemas.openxmlformats.org/drawingml/2006/picture">
-                  <wp:extent cx="1691640" cy="1691640"/>
+                  <wp:extent cx="1371600" cy="1371600"/>
                   <wp:docPr id="7" name="Picture 7"/>
                   <wp:cNvGraphicFramePr>
                     <a:graphicFrameLocks noChangeAspect="1"/>
@@ -866,7 +866,7 @@
                         <pic:spPr>
                           <a:xfrm>
                             <a:off x="0" y="0"/>
-                            <a:ext cx="1691640" cy="1691640"/>
+                            <a:ext cx="1371600" cy="1371600"/>
                           </a:xfrm>
                           <a:prstGeom prst="rect"/>
                         </pic:spPr>
@@ -880,7 +880,7 @@
         </w:tc>
         <w:tc>
           <w:tcPr>
-            <w:tcW w:type="dxa" w:w="7272"/>
+            <w:tcW w:type="dxa" w:w="7848"/>
             <w:shd w:val="clear" w:fill="FAF7F0"/>
           </w:tcPr>
           <w:p>
@@ -949,13 +949,13 @@
       <w:tr>
         <w:tc>
           <w:tcPr>
-            <w:tcW w:type="dxa" w:w="2952"/>
+            <w:tcW w:type="dxa" w:w="2376"/>
           </w:tcPr>
           <w:p>
             <w:r>
               <w:drawing>
                 <wp:inline xmlns:a="http://schemas.openxmlformats.org/drawingml/2006/main" xmlns:pic="http://schemas.openxmlformats.org/drawingml/2006/picture">
-                  <wp:extent cx="1691640" cy="1691640"/>
+                  <wp:extent cx="1371600" cy="1371600"/>
                   <wp:docPr id="8" name="Picture 8"/>
                   <wp:cNvGraphicFramePr>
                     <a:graphicFrameLocks noChangeAspect="1"/>
@@ -976,7 +976,7 @@
                         <pic:spPr>
                           <a:xfrm>
                             <a:off x="0" y="0"/>
-                            <a:ext cx="1691640" cy="1691640"/>
+                            <a:ext cx="1371600" cy="1371600"/>
                           </a:xfrm>
                           <a:prstGeom prst="rect"/>
                         </pic:spPr>
@@ -990,7 +990,7 @@
         </w:tc>
         <w:tc>
           <w:tcPr>
-            <w:tcW w:type="dxa" w:w="7272"/>
+            <w:tcW w:type="dxa" w:w="7848"/>
             <w:shd w:val="clear" w:fill="FAF7F0"/>
           </w:tcPr>
           <w:p>
@@ -1059,13 +1059,13 @@
       <w:tr>
         <w:tc>
           <w:tcPr>
-            <w:tcW w:type="dxa" w:w="2952"/>
+            <w:tcW w:type="dxa" w:w="2376"/>
           </w:tcPr>
           <w:p>
             <w:r>
               <w:drawing>
                 <wp:inline xmlns:a="http://schemas.openxmlformats.org/drawingml/2006/main" xmlns:pic="http://schemas.openxmlformats.org/drawingml/2006/picture">
-                  <wp:extent cx="1691640" cy="1691640"/>
+                  <wp:extent cx="1371600" cy="1371600"/>
                   <wp:docPr id="9" name="Picture 9"/>
                   <wp:cNvGraphicFramePr>
                     <a:graphicFrameLocks noChangeAspect="1"/>
@@ -1086,7 +1086,7 @@
                         <pic:spPr>
                           <a:xfrm>
                             <a:off x="0" y="0"/>
-                            <a:ext cx="1691640" cy="1691640"/>
+                            <a:ext cx="1371600" cy="1371600"/>
                           </a:xfrm>
                           <a:prstGeom prst="rect"/>
                         </pic:spPr>
@@ -1100,7 +1100,7 @@
         </w:tc>
         <w:tc>
           <w:tcPr>
-            <w:tcW w:type="dxa" w:w="7272"/>
+            <w:tcW w:type="dxa" w:w="7848"/>
             <w:shd w:val="clear" w:fill="FAF7F0"/>
           </w:tcPr>
           <w:p>
@@ -1169,13 +1169,13 @@
       <w:tr>
         <w:tc>
           <w:tcPr>
-            <w:tcW w:type="dxa" w:w="2952"/>
+            <w:tcW w:type="dxa" w:w="2376"/>
           </w:tcPr>
           <w:p>
             <w:r>
               <w:drawing>
                 <wp:inline xmlns:a="http://schemas.openxmlformats.org/drawingml/2006/main" xmlns:pic="http://schemas.openxmlformats.org/drawingml/2006/picture">
-                  <wp:extent cx="1691640" cy="1691640"/>
+                  <wp:extent cx="1371600" cy="1371600"/>
                   <wp:docPr id="10" name="Picture 10"/>
                   <wp:cNvGraphicFramePr>
                     <a:graphicFrameLocks noChangeAspect="1"/>
@@ -1196,7 +1196,7 @@
                         <pic:spPr>
                           <a:xfrm>
                             <a:off x="0" y="0"/>
-                            <a:ext cx="1691640" cy="1691640"/>
+                            <a:ext cx="1371600" cy="1371600"/>
                           </a:xfrm>
                           <a:prstGeom prst="rect"/>
                         </pic:spPr>
@@ -1210,7 +1210,7 @@
         </w:tc>
         <w:tc>
           <w:tcPr>
-            <w:tcW w:type="dxa" w:w="7272"/>
+            <w:tcW w:type="dxa" w:w="7848"/>
             <w:shd w:val="clear" w:fill="FAF7F0"/>
           </w:tcPr>
           <w:p>
@@ -1279,13 +1279,13 @@
       <w:tr>
         <w:tc>
           <w:tcPr>
-            <w:tcW w:type="dxa" w:w="2952"/>
+            <w:tcW w:type="dxa" w:w="2376"/>
           </w:tcPr>
           <w:p>
             <w:r>
               <w:drawing>
                 <wp:inline xmlns:a="http://schemas.openxmlformats.org/drawingml/2006/main" xmlns:pic="http://schemas.openxmlformats.org/drawingml/2006/picture">
-                  <wp:extent cx="1691640" cy="1691640"/>
+                  <wp:extent cx="1371600" cy="1371600"/>
                   <wp:docPr id="11" name="Picture 11"/>
                   <wp:cNvGraphicFramePr>
                     <a:graphicFrameLocks noChangeAspect="1"/>
@@ -1306,7 +1306,7 @@
                         <pic:spPr>
                           <a:xfrm>
                             <a:off x="0" y="0"/>
-                            <a:ext cx="1691640" cy="1691640"/>
+                            <a:ext cx="1371600" cy="1371600"/>
                           </a:xfrm>
                           <a:prstGeom prst="rect"/>
                         </pic:spPr>
@@ -1320,7 +1320,7 @@
         </w:tc>
         <w:tc>
           <w:tcPr>
-            <w:tcW w:type="dxa" w:w="7272"/>
+            <w:tcW w:type="dxa" w:w="7848"/>
             <w:shd w:val="clear" w:fill="FAF7F0"/>
           </w:tcPr>
           <w:p>
@@ -1389,13 +1389,13 @@
       <w:tr>
         <w:tc>
           <w:tcPr>
-            <w:tcW w:type="dxa" w:w="2952"/>
+            <w:tcW w:type="dxa" w:w="2376"/>
           </w:tcPr>
           <w:p>
             <w:r>
               <w:drawing>
                 <wp:inline xmlns:a="http://schemas.openxmlformats.org/drawingml/2006/main" xmlns:pic="http://schemas.openxmlformats.org/drawingml/2006/picture">
-                  <wp:extent cx="1691640" cy="1691640"/>
+                  <wp:extent cx="1371600" cy="1371600"/>
                   <wp:docPr id="12" name="Picture 12"/>
                   <wp:cNvGraphicFramePr>
                     <a:graphicFrameLocks noChangeAspect="1"/>
@@ -1416,7 +1416,7 @@
                         <pic:spPr>
                           <a:xfrm>
                             <a:off x="0" y="0"/>
-                            <a:ext cx="1691640" cy="1691640"/>
+                            <a:ext cx="1371600" cy="1371600"/>
                           </a:xfrm>
                           <a:prstGeom prst="rect"/>
                         </pic:spPr>
@@ -1430,7 +1430,7 @@
         </w:tc>
         <w:tc>
           <w:tcPr>
-            <w:tcW w:type="dxa" w:w="7272"/>
+            <w:tcW w:type="dxa" w:w="7848"/>
             <w:shd w:val="clear" w:fill="FAF7F0"/>
           </w:tcPr>
           <w:p>
@@ -1499,13 +1499,13 @@
       <w:tr>
         <w:tc>
           <w:tcPr>
-            <w:tcW w:type="dxa" w:w="2952"/>
+            <w:tcW w:type="dxa" w:w="2376"/>
           </w:tcPr>
           <w:p>
             <w:r>
               <w:drawing>
                 <wp:inline xmlns:a="http://schemas.openxmlformats.org/drawingml/2006/main" xmlns:pic="http://schemas.openxmlformats.org/drawingml/2006/picture">
-                  <wp:extent cx="1691640" cy="1691640"/>
+                  <wp:extent cx="1371600" cy="1371600"/>
                   <wp:docPr id="13" name="Picture 13"/>
                   <wp:cNvGraphicFramePr>
                     <a:graphicFrameLocks noChangeAspect="1"/>
@@ -1526,7 +1526,7 @@
                         <pic:spPr>
                           <a:xfrm>
                             <a:off x="0" y="0"/>
-                            <a:ext cx="1691640" cy="1691640"/>
+                            <a:ext cx="1371600" cy="1371600"/>
                           </a:xfrm>
                           <a:prstGeom prst="rect"/>
                         </pic:spPr>
@@ -1540,7 +1540,7 @@
         </w:tc>
         <w:tc>
           <w:tcPr>
-            <w:tcW w:type="dxa" w:w="7272"/>
+            <w:tcW w:type="dxa" w:w="7848"/>
             <w:shd w:val="clear" w:fill="FAF7F0"/>
           </w:tcPr>
           <w:p>
@@ -1609,13 +1609,13 @@
       <w:tr>
         <w:tc>
           <w:tcPr>
-            <w:tcW w:type="dxa" w:w="2952"/>
+            <w:tcW w:type="dxa" w:w="2376"/>
           </w:tcPr>
           <w:p>
             <w:r>
               <w:drawing>
                 <wp:inline xmlns:a="http://schemas.openxmlformats.org/drawingml/2006/main" xmlns:pic="http://schemas.openxmlformats.org/drawingml/2006/picture">
-                  <wp:extent cx="1691640" cy="1691640"/>
+                  <wp:extent cx="1371600" cy="1371600"/>
                   <wp:docPr id="14" name="Picture 14"/>
                   <wp:cNvGraphicFramePr>
                     <a:graphicFrameLocks noChangeAspect="1"/>
@@ -1636,7 +1636,7 @@
                         <pic:spPr>
                           <a:xfrm>
                             <a:off x="0" y="0"/>
-                            <a:ext cx="1691640" cy="1691640"/>
+                            <a:ext cx="1371600" cy="1371600"/>
                           </a:xfrm>
                           <a:prstGeom prst="rect"/>
                         </pic:spPr>
@@ -1650,7 +1650,7 @@
         </w:tc>
         <w:tc>
           <w:tcPr>
-            <w:tcW w:type="dxa" w:w="7272"/>
+            <w:tcW w:type="dxa" w:w="7848"/>
             <w:shd w:val="clear" w:fill="FAF7F0"/>
           </w:tcPr>
           <w:p>
@@ -1719,13 +1719,13 @@
       <w:tr>
         <w:tc>
           <w:tcPr>
-            <w:tcW w:type="dxa" w:w="2952"/>
+            <w:tcW w:type="dxa" w:w="2376"/>
           </w:tcPr>
           <w:p>
             <w:r>
               <w:drawing>
                 <wp:inline xmlns:a="http://schemas.openxmlformats.org/drawingml/2006/main" xmlns:pic="http://schemas.openxmlformats.org/drawingml/2006/picture">
-                  <wp:extent cx="1691640" cy="1691640"/>
+                  <wp:extent cx="1371600" cy="1371600"/>
                   <wp:docPr id="15" name="Picture 15"/>
                   <wp:cNvGraphicFramePr>
                     <a:graphicFrameLocks noChangeAspect="1"/>
@@ -1746,7 +1746,7 @@
                         <pic:spPr>
                           <a:xfrm>
                             <a:off x="0" y="0"/>
-                            <a:ext cx="1691640" cy="1691640"/>
+                            <a:ext cx="1371600" cy="1371600"/>
                           </a:xfrm>
                           <a:prstGeom prst="rect"/>
                         </pic:spPr>
@@ -1760,7 +1760,7 @@
         </w:tc>
         <w:tc>
           <w:tcPr>
-            <w:tcW w:type="dxa" w:w="7272"/>
+            <w:tcW w:type="dxa" w:w="7848"/>
             <w:shd w:val="clear" w:fill="FAF7F0"/>
           </w:tcPr>
           <w:p>
@@ -1829,13 +1829,13 @@
       <w:tr>
         <w:tc>
           <w:tcPr>
-            <w:tcW w:type="dxa" w:w="2952"/>
+            <w:tcW w:type="dxa" w:w="2376"/>
           </w:tcPr>
           <w:p>
             <w:r>
               <w:drawing>
                 <wp:inline xmlns:a="http://schemas.openxmlformats.org/drawingml/2006/main" xmlns:pic="http://schemas.openxmlformats.org/drawingml/2006/picture">
-                  <wp:extent cx="1691640" cy="1691640"/>
+                  <wp:extent cx="1371600" cy="1371600"/>
                   <wp:docPr id="16" name="Picture 16"/>
                   <wp:cNvGraphicFramePr>
                     <a:graphicFrameLocks noChangeAspect="1"/>
@@ -1856,7 +1856,7 @@
                         <pic:spPr>
                           <a:xfrm>
                             <a:off x="0" y="0"/>
-                            <a:ext cx="1691640" cy="1691640"/>
+                            <a:ext cx="1371600" cy="1371600"/>
                           </a:xfrm>
                           <a:prstGeom prst="rect"/>
                         </pic:spPr>
@@ -1870,7 +1870,7 @@
         </w:tc>
         <w:tc>
           <w:tcPr>
-            <w:tcW w:type="dxa" w:w="7272"/>
+            <w:tcW w:type="dxa" w:w="7848"/>
             <w:shd w:val="clear" w:fill="FAF7F0"/>
           </w:tcPr>
           <w:p>
@@ -1939,13 +1939,13 @@
       <w:tr>
         <w:tc>
           <w:tcPr>
-            <w:tcW w:type="dxa" w:w="2952"/>
+            <w:tcW w:type="dxa" w:w="2376"/>
           </w:tcPr>
           <w:p>
             <w:r>
               <w:drawing>
                 <wp:inline xmlns:a="http://schemas.openxmlformats.org/drawingml/2006/main" xmlns:pic="http://schemas.openxmlformats.org/drawingml/2006/picture">
-                  <wp:extent cx="1691640" cy="1691640"/>
+                  <wp:extent cx="1371600" cy="1371600"/>
                   <wp:docPr id="17" name="Picture 17"/>
                   <wp:cNvGraphicFramePr>
                     <a:graphicFrameLocks noChangeAspect="1"/>
@@ -1966,7 +1966,7 @@
                         <pic:spPr>
                           <a:xfrm>
                             <a:off x="0" y="0"/>
-                            <a:ext cx="1691640" cy="1691640"/>
+                            <a:ext cx="1371600" cy="1371600"/>
                           </a:xfrm>
                           <a:prstGeom prst="rect"/>
                         </pic:spPr>
@@ -1980,7 +1980,7 @@
         </w:tc>
         <w:tc>
           <w:tcPr>
-            <w:tcW w:type="dxa" w:w="7272"/>
+            <w:tcW w:type="dxa" w:w="7848"/>
             <w:shd w:val="clear" w:fill="FAF7F0"/>
           </w:tcPr>
           <w:p>
@@ -2049,13 +2049,13 @@
       <w:tr>
         <w:tc>
           <w:tcPr>
-            <w:tcW w:type="dxa" w:w="2952"/>
+            <w:tcW w:type="dxa" w:w="2376"/>
           </w:tcPr>
           <w:p>
             <w:r>
               <w:drawing>
                 <wp:inline xmlns:a="http://schemas.openxmlformats.org/drawingml/2006/main" xmlns:pic="http://schemas.openxmlformats.org/drawingml/2006/picture">
-                  <wp:extent cx="1691640" cy="1691640"/>
+                  <wp:extent cx="1371600" cy="1371600"/>
                   <wp:docPr id="18" name="Picture 18"/>
                   <wp:cNvGraphicFramePr>
                     <a:graphicFrameLocks noChangeAspect="1"/>
@@ -2076,7 +2076,7 @@
                         <pic:spPr>
                           <a:xfrm>
                             <a:off x="0" y="0"/>
-                            <a:ext cx="1691640" cy="1691640"/>
+                            <a:ext cx="1371600" cy="1371600"/>
                           </a:xfrm>
                           <a:prstGeom prst="rect"/>
                         </pic:spPr>
@@ -2090,7 +2090,7 @@
         </w:tc>
         <w:tc>
           <w:tcPr>
-            <w:tcW w:type="dxa" w:w="7272"/>
+            <w:tcW w:type="dxa" w:w="7848"/>
             <w:shd w:val="clear" w:fill="FAF7F0"/>
           </w:tcPr>
           <w:p>
@@ -2159,13 +2159,13 @@
       <w:tr>
         <w:tc>
           <w:tcPr>
-            <w:tcW w:type="dxa" w:w="2952"/>
+            <w:tcW w:type="dxa" w:w="2376"/>
           </w:tcPr>
           <w:p>
             <w:r>
               <w:drawing>
                 <wp:inline xmlns:a="http://schemas.openxmlformats.org/drawingml/2006/main" xmlns:pic="http://schemas.openxmlformats.org/drawingml/2006/picture">
-                  <wp:extent cx="1691640" cy="1691640"/>
+                  <wp:extent cx="1371600" cy="1371600"/>
                   <wp:docPr id="19" name="Picture 19"/>
                   <wp:cNvGraphicFramePr>
                     <a:graphicFrameLocks noChangeAspect="1"/>
@@ -2186,7 +2186,7 @@
                         <pic:spPr>
                           <a:xfrm>
                             <a:off x="0" y="0"/>
-                            <a:ext cx="1691640" cy="1691640"/>
+                            <a:ext cx="1371600" cy="1371600"/>
                           </a:xfrm>
                           <a:prstGeom prst="rect"/>
                         </pic:spPr>
@@ -2200,7 +2200,7 @@
         </w:tc>
         <w:tc>
           <w:tcPr>
-            <w:tcW w:type="dxa" w:w="7272"/>
+            <w:tcW w:type="dxa" w:w="7848"/>
             <w:shd w:val="clear" w:fill="FAF7F0"/>
           </w:tcPr>
           <w:p>
@@ -2269,13 +2269,13 @@
       <w:tr>
         <w:tc>
           <w:tcPr>
-            <w:tcW w:type="dxa" w:w="2952"/>
+            <w:tcW w:type="dxa" w:w="2376"/>
           </w:tcPr>
           <w:p>
             <w:r>
               <w:drawing>
                 <wp:inline xmlns:a="http://schemas.openxmlformats.org/drawingml/2006/main" xmlns:pic="http://schemas.openxmlformats.org/drawingml/2006/picture">
-                  <wp:extent cx="1691640" cy="1691640"/>
+                  <wp:extent cx="1371600" cy="1371600"/>
                   <wp:docPr id="20" name="Picture 20"/>
                   <wp:cNvGraphicFramePr>
                     <a:graphicFrameLocks noChangeAspect="1"/>
@@ -2296,7 +2296,7 @@
                         <pic:spPr>
                           <a:xfrm>
                             <a:off x="0" y="0"/>
-                            <a:ext cx="1691640" cy="1691640"/>
+                            <a:ext cx="1371600" cy="1371600"/>
                           </a:xfrm>
                           <a:prstGeom prst="rect"/>
                         </pic:spPr>
@@ -2310,7 +2310,7 @@
         </w:tc>
         <w:tc>
           <w:tcPr>
-            <w:tcW w:type="dxa" w:w="7272"/>
+            <w:tcW w:type="dxa" w:w="7848"/>
             <w:shd w:val="clear" w:fill="FAF7F0"/>
           </w:tcPr>
           <w:p>
@@ -2379,13 +2379,13 @@
       <w:tr>
         <w:tc>
           <w:tcPr>
-            <w:tcW w:type="dxa" w:w="2952"/>
+            <w:tcW w:type="dxa" w:w="2376"/>
           </w:tcPr>
           <w:p>
             <w:r>
               <w:drawing>
                 <wp:inline xmlns:a="http://schemas.openxmlformats.org/drawingml/2006/main" xmlns:pic="http://schemas.openxmlformats.org/drawingml/2006/picture">
-                  <wp:extent cx="1691640" cy="1691640"/>
+                  <wp:extent cx="1371600" cy="1371600"/>
                   <wp:docPr id="21" name="Picture 21"/>
                   <wp:cNvGraphicFramePr>
                     <a:graphicFrameLocks noChangeAspect="1"/>
@@ -2406,7 +2406,7 @@
                         <pic:spPr>
                           <a:xfrm>
                             <a:off x="0" y="0"/>
-                            <a:ext cx="1691640" cy="1691640"/>
+                            <a:ext cx="1371600" cy="1371600"/>
                           </a:xfrm>
                           <a:prstGeom prst="rect"/>
                         </pic:spPr>
@@ -2420,7 +2420,7 @@
         </w:tc>
         <w:tc>
           <w:tcPr>
-            <w:tcW w:type="dxa" w:w="7272"/>
+            <w:tcW w:type="dxa" w:w="7848"/>
             <w:shd w:val="clear" w:fill="FAF7F0"/>
           </w:tcPr>
           <w:p>
@@ -2489,13 +2489,13 @@
       <w:tr>
         <w:tc>
           <w:tcPr>
-            <w:tcW w:type="dxa" w:w="2952"/>
+            <w:tcW w:type="dxa" w:w="2376"/>
           </w:tcPr>
           <w:p>
             <w:r>
               <w:drawing>
                 <wp:inline xmlns:a="http://schemas.openxmlformats.org/drawingml/2006/main" xmlns:pic="http://schemas.openxmlformats.org/drawingml/2006/picture">
-                  <wp:extent cx="1691640" cy="1691640"/>
+                  <wp:extent cx="1371600" cy="1371600"/>
                   <wp:docPr id="22" name="Picture 22"/>
                   <wp:cNvGraphicFramePr>
                     <a:graphicFrameLocks noChangeAspect="1"/>
@@ -2516,7 +2516,7 @@
                         <pic:spPr>
                           <a:xfrm>
                             <a:off x="0" y="0"/>
-                            <a:ext cx="1691640" cy="1691640"/>
+                            <a:ext cx="1371600" cy="1371600"/>
                           </a:xfrm>
                           <a:prstGeom prst="rect"/>
                         </pic:spPr>
@@ -2530,7 +2530,7 @@
         </w:tc>
         <w:tc>
           <w:tcPr>
-            <w:tcW w:type="dxa" w:w="7272"/>
+            <w:tcW w:type="dxa" w:w="7848"/>
             <w:shd w:val="clear" w:fill="FAF7F0"/>
           </w:tcPr>
           <w:p>
@@ -2599,13 +2599,13 @@
       <w:tr>
         <w:tc>
           <w:tcPr>
-            <w:tcW w:type="dxa" w:w="2952"/>
+            <w:tcW w:type="dxa" w:w="2376"/>
           </w:tcPr>
           <w:p>
             <w:r>
               <w:drawing>
                 <wp:inline xmlns:a="http://schemas.openxmlformats.org/drawingml/2006/main" xmlns:pic="http://schemas.openxmlformats.org/drawingml/2006/picture">
-                  <wp:extent cx="1691640" cy="1691640"/>
+                  <wp:extent cx="1371600" cy="1371600"/>
                   <wp:docPr id="23" name="Picture 23"/>
                   <wp:cNvGraphicFramePr>
                     <a:graphicFrameLocks noChangeAspect="1"/>
@@ -2626,7 +2626,7 @@
                         <pic:spPr>
                           <a:xfrm>
                             <a:off x="0" y="0"/>
-                            <a:ext cx="1691640" cy="1691640"/>
+                            <a:ext cx="1371600" cy="1371600"/>
                           </a:xfrm>
                           <a:prstGeom prst="rect"/>
                         </pic:spPr>
@@ -2640,7 +2640,7 @@
         </w:tc>
         <w:tc>
           <w:tcPr>
-            <w:tcW w:type="dxa" w:w="7272"/>
+            <w:tcW w:type="dxa" w:w="7848"/>
             <w:shd w:val="clear" w:fill="FAF7F0"/>
           </w:tcPr>
           <w:p>
@@ -2709,13 +2709,13 @@
       <w:tr>
         <w:tc>
           <w:tcPr>
-            <w:tcW w:type="dxa" w:w="2952"/>
+            <w:tcW w:type="dxa" w:w="2376"/>
           </w:tcPr>
           <w:p>
             <w:r>
               <w:drawing>
                 <wp:inline xmlns:a="http://schemas.openxmlformats.org/drawingml/2006/main" xmlns:pic="http://schemas.openxmlformats.org/drawingml/2006/picture">
-                  <wp:extent cx="1691640" cy="1691640"/>
+                  <wp:extent cx="1371600" cy="1371600"/>
                   <wp:docPr id="24" name="Picture 24"/>
                   <wp:cNvGraphicFramePr>
                     <a:graphicFrameLocks noChangeAspect="1"/>
@@ -2736,7 +2736,7 @@
                         <pic:spPr>
                           <a:xfrm>
                             <a:off x="0" y="0"/>
-                            <a:ext cx="1691640" cy="1691640"/>
+                            <a:ext cx="1371600" cy="1371600"/>
                           </a:xfrm>
                           <a:prstGeom prst="rect"/>
                         </pic:spPr>
@@ -2750,7 +2750,7 @@
         </w:tc>
         <w:tc>
           <w:tcPr>
-            <w:tcW w:type="dxa" w:w="7272"/>
+            <w:tcW w:type="dxa" w:w="7848"/>
             <w:shd w:val="clear" w:fill="FAF7F0"/>
           </w:tcPr>
           <w:p>

</xml_diff>

<commit_message>
Authentic doc: fix table column grids so card photos render at true 1.5in (matches calendar previews, fixes calendar overflow)
</commit_message>
<xml_diff>
--- a/downloads/SL_Authentic_Install_Series.docx
+++ b/downloads/SL_Authentic_Install_Series.docx
@@ -173,8 +173,8 @@
         <w:tblLook w:firstColumn="1" w:firstRow="1" w:lastColumn="0" w:lastRow="0" w:noHBand="0" w:noVBand="1" w:val="04A0"/>
       </w:tblPr>
       <w:tblGrid>
-        <w:gridCol w:w="5112"/>
-        <w:gridCol w:w="5112"/>
+        <w:gridCol w:w="2376"/>
+        <w:gridCol w:w="7848"/>
       </w:tblGrid>
       <w:tr>
         <w:tc>
@@ -283,8 +283,8 @@
         <w:tblLook w:firstColumn="1" w:firstRow="1" w:lastColumn="0" w:lastRow="0" w:noHBand="0" w:noVBand="1" w:val="04A0"/>
       </w:tblPr>
       <w:tblGrid>
-        <w:gridCol w:w="5112"/>
-        <w:gridCol w:w="5112"/>
+        <w:gridCol w:w="2376"/>
+        <w:gridCol w:w="7848"/>
       </w:tblGrid>
       <w:tr>
         <w:tc>
@@ -393,8 +393,8 @@
         <w:tblLook w:firstColumn="1" w:firstRow="1" w:lastColumn="0" w:lastRow="0" w:noHBand="0" w:noVBand="1" w:val="04A0"/>
       </w:tblPr>
       <w:tblGrid>
-        <w:gridCol w:w="5112"/>
-        <w:gridCol w:w="5112"/>
+        <w:gridCol w:w="2376"/>
+        <w:gridCol w:w="7848"/>
       </w:tblGrid>
       <w:tr>
         <w:tc>
@@ -503,8 +503,8 @@
         <w:tblLook w:firstColumn="1" w:firstRow="1" w:lastColumn="0" w:lastRow="0" w:noHBand="0" w:noVBand="1" w:val="04A0"/>
       </w:tblPr>
       <w:tblGrid>
-        <w:gridCol w:w="5112"/>
-        <w:gridCol w:w="5112"/>
+        <w:gridCol w:w="2376"/>
+        <w:gridCol w:w="7848"/>
       </w:tblGrid>
       <w:tr>
         <w:tc>
@@ -613,8 +613,8 @@
         <w:tblLook w:firstColumn="1" w:firstRow="1" w:lastColumn="0" w:lastRow="0" w:noHBand="0" w:noVBand="1" w:val="04A0"/>
       </w:tblPr>
       <w:tblGrid>
-        <w:gridCol w:w="5112"/>
-        <w:gridCol w:w="5112"/>
+        <w:gridCol w:w="2376"/>
+        <w:gridCol w:w="7848"/>
       </w:tblGrid>
       <w:tr>
         <w:tc>
@@ -723,8 +723,8 @@
         <w:tblLook w:firstColumn="1" w:firstRow="1" w:lastColumn="0" w:lastRow="0" w:noHBand="0" w:noVBand="1" w:val="04A0"/>
       </w:tblPr>
       <w:tblGrid>
-        <w:gridCol w:w="5112"/>
-        <w:gridCol w:w="5112"/>
+        <w:gridCol w:w="2376"/>
+        <w:gridCol w:w="7848"/>
       </w:tblGrid>
       <w:tr>
         <w:tc>
@@ -833,8 +833,8 @@
         <w:tblLook w:firstColumn="1" w:firstRow="1" w:lastColumn="0" w:lastRow="0" w:noHBand="0" w:noVBand="1" w:val="04A0"/>
       </w:tblPr>
       <w:tblGrid>
-        <w:gridCol w:w="5112"/>
-        <w:gridCol w:w="5112"/>
+        <w:gridCol w:w="2376"/>
+        <w:gridCol w:w="7848"/>
       </w:tblGrid>
       <w:tr>
         <w:tc>
@@ -943,8 +943,8 @@
         <w:tblLook w:firstColumn="1" w:firstRow="1" w:lastColumn="0" w:lastRow="0" w:noHBand="0" w:noVBand="1" w:val="04A0"/>
       </w:tblPr>
       <w:tblGrid>
-        <w:gridCol w:w="5112"/>
-        <w:gridCol w:w="5112"/>
+        <w:gridCol w:w="2376"/>
+        <w:gridCol w:w="7848"/>
       </w:tblGrid>
       <w:tr>
         <w:tc>
@@ -1053,8 +1053,8 @@
         <w:tblLook w:firstColumn="1" w:firstRow="1" w:lastColumn="0" w:lastRow="0" w:noHBand="0" w:noVBand="1" w:val="04A0"/>
       </w:tblPr>
       <w:tblGrid>
-        <w:gridCol w:w="5112"/>
-        <w:gridCol w:w="5112"/>
+        <w:gridCol w:w="2376"/>
+        <w:gridCol w:w="7848"/>
       </w:tblGrid>
       <w:tr>
         <w:tc>
@@ -1163,8 +1163,8 @@
         <w:tblLook w:firstColumn="1" w:firstRow="1" w:lastColumn="0" w:lastRow="0" w:noHBand="0" w:noVBand="1" w:val="04A0"/>
       </w:tblPr>
       <w:tblGrid>
-        <w:gridCol w:w="5112"/>
-        <w:gridCol w:w="5112"/>
+        <w:gridCol w:w="2376"/>
+        <w:gridCol w:w="7848"/>
       </w:tblGrid>
       <w:tr>
         <w:tc>
@@ -1273,8 +1273,8 @@
         <w:tblLook w:firstColumn="1" w:firstRow="1" w:lastColumn="0" w:lastRow="0" w:noHBand="0" w:noVBand="1" w:val="04A0"/>
       </w:tblPr>
       <w:tblGrid>
-        <w:gridCol w:w="5112"/>
-        <w:gridCol w:w="5112"/>
+        <w:gridCol w:w="2376"/>
+        <w:gridCol w:w="7848"/>
       </w:tblGrid>
       <w:tr>
         <w:tc>
@@ -1383,8 +1383,8 @@
         <w:tblLook w:firstColumn="1" w:firstRow="1" w:lastColumn="0" w:lastRow="0" w:noHBand="0" w:noVBand="1" w:val="04A0"/>
       </w:tblPr>
       <w:tblGrid>
-        <w:gridCol w:w="5112"/>
-        <w:gridCol w:w="5112"/>
+        <w:gridCol w:w="2376"/>
+        <w:gridCol w:w="7848"/>
       </w:tblGrid>
       <w:tr>
         <w:tc>
@@ -1493,8 +1493,8 @@
         <w:tblLook w:firstColumn="1" w:firstRow="1" w:lastColumn="0" w:lastRow="0" w:noHBand="0" w:noVBand="1" w:val="04A0"/>
       </w:tblPr>
       <w:tblGrid>
-        <w:gridCol w:w="5112"/>
-        <w:gridCol w:w="5112"/>
+        <w:gridCol w:w="2376"/>
+        <w:gridCol w:w="7848"/>
       </w:tblGrid>
       <w:tr>
         <w:tc>
@@ -1603,8 +1603,8 @@
         <w:tblLook w:firstColumn="1" w:firstRow="1" w:lastColumn="0" w:lastRow="0" w:noHBand="0" w:noVBand="1" w:val="04A0"/>
       </w:tblPr>
       <w:tblGrid>
-        <w:gridCol w:w="5112"/>
-        <w:gridCol w:w="5112"/>
+        <w:gridCol w:w="2376"/>
+        <w:gridCol w:w="7848"/>
       </w:tblGrid>
       <w:tr>
         <w:tc>
@@ -1713,8 +1713,8 @@
         <w:tblLook w:firstColumn="1" w:firstRow="1" w:lastColumn="0" w:lastRow="0" w:noHBand="0" w:noVBand="1" w:val="04A0"/>
       </w:tblPr>
       <w:tblGrid>
-        <w:gridCol w:w="5112"/>
-        <w:gridCol w:w="5112"/>
+        <w:gridCol w:w="2376"/>
+        <w:gridCol w:w="7848"/>
       </w:tblGrid>
       <w:tr>
         <w:tc>
@@ -1823,8 +1823,8 @@
         <w:tblLook w:firstColumn="1" w:firstRow="1" w:lastColumn="0" w:lastRow="0" w:noHBand="0" w:noVBand="1" w:val="04A0"/>
       </w:tblPr>
       <w:tblGrid>
-        <w:gridCol w:w="5112"/>
-        <w:gridCol w:w="5112"/>
+        <w:gridCol w:w="2376"/>
+        <w:gridCol w:w="7848"/>
       </w:tblGrid>
       <w:tr>
         <w:tc>
@@ -1933,8 +1933,8 @@
         <w:tblLook w:firstColumn="1" w:firstRow="1" w:lastColumn="0" w:lastRow="0" w:noHBand="0" w:noVBand="1" w:val="04A0"/>
       </w:tblPr>
       <w:tblGrid>
-        <w:gridCol w:w="5112"/>
-        <w:gridCol w:w="5112"/>
+        <w:gridCol w:w="2376"/>
+        <w:gridCol w:w="7848"/>
       </w:tblGrid>
       <w:tr>
         <w:tc>
@@ -2043,8 +2043,8 @@
         <w:tblLook w:firstColumn="1" w:firstRow="1" w:lastColumn="0" w:lastRow="0" w:noHBand="0" w:noVBand="1" w:val="04A0"/>
       </w:tblPr>
       <w:tblGrid>
-        <w:gridCol w:w="5112"/>
-        <w:gridCol w:w="5112"/>
+        <w:gridCol w:w="2376"/>
+        <w:gridCol w:w="7848"/>
       </w:tblGrid>
       <w:tr>
         <w:tc>
@@ -2153,8 +2153,8 @@
         <w:tblLook w:firstColumn="1" w:firstRow="1" w:lastColumn="0" w:lastRow="0" w:noHBand="0" w:noVBand="1" w:val="04A0"/>
       </w:tblPr>
       <w:tblGrid>
-        <w:gridCol w:w="5112"/>
-        <w:gridCol w:w="5112"/>
+        <w:gridCol w:w="2376"/>
+        <w:gridCol w:w="7848"/>
       </w:tblGrid>
       <w:tr>
         <w:tc>
@@ -2263,8 +2263,8 @@
         <w:tblLook w:firstColumn="1" w:firstRow="1" w:lastColumn="0" w:lastRow="0" w:noHBand="0" w:noVBand="1" w:val="04A0"/>
       </w:tblPr>
       <w:tblGrid>
-        <w:gridCol w:w="5112"/>
-        <w:gridCol w:w="5112"/>
+        <w:gridCol w:w="2376"/>
+        <w:gridCol w:w="7848"/>
       </w:tblGrid>
       <w:tr>
         <w:tc>
@@ -2373,8 +2373,8 @@
         <w:tblLook w:firstColumn="1" w:firstRow="1" w:lastColumn="0" w:lastRow="0" w:noHBand="0" w:noVBand="1" w:val="04A0"/>
       </w:tblPr>
       <w:tblGrid>
-        <w:gridCol w:w="5112"/>
-        <w:gridCol w:w="5112"/>
+        <w:gridCol w:w="2376"/>
+        <w:gridCol w:w="7848"/>
       </w:tblGrid>
       <w:tr>
         <w:tc>
@@ -2483,8 +2483,8 @@
         <w:tblLook w:firstColumn="1" w:firstRow="1" w:lastColumn="0" w:lastRow="0" w:noHBand="0" w:noVBand="1" w:val="04A0"/>
       </w:tblPr>
       <w:tblGrid>
-        <w:gridCol w:w="5112"/>
-        <w:gridCol w:w="5112"/>
+        <w:gridCol w:w="2376"/>
+        <w:gridCol w:w="7848"/>
       </w:tblGrid>
       <w:tr>
         <w:tc>
@@ -2593,8 +2593,8 @@
         <w:tblLook w:firstColumn="1" w:firstRow="1" w:lastColumn="0" w:lastRow="0" w:noHBand="0" w:noVBand="1" w:val="04A0"/>
       </w:tblPr>
       <w:tblGrid>
-        <w:gridCol w:w="5112"/>
-        <w:gridCol w:w="5112"/>
+        <w:gridCol w:w="2376"/>
+        <w:gridCol w:w="7848"/>
       </w:tblGrid>
       <w:tr>
         <w:tc>
@@ -2703,8 +2703,8 @@
         <w:tblLook w:firstColumn="1" w:firstRow="1" w:lastColumn="0" w:lastRow="0" w:noHBand="0" w:noVBand="1" w:val="04A0"/>
       </w:tblPr>
       <w:tblGrid>
-        <w:gridCol w:w="5112"/>
-        <w:gridCol w:w="5112"/>
+        <w:gridCol w:w="2376"/>
+        <w:gridCol w:w="7848"/>
       </w:tblGrid>
       <w:tr>
         <w:tc>
@@ -2844,10 +2844,10 @@
         <w:tblLook w:firstColumn="1" w:firstRow="1" w:lastColumn="0" w:lastRow="0" w:noHBand="0" w:noVBand="1" w:val="04A0"/>
       </w:tblPr>
       <w:tblGrid>
-        <w:gridCol w:w="2556"/>
-        <w:gridCol w:w="2556"/>
-        <w:gridCol w:w="2556"/>
-        <w:gridCol w:w="2556"/>
+        <w:gridCol w:w="2376"/>
+        <w:gridCol w:w="1512"/>
+        <w:gridCol w:w="1440"/>
+        <w:gridCol w:w="4896"/>
       </w:tblGrid>
       <w:tr>
         <w:tc>

</xml_diff>

<commit_message>
Authentic doc: all thumbnails enlarged to 2.2in (cards + calendar, matched)
</commit_message>
<xml_diff>
--- a/downloads/SL_Authentic_Install_Series.docx
+++ b/downloads/SL_Authentic_Install_Series.docx
@@ -173,19 +173,19 @@
         <w:tblLook w:firstColumn="1" w:firstRow="1" w:lastColumn="0" w:lastRow="0" w:noHBand="0" w:noVBand="1" w:val="04A0"/>
       </w:tblPr>
       <w:tblGrid>
-        <w:gridCol w:w="2376"/>
-        <w:gridCol w:w="7848"/>
+        <w:gridCol w:w="3384"/>
+        <w:gridCol w:w="6840"/>
       </w:tblGrid>
       <w:tr>
         <w:tc>
           <w:tcPr>
-            <w:tcW w:type="dxa" w:w="2376"/>
+            <w:tcW w:type="dxa" w:w="3384"/>
           </w:tcPr>
           <w:p>
             <w:r>
               <w:drawing>
                 <wp:inline xmlns:a="http://schemas.openxmlformats.org/drawingml/2006/main" xmlns:pic="http://schemas.openxmlformats.org/drawingml/2006/picture">
-                  <wp:extent cx="1371600" cy="1371600"/>
+                  <wp:extent cx="2011680" cy="2011680"/>
                   <wp:docPr id="1" name="Picture 1"/>
                   <wp:cNvGraphicFramePr>
                     <a:graphicFrameLocks noChangeAspect="1"/>
@@ -206,7 +206,7 @@
                         <pic:spPr>
                           <a:xfrm>
                             <a:off x="0" y="0"/>
-                            <a:ext cx="1371600" cy="1371600"/>
+                            <a:ext cx="2011680" cy="2011680"/>
                           </a:xfrm>
                           <a:prstGeom prst="rect"/>
                         </pic:spPr>
@@ -220,7 +220,7 @@
         </w:tc>
         <w:tc>
           <w:tcPr>
-            <w:tcW w:type="dxa" w:w="7848"/>
+            <w:tcW w:type="dxa" w:w="6840"/>
             <w:shd w:val="clear" w:fill="FAF7F0"/>
           </w:tcPr>
           <w:p>
@@ -283,19 +283,19 @@
         <w:tblLook w:firstColumn="1" w:firstRow="1" w:lastColumn="0" w:lastRow="0" w:noHBand="0" w:noVBand="1" w:val="04A0"/>
       </w:tblPr>
       <w:tblGrid>
-        <w:gridCol w:w="2376"/>
-        <w:gridCol w:w="7848"/>
+        <w:gridCol w:w="3384"/>
+        <w:gridCol w:w="6840"/>
       </w:tblGrid>
       <w:tr>
         <w:tc>
           <w:tcPr>
-            <w:tcW w:type="dxa" w:w="2376"/>
+            <w:tcW w:type="dxa" w:w="3384"/>
           </w:tcPr>
           <w:p>
             <w:r>
               <w:drawing>
                 <wp:inline xmlns:a="http://schemas.openxmlformats.org/drawingml/2006/main" xmlns:pic="http://schemas.openxmlformats.org/drawingml/2006/picture">
-                  <wp:extent cx="1371600" cy="1371600"/>
+                  <wp:extent cx="2011680" cy="2011680"/>
                   <wp:docPr id="2" name="Picture 2"/>
                   <wp:cNvGraphicFramePr>
                     <a:graphicFrameLocks noChangeAspect="1"/>
@@ -316,7 +316,7 @@
                         <pic:spPr>
                           <a:xfrm>
                             <a:off x="0" y="0"/>
-                            <a:ext cx="1371600" cy="1371600"/>
+                            <a:ext cx="2011680" cy="2011680"/>
                           </a:xfrm>
                           <a:prstGeom prst="rect"/>
                         </pic:spPr>
@@ -330,7 +330,7 @@
         </w:tc>
         <w:tc>
           <w:tcPr>
-            <w:tcW w:type="dxa" w:w="7848"/>
+            <w:tcW w:type="dxa" w:w="6840"/>
             <w:shd w:val="clear" w:fill="FAF7F0"/>
           </w:tcPr>
           <w:p>
@@ -393,19 +393,19 @@
         <w:tblLook w:firstColumn="1" w:firstRow="1" w:lastColumn="0" w:lastRow="0" w:noHBand="0" w:noVBand="1" w:val="04A0"/>
       </w:tblPr>
       <w:tblGrid>
-        <w:gridCol w:w="2376"/>
-        <w:gridCol w:w="7848"/>
+        <w:gridCol w:w="3384"/>
+        <w:gridCol w:w="6840"/>
       </w:tblGrid>
       <w:tr>
         <w:tc>
           <w:tcPr>
-            <w:tcW w:type="dxa" w:w="2376"/>
+            <w:tcW w:type="dxa" w:w="3384"/>
           </w:tcPr>
           <w:p>
             <w:r>
               <w:drawing>
                 <wp:inline xmlns:a="http://schemas.openxmlformats.org/drawingml/2006/main" xmlns:pic="http://schemas.openxmlformats.org/drawingml/2006/picture">
-                  <wp:extent cx="1371600" cy="1371600"/>
+                  <wp:extent cx="2011680" cy="2011680"/>
                   <wp:docPr id="3" name="Picture 3"/>
                   <wp:cNvGraphicFramePr>
                     <a:graphicFrameLocks noChangeAspect="1"/>
@@ -426,7 +426,7 @@
                         <pic:spPr>
                           <a:xfrm>
                             <a:off x="0" y="0"/>
-                            <a:ext cx="1371600" cy="1371600"/>
+                            <a:ext cx="2011680" cy="2011680"/>
                           </a:xfrm>
                           <a:prstGeom prst="rect"/>
                         </pic:spPr>
@@ -440,7 +440,7 @@
         </w:tc>
         <w:tc>
           <w:tcPr>
-            <w:tcW w:type="dxa" w:w="7848"/>
+            <w:tcW w:type="dxa" w:w="6840"/>
             <w:shd w:val="clear" w:fill="FAF7F0"/>
           </w:tcPr>
           <w:p>
@@ -503,19 +503,19 @@
         <w:tblLook w:firstColumn="1" w:firstRow="1" w:lastColumn="0" w:lastRow="0" w:noHBand="0" w:noVBand="1" w:val="04A0"/>
       </w:tblPr>
       <w:tblGrid>
-        <w:gridCol w:w="2376"/>
-        <w:gridCol w:w="7848"/>
+        <w:gridCol w:w="3384"/>
+        <w:gridCol w:w="6840"/>
       </w:tblGrid>
       <w:tr>
         <w:tc>
           <w:tcPr>
-            <w:tcW w:type="dxa" w:w="2376"/>
+            <w:tcW w:type="dxa" w:w="3384"/>
           </w:tcPr>
           <w:p>
             <w:r>
               <w:drawing>
                 <wp:inline xmlns:a="http://schemas.openxmlformats.org/drawingml/2006/main" xmlns:pic="http://schemas.openxmlformats.org/drawingml/2006/picture">
-                  <wp:extent cx="1371600" cy="1371600"/>
+                  <wp:extent cx="2011680" cy="2011680"/>
                   <wp:docPr id="4" name="Picture 4"/>
                   <wp:cNvGraphicFramePr>
                     <a:graphicFrameLocks noChangeAspect="1"/>
@@ -536,7 +536,7 @@
                         <pic:spPr>
                           <a:xfrm>
                             <a:off x="0" y="0"/>
-                            <a:ext cx="1371600" cy="1371600"/>
+                            <a:ext cx="2011680" cy="2011680"/>
                           </a:xfrm>
                           <a:prstGeom prst="rect"/>
                         </pic:spPr>
@@ -550,7 +550,7 @@
         </w:tc>
         <w:tc>
           <w:tcPr>
-            <w:tcW w:type="dxa" w:w="7848"/>
+            <w:tcW w:type="dxa" w:w="6840"/>
             <w:shd w:val="clear" w:fill="FAF7F0"/>
           </w:tcPr>
           <w:p>
@@ -613,19 +613,19 @@
         <w:tblLook w:firstColumn="1" w:firstRow="1" w:lastColumn="0" w:lastRow="0" w:noHBand="0" w:noVBand="1" w:val="04A0"/>
       </w:tblPr>
       <w:tblGrid>
-        <w:gridCol w:w="2376"/>
-        <w:gridCol w:w="7848"/>
+        <w:gridCol w:w="3384"/>
+        <w:gridCol w:w="6840"/>
       </w:tblGrid>
       <w:tr>
         <w:tc>
           <w:tcPr>
-            <w:tcW w:type="dxa" w:w="2376"/>
+            <w:tcW w:type="dxa" w:w="3384"/>
           </w:tcPr>
           <w:p>
             <w:r>
               <w:drawing>
                 <wp:inline xmlns:a="http://schemas.openxmlformats.org/drawingml/2006/main" xmlns:pic="http://schemas.openxmlformats.org/drawingml/2006/picture">
-                  <wp:extent cx="1371600" cy="1371600"/>
+                  <wp:extent cx="2011680" cy="2011680"/>
                   <wp:docPr id="5" name="Picture 5"/>
                   <wp:cNvGraphicFramePr>
                     <a:graphicFrameLocks noChangeAspect="1"/>
@@ -646,7 +646,7 @@
                         <pic:spPr>
                           <a:xfrm>
                             <a:off x="0" y="0"/>
-                            <a:ext cx="1371600" cy="1371600"/>
+                            <a:ext cx="2011680" cy="2011680"/>
                           </a:xfrm>
                           <a:prstGeom prst="rect"/>
                         </pic:spPr>
@@ -660,7 +660,7 @@
         </w:tc>
         <w:tc>
           <w:tcPr>
-            <w:tcW w:type="dxa" w:w="7848"/>
+            <w:tcW w:type="dxa" w:w="6840"/>
             <w:shd w:val="clear" w:fill="FAF7F0"/>
           </w:tcPr>
           <w:p>
@@ -723,19 +723,19 @@
         <w:tblLook w:firstColumn="1" w:firstRow="1" w:lastColumn="0" w:lastRow="0" w:noHBand="0" w:noVBand="1" w:val="04A0"/>
       </w:tblPr>
       <w:tblGrid>
-        <w:gridCol w:w="2376"/>
-        <w:gridCol w:w="7848"/>
+        <w:gridCol w:w="3384"/>
+        <w:gridCol w:w="6840"/>
       </w:tblGrid>
       <w:tr>
         <w:tc>
           <w:tcPr>
-            <w:tcW w:type="dxa" w:w="2376"/>
+            <w:tcW w:type="dxa" w:w="3384"/>
           </w:tcPr>
           <w:p>
             <w:r>
               <w:drawing>
                 <wp:inline xmlns:a="http://schemas.openxmlformats.org/drawingml/2006/main" xmlns:pic="http://schemas.openxmlformats.org/drawingml/2006/picture">
-                  <wp:extent cx="1371600" cy="1371600"/>
+                  <wp:extent cx="2011680" cy="2011680"/>
                   <wp:docPr id="6" name="Picture 6"/>
                   <wp:cNvGraphicFramePr>
                     <a:graphicFrameLocks noChangeAspect="1"/>
@@ -756,7 +756,7 @@
                         <pic:spPr>
                           <a:xfrm>
                             <a:off x="0" y="0"/>
-                            <a:ext cx="1371600" cy="1371600"/>
+                            <a:ext cx="2011680" cy="2011680"/>
                           </a:xfrm>
                           <a:prstGeom prst="rect"/>
                         </pic:spPr>
@@ -770,7 +770,7 @@
         </w:tc>
         <w:tc>
           <w:tcPr>
-            <w:tcW w:type="dxa" w:w="7848"/>
+            <w:tcW w:type="dxa" w:w="6840"/>
             <w:shd w:val="clear" w:fill="FAF7F0"/>
           </w:tcPr>
           <w:p>
@@ -833,19 +833,19 @@
         <w:tblLook w:firstColumn="1" w:firstRow="1" w:lastColumn="0" w:lastRow="0" w:noHBand="0" w:noVBand="1" w:val="04A0"/>
       </w:tblPr>
       <w:tblGrid>
-        <w:gridCol w:w="2376"/>
-        <w:gridCol w:w="7848"/>
+        <w:gridCol w:w="3384"/>
+        <w:gridCol w:w="6840"/>
       </w:tblGrid>
       <w:tr>
         <w:tc>
           <w:tcPr>
-            <w:tcW w:type="dxa" w:w="2376"/>
+            <w:tcW w:type="dxa" w:w="3384"/>
           </w:tcPr>
           <w:p>
             <w:r>
               <w:drawing>
                 <wp:inline xmlns:a="http://schemas.openxmlformats.org/drawingml/2006/main" xmlns:pic="http://schemas.openxmlformats.org/drawingml/2006/picture">
-                  <wp:extent cx="1371600" cy="1371600"/>
+                  <wp:extent cx="2011680" cy="2011680"/>
                   <wp:docPr id="7" name="Picture 7"/>
                   <wp:cNvGraphicFramePr>
                     <a:graphicFrameLocks noChangeAspect="1"/>
@@ -866,7 +866,7 @@
                         <pic:spPr>
                           <a:xfrm>
                             <a:off x="0" y="0"/>
-                            <a:ext cx="1371600" cy="1371600"/>
+                            <a:ext cx="2011680" cy="2011680"/>
                           </a:xfrm>
                           <a:prstGeom prst="rect"/>
                         </pic:spPr>
@@ -880,7 +880,7 @@
         </w:tc>
         <w:tc>
           <w:tcPr>
-            <w:tcW w:type="dxa" w:w="7848"/>
+            <w:tcW w:type="dxa" w:w="6840"/>
             <w:shd w:val="clear" w:fill="FAF7F0"/>
           </w:tcPr>
           <w:p>
@@ -943,19 +943,19 @@
         <w:tblLook w:firstColumn="1" w:firstRow="1" w:lastColumn="0" w:lastRow="0" w:noHBand="0" w:noVBand="1" w:val="04A0"/>
       </w:tblPr>
       <w:tblGrid>
-        <w:gridCol w:w="2376"/>
-        <w:gridCol w:w="7848"/>
+        <w:gridCol w:w="3384"/>
+        <w:gridCol w:w="6840"/>
       </w:tblGrid>
       <w:tr>
         <w:tc>
           <w:tcPr>
-            <w:tcW w:type="dxa" w:w="2376"/>
+            <w:tcW w:type="dxa" w:w="3384"/>
           </w:tcPr>
           <w:p>
             <w:r>
               <w:drawing>
                 <wp:inline xmlns:a="http://schemas.openxmlformats.org/drawingml/2006/main" xmlns:pic="http://schemas.openxmlformats.org/drawingml/2006/picture">
-                  <wp:extent cx="1371600" cy="1371600"/>
+                  <wp:extent cx="2011680" cy="2011680"/>
                   <wp:docPr id="8" name="Picture 8"/>
                   <wp:cNvGraphicFramePr>
                     <a:graphicFrameLocks noChangeAspect="1"/>
@@ -976,7 +976,7 @@
                         <pic:spPr>
                           <a:xfrm>
                             <a:off x="0" y="0"/>
-                            <a:ext cx="1371600" cy="1371600"/>
+                            <a:ext cx="2011680" cy="2011680"/>
                           </a:xfrm>
                           <a:prstGeom prst="rect"/>
                         </pic:spPr>
@@ -990,7 +990,7 @@
         </w:tc>
         <w:tc>
           <w:tcPr>
-            <w:tcW w:type="dxa" w:w="7848"/>
+            <w:tcW w:type="dxa" w:w="6840"/>
             <w:shd w:val="clear" w:fill="FAF7F0"/>
           </w:tcPr>
           <w:p>
@@ -1053,19 +1053,19 @@
         <w:tblLook w:firstColumn="1" w:firstRow="1" w:lastColumn="0" w:lastRow="0" w:noHBand="0" w:noVBand="1" w:val="04A0"/>
       </w:tblPr>
       <w:tblGrid>
-        <w:gridCol w:w="2376"/>
-        <w:gridCol w:w="7848"/>
+        <w:gridCol w:w="3384"/>
+        <w:gridCol w:w="6840"/>
       </w:tblGrid>
       <w:tr>
         <w:tc>
           <w:tcPr>
-            <w:tcW w:type="dxa" w:w="2376"/>
+            <w:tcW w:type="dxa" w:w="3384"/>
           </w:tcPr>
           <w:p>
             <w:r>
               <w:drawing>
                 <wp:inline xmlns:a="http://schemas.openxmlformats.org/drawingml/2006/main" xmlns:pic="http://schemas.openxmlformats.org/drawingml/2006/picture">
-                  <wp:extent cx="1371600" cy="1371600"/>
+                  <wp:extent cx="2011680" cy="2011680"/>
                   <wp:docPr id="9" name="Picture 9"/>
                   <wp:cNvGraphicFramePr>
                     <a:graphicFrameLocks noChangeAspect="1"/>
@@ -1086,7 +1086,7 @@
                         <pic:spPr>
                           <a:xfrm>
                             <a:off x="0" y="0"/>
-                            <a:ext cx="1371600" cy="1371600"/>
+                            <a:ext cx="2011680" cy="2011680"/>
                           </a:xfrm>
                           <a:prstGeom prst="rect"/>
                         </pic:spPr>
@@ -1100,7 +1100,7 @@
         </w:tc>
         <w:tc>
           <w:tcPr>
-            <w:tcW w:type="dxa" w:w="7848"/>
+            <w:tcW w:type="dxa" w:w="6840"/>
             <w:shd w:val="clear" w:fill="FAF7F0"/>
           </w:tcPr>
           <w:p>
@@ -1163,19 +1163,19 @@
         <w:tblLook w:firstColumn="1" w:firstRow="1" w:lastColumn="0" w:lastRow="0" w:noHBand="0" w:noVBand="1" w:val="04A0"/>
       </w:tblPr>
       <w:tblGrid>
-        <w:gridCol w:w="2376"/>
-        <w:gridCol w:w="7848"/>
+        <w:gridCol w:w="3384"/>
+        <w:gridCol w:w="6840"/>
       </w:tblGrid>
       <w:tr>
         <w:tc>
           <w:tcPr>
-            <w:tcW w:type="dxa" w:w="2376"/>
+            <w:tcW w:type="dxa" w:w="3384"/>
           </w:tcPr>
           <w:p>
             <w:r>
               <w:drawing>
                 <wp:inline xmlns:a="http://schemas.openxmlformats.org/drawingml/2006/main" xmlns:pic="http://schemas.openxmlformats.org/drawingml/2006/picture">
-                  <wp:extent cx="1371600" cy="1371600"/>
+                  <wp:extent cx="2011680" cy="2011680"/>
                   <wp:docPr id="10" name="Picture 10"/>
                   <wp:cNvGraphicFramePr>
                     <a:graphicFrameLocks noChangeAspect="1"/>
@@ -1196,7 +1196,7 @@
                         <pic:spPr>
                           <a:xfrm>
                             <a:off x="0" y="0"/>
-                            <a:ext cx="1371600" cy="1371600"/>
+                            <a:ext cx="2011680" cy="2011680"/>
                           </a:xfrm>
                           <a:prstGeom prst="rect"/>
                         </pic:spPr>
@@ -1210,7 +1210,7 @@
         </w:tc>
         <w:tc>
           <w:tcPr>
-            <w:tcW w:type="dxa" w:w="7848"/>
+            <w:tcW w:type="dxa" w:w="6840"/>
             <w:shd w:val="clear" w:fill="FAF7F0"/>
           </w:tcPr>
           <w:p>
@@ -1273,19 +1273,19 @@
         <w:tblLook w:firstColumn="1" w:firstRow="1" w:lastColumn="0" w:lastRow="0" w:noHBand="0" w:noVBand="1" w:val="04A0"/>
       </w:tblPr>
       <w:tblGrid>
-        <w:gridCol w:w="2376"/>
-        <w:gridCol w:w="7848"/>
+        <w:gridCol w:w="3384"/>
+        <w:gridCol w:w="6840"/>
       </w:tblGrid>
       <w:tr>
         <w:tc>
           <w:tcPr>
-            <w:tcW w:type="dxa" w:w="2376"/>
+            <w:tcW w:type="dxa" w:w="3384"/>
           </w:tcPr>
           <w:p>
             <w:r>
               <w:drawing>
                 <wp:inline xmlns:a="http://schemas.openxmlformats.org/drawingml/2006/main" xmlns:pic="http://schemas.openxmlformats.org/drawingml/2006/picture">
-                  <wp:extent cx="1371600" cy="1371600"/>
+                  <wp:extent cx="2011680" cy="2011680"/>
                   <wp:docPr id="11" name="Picture 11"/>
                   <wp:cNvGraphicFramePr>
                     <a:graphicFrameLocks noChangeAspect="1"/>
@@ -1306,7 +1306,7 @@
                         <pic:spPr>
                           <a:xfrm>
                             <a:off x="0" y="0"/>
-                            <a:ext cx="1371600" cy="1371600"/>
+                            <a:ext cx="2011680" cy="2011680"/>
                           </a:xfrm>
                           <a:prstGeom prst="rect"/>
                         </pic:spPr>
@@ -1320,7 +1320,7 @@
         </w:tc>
         <w:tc>
           <w:tcPr>
-            <w:tcW w:type="dxa" w:w="7848"/>
+            <w:tcW w:type="dxa" w:w="6840"/>
             <w:shd w:val="clear" w:fill="FAF7F0"/>
           </w:tcPr>
           <w:p>
@@ -1383,19 +1383,19 @@
         <w:tblLook w:firstColumn="1" w:firstRow="1" w:lastColumn="0" w:lastRow="0" w:noHBand="0" w:noVBand="1" w:val="04A0"/>
       </w:tblPr>
       <w:tblGrid>
-        <w:gridCol w:w="2376"/>
-        <w:gridCol w:w="7848"/>
+        <w:gridCol w:w="3384"/>
+        <w:gridCol w:w="6840"/>
       </w:tblGrid>
       <w:tr>
         <w:tc>
           <w:tcPr>
-            <w:tcW w:type="dxa" w:w="2376"/>
+            <w:tcW w:type="dxa" w:w="3384"/>
           </w:tcPr>
           <w:p>
             <w:r>
               <w:drawing>
                 <wp:inline xmlns:a="http://schemas.openxmlformats.org/drawingml/2006/main" xmlns:pic="http://schemas.openxmlformats.org/drawingml/2006/picture">
-                  <wp:extent cx="1371600" cy="1371600"/>
+                  <wp:extent cx="2011680" cy="2011680"/>
                   <wp:docPr id="12" name="Picture 12"/>
                   <wp:cNvGraphicFramePr>
                     <a:graphicFrameLocks noChangeAspect="1"/>
@@ -1416,7 +1416,7 @@
                         <pic:spPr>
                           <a:xfrm>
                             <a:off x="0" y="0"/>
-                            <a:ext cx="1371600" cy="1371600"/>
+                            <a:ext cx="2011680" cy="2011680"/>
                           </a:xfrm>
                           <a:prstGeom prst="rect"/>
                         </pic:spPr>
@@ -1430,7 +1430,7 @@
         </w:tc>
         <w:tc>
           <w:tcPr>
-            <w:tcW w:type="dxa" w:w="7848"/>
+            <w:tcW w:type="dxa" w:w="6840"/>
             <w:shd w:val="clear" w:fill="FAF7F0"/>
           </w:tcPr>
           <w:p>
@@ -1493,19 +1493,19 @@
         <w:tblLook w:firstColumn="1" w:firstRow="1" w:lastColumn="0" w:lastRow="0" w:noHBand="0" w:noVBand="1" w:val="04A0"/>
       </w:tblPr>
       <w:tblGrid>
-        <w:gridCol w:w="2376"/>
-        <w:gridCol w:w="7848"/>
+        <w:gridCol w:w="3384"/>
+        <w:gridCol w:w="6840"/>
       </w:tblGrid>
       <w:tr>
         <w:tc>
           <w:tcPr>
-            <w:tcW w:type="dxa" w:w="2376"/>
+            <w:tcW w:type="dxa" w:w="3384"/>
           </w:tcPr>
           <w:p>
             <w:r>
               <w:drawing>
                 <wp:inline xmlns:a="http://schemas.openxmlformats.org/drawingml/2006/main" xmlns:pic="http://schemas.openxmlformats.org/drawingml/2006/picture">
-                  <wp:extent cx="1371600" cy="1371600"/>
+                  <wp:extent cx="2011680" cy="2011680"/>
                   <wp:docPr id="13" name="Picture 13"/>
                   <wp:cNvGraphicFramePr>
                     <a:graphicFrameLocks noChangeAspect="1"/>
@@ -1526,7 +1526,7 @@
                         <pic:spPr>
                           <a:xfrm>
                             <a:off x="0" y="0"/>
-                            <a:ext cx="1371600" cy="1371600"/>
+                            <a:ext cx="2011680" cy="2011680"/>
                           </a:xfrm>
                           <a:prstGeom prst="rect"/>
                         </pic:spPr>
@@ -1540,7 +1540,7 @@
         </w:tc>
         <w:tc>
           <w:tcPr>
-            <w:tcW w:type="dxa" w:w="7848"/>
+            <w:tcW w:type="dxa" w:w="6840"/>
             <w:shd w:val="clear" w:fill="FAF7F0"/>
           </w:tcPr>
           <w:p>
@@ -1603,19 +1603,19 @@
         <w:tblLook w:firstColumn="1" w:firstRow="1" w:lastColumn="0" w:lastRow="0" w:noHBand="0" w:noVBand="1" w:val="04A0"/>
       </w:tblPr>
       <w:tblGrid>
-        <w:gridCol w:w="2376"/>
-        <w:gridCol w:w="7848"/>
+        <w:gridCol w:w="3384"/>
+        <w:gridCol w:w="6840"/>
       </w:tblGrid>
       <w:tr>
         <w:tc>
           <w:tcPr>
-            <w:tcW w:type="dxa" w:w="2376"/>
+            <w:tcW w:type="dxa" w:w="3384"/>
           </w:tcPr>
           <w:p>
             <w:r>
               <w:drawing>
                 <wp:inline xmlns:a="http://schemas.openxmlformats.org/drawingml/2006/main" xmlns:pic="http://schemas.openxmlformats.org/drawingml/2006/picture">
-                  <wp:extent cx="1371600" cy="1371600"/>
+                  <wp:extent cx="2011680" cy="2011680"/>
                   <wp:docPr id="14" name="Picture 14"/>
                   <wp:cNvGraphicFramePr>
                     <a:graphicFrameLocks noChangeAspect="1"/>
@@ -1636,7 +1636,7 @@
                         <pic:spPr>
                           <a:xfrm>
                             <a:off x="0" y="0"/>
-                            <a:ext cx="1371600" cy="1371600"/>
+                            <a:ext cx="2011680" cy="2011680"/>
                           </a:xfrm>
                           <a:prstGeom prst="rect"/>
                         </pic:spPr>
@@ -1650,7 +1650,7 @@
         </w:tc>
         <w:tc>
           <w:tcPr>
-            <w:tcW w:type="dxa" w:w="7848"/>
+            <w:tcW w:type="dxa" w:w="6840"/>
             <w:shd w:val="clear" w:fill="FAF7F0"/>
           </w:tcPr>
           <w:p>
@@ -1713,19 +1713,19 @@
         <w:tblLook w:firstColumn="1" w:firstRow="1" w:lastColumn="0" w:lastRow="0" w:noHBand="0" w:noVBand="1" w:val="04A0"/>
       </w:tblPr>
       <w:tblGrid>
-        <w:gridCol w:w="2376"/>
-        <w:gridCol w:w="7848"/>
+        <w:gridCol w:w="3384"/>
+        <w:gridCol w:w="6840"/>
       </w:tblGrid>
       <w:tr>
         <w:tc>
           <w:tcPr>
-            <w:tcW w:type="dxa" w:w="2376"/>
+            <w:tcW w:type="dxa" w:w="3384"/>
           </w:tcPr>
           <w:p>
             <w:r>
               <w:drawing>
                 <wp:inline xmlns:a="http://schemas.openxmlformats.org/drawingml/2006/main" xmlns:pic="http://schemas.openxmlformats.org/drawingml/2006/picture">
-                  <wp:extent cx="1371600" cy="1371600"/>
+                  <wp:extent cx="2011680" cy="2011680"/>
                   <wp:docPr id="15" name="Picture 15"/>
                   <wp:cNvGraphicFramePr>
                     <a:graphicFrameLocks noChangeAspect="1"/>
@@ -1746,7 +1746,7 @@
                         <pic:spPr>
                           <a:xfrm>
                             <a:off x="0" y="0"/>
-                            <a:ext cx="1371600" cy="1371600"/>
+                            <a:ext cx="2011680" cy="2011680"/>
                           </a:xfrm>
                           <a:prstGeom prst="rect"/>
                         </pic:spPr>
@@ -1760,7 +1760,7 @@
         </w:tc>
         <w:tc>
           <w:tcPr>
-            <w:tcW w:type="dxa" w:w="7848"/>
+            <w:tcW w:type="dxa" w:w="6840"/>
             <w:shd w:val="clear" w:fill="FAF7F0"/>
           </w:tcPr>
           <w:p>
@@ -1823,19 +1823,19 @@
         <w:tblLook w:firstColumn="1" w:firstRow="1" w:lastColumn="0" w:lastRow="0" w:noHBand="0" w:noVBand="1" w:val="04A0"/>
       </w:tblPr>
       <w:tblGrid>
-        <w:gridCol w:w="2376"/>
-        <w:gridCol w:w="7848"/>
+        <w:gridCol w:w="3384"/>
+        <w:gridCol w:w="6840"/>
       </w:tblGrid>
       <w:tr>
         <w:tc>
           <w:tcPr>
-            <w:tcW w:type="dxa" w:w="2376"/>
+            <w:tcW w:type="dxa" w:w="3384"/>
           </w:tcPr>
           <w:p>
             <w:r>
               <w:drawing>
                 <wp:inline xmlns:a="http://schemas.openxmlformats.org/drawingml/2006/main" xmlns:pic="http://schemas.openxmlformats.org/drawingml/2006/picture">
-                  <wp:extent cx="1371600" cy="1371600"/>
+                  <wp:extent cx="2011680" cy="2011680"/>
                   <wp:docPr id="16" name="Picture 16"/>
                   <wp:cNvGraphicFramePr>
                     <a:graphicFrameLocks noChangeAspect="1"/>
@@ -1856,7 +1856,7 @@
                         <pic:spPr>
                           <a:xfrm>
                             <a:off x="0" y="0"/>
-                            <a:ext cx="1371600" cy="1371600"/>
+                            <a:ext cx="2011680" cy="2011680"/>
                           </a:xfrm>
                           <a:prstGeom prst="rect"/>
                         </pic:spPr>
@@ -1870,7 +1870,7 @@
         </w:tc>
         <w:tc>
           <w:tcPr>
-            <w:tcW w:type="dxa" w:w="7848"/>
+            <w:tcW w:type="dxa" w:w="6840"/>
             <w:shd w:val="clear" w:fill="FAF7F0"/>
           </w:tcPr>
           <w:p>
@@ -1933,19 +1933,19 @@
         <w:tblLook w:firstColumn="1" w:firstRow="1" w:lastColumn="0" w:lastRow="0" w:noHBand="0" w:noVBand="1" w:val="04A0"/>
       </w:tblPr>
       <w:tblGrid>
-        <w:gridCol w:w="2376"/>
-        <w:gridCol w:w="7848"/>
+        <w:gridCol w:w="3384"/>
+        <w:gridCol w:w="6840"/>
       </w:tblGrid>
       <w:tr>
         <w:tc>
           <w:tcPr>
-            <w:tcW w:type="dxa" w:w="2376"/>
+            <w:tcW w:type="dxa" w:w="3384"/>
           </w:tcPr>
           <w:p>
             <w:r>
               <w:drawing>
                 <wp:inline xmlns:a="http://schemas.openxmlformats.org/drawingml/2006/main" xmlns:pic="http://schemas.openxmlformats.org/drawingml/2006/picture">
-                  <wp:extent cx="1371600" cy="1371600"/>
+                  <wp:extent cx="2011680" cy="2011680"/>
                   <wp:docPr id="17" name="Picture 17"/>
                   <wp:cNvGraphicFramePr>
                     <a:graphicFrameLocks noChangeAspect="1"/>
@@ -1966,7 +1966,7 @@
                         <pic:spPr>
                           <a:xfrm>
                             <a:off x="0" y="0"/>
-                            <a:ext cx="1371600" cy="1371600"/>
+                            <a:ext cx="2011680" cy="2011680"/>
                           </a:xfrm>
                           <a:prstGeom prst="rect"/>
                         </pic:spPr>
@@ -1980,7 +1980,7 @@
         </w:tc>
         <w:tc>
           <w:tcPr>
-            <w:tcW w:type="dxa" w:w="7848"/>
+            <w:tcW w:type="dxa" w:w="6840"/>
             <w:shd w:val="clear" w:fill="FAF7F0"/>
           </w:tcPr>
           <w:p>
@@ -2043,19 +2043,19 @@
         <w:tblLook w:firstColumn="1" w:firstRow="1" w:lastColumn="0" w:lastRow="0" w:noHBand="0" w:noVBand="1" w:val="04A0"/>
       </w:tblPr>
       <w:tblGrid>
-        <w:gridCol w:w="2376"/>
-        <w:gridCol w:w="7848"/>
+        <w:gridCol w:w="3384"/>
+        <w:gridCol w:w="6840"/>
       </w:tblGrid>
       <w:tr>
         <w:tc>
           <w:tcPr>
-            <w:tcW w:type="dxa" w:w="2376"/>
+            <w:tcW w:type="dxa" w:w="3384"/>
           </w:tcPr>
           <w:p>
             <w:r>
               <w:drawing>
                 <wp:inline xmlns:a="http://schemas.openxmlformats.org/drawingml/2006/main" xmlns:pic="http://schemas.openxmlformats.org/drawingml/2006/picture">
-                  <wp:extent cx="1371600" cy="1371600"/>
+                  <wp:extent cx="2011680" cy="2011680"/>
                   <wp:docPr id="18" name="Picture 18"/>
                   <wp:cNvGraphicFramePr>
                     <a:graphicFrameLocks noChangeAspect="1"/>
@@ -2076,7 +2076,7 @@
                         <pic:spPr>
                           <a:xfrm>
                             <a:off x="0" y="0"/>
-                            <a:ext cx="1371600" cy="1371600"/>
+                            <a:ext cx="2011680" cy="2011680"/>
                           </a:xfrm>
                           <a:prstGeom prst="rect"/>
                         </pic:spPr>
@@ -2090,7 +2090,7 @@
         </w:tc>
         <w:tc>
           <w:tcPr>
-            <w:tcW w:type="dxa" w:w="7848"/>
+            <w:tcW w:type="dxa" w:w="6840"/>
             <w:shd w:val="clear" w:fill="FAF7F0"/>
           </w:tcPr>
           <w:p>
@@ -2153,19 +2153,19 @@
         <w:tblLook w:firstColumn="1" w:firstRow="1" w:lastColumn="0" w:lastRow="0" w:noHBand="0" w:noVBand="1" w:val="04A0"/>
       </w:tblPr>
       <w:tblGrid>
-        <w:gridCol w:w="2376"/>
-        <w:gridCol w:w="7848"/>
+        <w:gridCol w:w="3384"/>
+        <w:gridCol w:w="6840"/>
       </w:tblGrid>
       <w:tr>
         <w:tc>
           <w:tcPr>
-            <w:tcW w:type="dxa" w:w="2376"/>
+            <w:tcW w:type="dxa" w:w="3384"/>
           </w:tcPr>
           <w:p>
             <w:r>
               <w:drawing>
                 <wp:inline xmlns:a="http://schemas.openxmlformats.org/drawingml/2006/main" xmlns:pic="http://schemas.openxmlformats.org/drawingml/2006/picture">
-                  <wp:extent cx="1371600" cy="1371600"/>
+                  <wp:extent cx="2011680" cy="2011680"/>
                   <wp:docPr id="19" name="Picture 19"/>
                   <wp:cNvGraphicFramePr>
                     <a:graphicFrameLocks noChangeAspect="1"/>
@@ -2186,7 +2186,7 @@
                         <pic:spPr>
                           <a:xfrm>
                             <a:off x="0" y="0"/>
-                            <a:ext cx="1371600" cy="1371600"/>
+                            <a:ext cx="2011680" cy="2011680"/>
                           </a:xfrm>
                           <a:prstGeom prst="rect"/>
                         </pic:spPr>
@@ -2200,7 +2200,7 @@
         </w:tc>
         <w:tc>
           <w:tcPr>
-            <w:tcW w:type="dxa" w:w="7848"/>
+            <w:tcW w:type="dxa" w:w="6840"/>
             <w:shd w:val="clear" w:fill="FAF7F0"/>
           </w:tcPr>
           <w:p>
@@ -2263,19 +2263,19 @@
         <w:tblLook w:firstColumn="1" w:firstRow="1" w:lastColumn="0" w:lastRow="0" w:noHBand="0" w:noVBand="1" w:val="04A0"/>
       </w:tblPr>
       <w:tblGrid>
-        <w:gridCol w:w="2376"/>
-        <w:gridCol w:w="7848"/>
+        <w:gridCol w:w="3384"/>
+        <w:gridCol w:w="6840"/>
       </w:tblGrid>
       <w:tr>
         <w:tc>
           <w:tcPr>
-            <w:tcW w:type="dxa" w:w="2376"/>
+            <w:tcW w:type="dxa" w:w="3384"/>
           </w:tcPr>
           <w:p>
             <w:r>
               <w:drawing>
                 <wp:inline xmlns:a="http://schemas.openxmlformats.org/drawingml/2006/main" xmlns:pic="http://schemas.openxmlformats.org/drawingml/2006/picture">
-                  <wp:extent cx="1371600" cy="1371600"/>
+                  <wp:extent cx="2011680" cy="2011680"/>
                   <wp:docPr id="20" name="Picture 20"/>
                   <wp:cNvGraphicFramePr>
                     <a:graphicFrameLocks noChangeAspect="1"/>
@@ -2296,7 +2296,7 @@
                         <pic:spPr>
                           <a:xfrm>
                             <a:off x="0" y="0"/>
-                            <a:ext cx="1371600" cy="1371600"/>
+                            <a:ext cx="2011680" cy="2011680"/>
                           </a:xfrm>
                           <a:prstGeom prst="rect"/>
                         </pic:spPr>
@@ -2310,7 +2310,7 @@
         </w:tc>
         <w:tc>
           <w:tcPr>
-            <w:tcW w:type="dxa" w:w="7848"/>
+            <w:tcW w:type="dxa" w:w="6840"/>
             <w:shd w:val="clear" w:fill="FAF7F0"/>
           </w:tcPr>
           <w:p>
@@ -2373,19 +2373,19 @@
         <w:tblLook w:firstColumn="1" w:firstRow="1" w:lastColumn="0" w:lastRow="0" w:noHBand="0" w:noVBand="1" w:val="04A0"/>
       </w:tblPr>
       <w:tblGrid>
-        <w:gridCol w:w="2376"/>
-        <w:gridCol w:w="7848"/>
+        <w:gridCol w:w="3384"/>
+        <w:gridCol w:w="6840"/>
       </w:tblGrid>
       <w:tr>
         <w:tc>
           <w:tcPr>
-            <w:tcW w:type="dxa" w:w="2376"/>
+            <w:tcW w:type="dxa" w:w="3384"/>
           </w:tcPr>
           <w:p>
             <w:r>
               <w:drawing>
                 <wp:inline xmlns:a="http://schemas.openxmlformats.org/drawingml/2006/main" xmlns:pic="http://schemas.openxmlformats.org/drawingml/2006/picture">
-                  <wp:extent cx="1371600" cy="1371600"/>
+                  <wp:extent cx="2011680" cy="2011680"/>
                   <wp:docPr id="21" name="Picture 21"/>
                   <wp:cNvGraphicFramePr>
                     <a:graphicFrameLocks noChangeAspect="1"/>
@@ -2406,7 +2406,7 @@
                         <pic:spPr>
                           <a:xfrm>
                             <a:off x="0" y="0"/>
-                            <a:ext cx="1371600" cy="1371600"/>
+                            <a:ext cx="2011680" cy="2011680"/>
                           </a:xfrm>
                           <a:prstGeom prst="rect"/>
                         </pic:spPr>
@@ -2420,7 +2420,7 @@
         </w:tc>
         <w:tc>
           <w:tcPr>
-            <w:tcW w:type="dxa" w:w="7848"/>
+            <w:tcW w:type="dxa" w:w="6840"/>
             <w:shd w:val="clear" w:fill="FAF7F0"/>
           </w:tcPr>
           <w:p>
@@ -2483,19 +2483,19 @@
         <w:tblLook w:firstColumn="1" w:firstRow="1" w:lastColumn="0" w:lastRow="0" w:noHBand="0" w:noVBand="1" w:val="04A0"/>
       </w:tblPr>
       <w:tblGrid>
-        <w:gridCol w:w="2376"/>
-        <w:gridCol w:w="7848"/>
+        <w:gridCol w:w="3384"/>
+        <w:gridCol w:w="6840"/>
       </w:tblGrid>
       <w:tr>
         <w:tc>
           <w:tcPr>
-            <w:tcW w:type="dxa" w:w="2376"/>
+            <w:tcW w:type="dxa" w:w="3384"/>
           </w:tcPr>
           <w:p>
             <w:r>
               <w:drawing>
                 <wp:inline xmlns:a="http://schemas.openxmlformats.org/drawingml/2006/main" xmlns:pic="http://schemas.openxmlformats.org/drawingml/2006/picture">
-                  <wp:extent cx="1371600" cy="1371600"/>
+                  <wp:extent cx="2011680" cy="2011680"/>
                   <wp:docPr id="22" name="Picture 22"/>
                   <wp:cNvGraphicFramePr>
                     <a:graphicFrameLocks noChangeAspect="1"/>
@@ -2516,7 +2516,7 @@
                         <pic:spPr>
                           <a:xfrm>
                             <a:off x="0" y="0"/>
-                            <a:ext cx="1371600" cy="1371600"/>
+                            <a:ext cx="2011680" cy="2011680"/>
                           </a:xfrm>
                           <a:prstGeom prst="rect"/>
                         </pic:spPr>
@@ -2530,7 +2530,7 @@
         </w:tc>
         <w:tc>
           <w:tcPr>
-            <w:tcW w:type="dxa" w:w="7848"/>
+            <w:tcW w:type="dxa" w:w="6840"/>
             <w:shd w:val="clear" w:fill="FAF7F0"/>
           </w:tcPr>
           <w:p>
@@ -2593,19 +2593,19 @@
         <w:tblLook w:firstColumn="1" w:firstRow="1" w:lastColumn="0" w:lastRow="0" w:noHBand="0" w:noVBand="1" w:val="04A0"/>
       </w:tblPr>
       <w:tblGrid>
-        <w:gridCol w:w="2376"/>
-        <w:gridCol w:w="7848"/>
+        <w:gridCol w:w="3384"/>
+        <w:gridCol w:w="6840"/>
       </w:tblGrid>
       <w:tr>
         <w:tc>
           <w:tcPr>
-            <w:tcW w:type="dxa" w:w="2376"/>
+            <w:tcW w:type="dxa" w:w="3384"/>
           </w:tcPr>
           <w:p>
             <w:r>
               <w:drawing>
                 <wp:inline xmlns:a="http://schemas.openxmlformats.org/drawingml/2006/main" xmlns:pic="http://schemas.openxmlformats.org/drawingml/2006/picture">
-                  <wp:extent cx="1371600" cy="1371600"/>
+                  <wp:extent cx="2011680" cy="2011680"/>
                   <wp:docPr id="23" name="Picture 23"/>
                   <wp:cNvGraphicFramePr>
                     <a:graphicFrameLocks noChangeAspect="1"/>
@@ -2626,7 +2626,7 @@
                         <pic:spPr>
                           <a:xfrm>
                             <a:off x="0" y="0"/>
-                            <a:ext cx="1371600" cy="1371600"/>
+                            <a:ext cx="2011680" cy="2011680"/>
                           </a:xfrm>
                           <a:prstGeom prst="rect"/>
                         </pic:spPr>
@@ -2640,7 +2640,7 @@
         </w:tc>
         <w:tc>
           <w:tcPr>
-            <w:tcW w:type="dxa" w:w="7848"/>
+            <w:tcW w:type="dxa" w:w="6840"/>
             <w:shd w:val="clear" w:fill="FAF7F0"/>
           </w:tcPr>
           <w:p>
@@ -2703,19 +2703,19 @@
         <w:tblLook w:firstColumn="1" w:firstRow="1" w:lastColumn="0" w:lastRow="0" w:noHBand="0" w:noVBand="1" w:val="04A0"/>
       </w:tblPr>
       <w:tblGrid>
-        <w:gridCol w:w="2376"/>
-        <w:gridCol w:w="7848"/>
+        <w:gridCol w:w="3384"/>
+        <w:gridCol w:w="6840"/>
       </w:tblGrid>
       <w:tr>
         <w:tc>
           <w:tcPr>
-            <w:tcW w:type="dxa" w:w="2376"/>
+            <w:tcW w:type="dxa" w:w="3384"/>
           </w:tcPr>
           <w:p>
             <w:r>
               <w:drawing>
                 <wp:inline xmlns:a="http://schemas.openxmlformats.org/drawingml/2006/main" xmlns:pic="http://schemas.openxmlformats.org/drawingml/2006/picture">
-                  <wp:extent cx="1371600" cy="1371600"/>
+                  <wp:extent cx="2011680" cy="2011680"/>
                   <wp:docPr id="24" name="Picture 24"/>
                   <wp:cNvGraphicFramePr>
                     <a:graphicFrameLocks noChangeAspect="1"/>
@@ -2736,7 +2736,7 @@
                         <pic:spPr>
                           <a:xfrm>
                             <a:off x="0" y="0"/>
-                            <a:ext cx="1371600" cy="1371600"/>
+                            <a:ext cx="2011680" cy="2011680"/>
                           </a:xfrm>
                           <a:prstGeom prst="rect"/>
                         </pic:spPr>
@@ -2750,7 +2750,7 @@
         </w:tc>
         <w:tc>
           <w:tcPr>
-            <w:tcW w:type="dxa" w:w="7848"/>
+            <w:tcW w:type="dxa" w:w="6840"/>
             <w:shd w:val="clear" w:fill="FAF7F0"/>
           </w:tcPr>
           <w:p>
@@ -2844,15 +2844,15 @@
         <w:tblLook w:firstColumn="1" w:firstRow="1" w:lastColumn="0" w:lastRow="0" w:noHBand="0" w:noVBand="1" w:val="04A0"/>
       </w:tblPr>
       <w:tblGrid>
-        <w:gridCol w:w="2376"/>
-        <w:gridCol w:w="1512"/>
+        <w:gridCol w:w="3384"/>
         <w:gridCol w:w="1440"/>
-        <w:gridCol w:w="4896"/>
+        <w:gridCol w:w="1368"/>
+        <w:gridCol w:w="4031"/>
       </w:tblGrid>
       <w:tr>
         <w:tc>
           <w:tcPr>
-            <w:tcW w:type="dxa" w:w="2376"/>
+            <w:tcW w:type="dxa" w:w="3384"/>
             <w:shd w:val="clear" w:fill="EFF5E8"/>
           </w:tcPr>
           <w:p>
@@ -2869,7 +2869,7 @@
         </w:tc>
         <w:tc>
           <w:tcPr>
-            <w:tcW w:type="dxa" w:w="1512"/>
+            <w:tcW w:type="dxa" w:w="1440"/>
             <w:shd w:val="clear" w:fill="EFF5E8"/>
           </w:tcPr>
           <w:p>
@@ -2886,7 +2886,7 @@
         </w:tc>
         <w:tc>
           <w:tcPr>
-            <w:tcW w:type="dxa" w:w="1440"/>
+            <w:tcW w:type="dxa" w:w="1368"/>
             <w:shd w:val="clear" w:fill="EFF5E8"/>
           </w:tcPr>
           <w:p>
@@ -2903,7 +2903,7 @@
         </w:tc>
         <w:tc>
           <w:tcPr>
-            <w:tcW w:type="dxa" w:w="4896"/>
+            <w:tcW w:type="dxa" w:w="4032"/>
             <w:shd w:val="clear" w:fill="EFF5E8"/>
           </w:tcPr>
           <w:p>
@@ -2922,13 +2922,13 @@
       <w:tr>
         <w:tc>
           <w:tcPr>
-            <w:tcW w:type="dxa" w:w="2376"/>
+            <w:tcW w:type="dxa" w:w="3384"/>
           </w:tcPr>
           <w:p>
             <w:r>
               <w:drawing>
                 <wp:inline xmlns:a="http://schemas.openxmlformats.org/drawingml/2006/main" xmlns:pic="http://schemas.openxmlformats.org/drawingml/2006/picture">
-                  <wp:extent cx="1371600" cy="1371600"/>
+                  <wp:extent cx="2011680" cy="2011680"/>
                   <wp:docPr id="25" name="Picture 25"/>
                   <wp:cNvGraphicFramePr>
                     <a:graphicFrameLocks noChangeAspect="1"/>
@@ -2949,7 +2949,7 @@
                         <pic:spPr>
                           <a:xfrm>
                             <a:off x="0" y="0"/>
-                            <a:ext cx="1371600" cy="1371600"/>
+                            <a:ext cx="2011680" cy="2011680"/>
                           </a:xfrm>
                           <a:prstGeom prst="rect"/>
                         </pic:spPr>
@@ -2963,7 +2963,7 @@
         </w:tc>
         <w:tc>
           <w:tcPr>
-            <w:tcW w:type="dxa" w:w="1512"/>
+            <w:tcW w:type="dxa" w:w="1440"/>
           </w:tcPr>
           <w:p>
             <w:r/>
@@ -2979,7 +2979,7 @@
         </w:tc>
         <w:tc>
           <w:tcPr>
-            <w:tcW w:type="dxa" w:w="1440"/>
+            <w:tcW w:type="dxa" w:w="1368"/>
           </w:tcPr>
           <w:p>
             <w:r/>
@@ -2995,7 +2995,7 @@
         </w:tc>
         <w:tc>
           <w:tcPr>
-            <w:tcW w:type="dxa" w:w="4896"/>
+            <w:tcW w:type="dxa" w:w="4032"/>
           </w:tcPr>
           <w:p>
             <w:r/>
@@ -3019,13 +3019,13 @@
       <w:tr>
         <w:tc>
           <w:tcPr>
-            <w:tcW w:type="dxa" w:w="2376"/>
+            <w:tcW w:type="dxa" w:w="3384"/>
           </w:tcPr>
           <w:p>
             <w:r>
               <w:drawing>
                 <wp:inline xmlns:a="http://schemas.openxmlformats.org/drawingml/2006/main" xmlns:pic="http://schemas.openxmlformats.org/drawingml/2006/picture">
-                  <wp:extent cx="1371600" cy="1371600"/>
+                  <wp:extent cx="2011680" cy="2011680"/>
                   <wp:docPr id="26" name="Picture 26"/>
                   <wp:cNvGraphicFramePr>
                     <a:graphicFrameLocks noChangeAspect="1"/>
@@ -3046,7 +3046,7 @@
                         <pic:spPr>
                           <a:xfrm>
                             <a:off x="0" y="0"/>
-                            <a:ext cx="1371600" cy="1371600"/>
+                            <a:ext cx="2011680" cy="2011680"/>
                           </a:xfrm>
                           <a:prstGeom prst="rect"/>
                         </pic:spPr>
@@ -3060,7 +3060,7 @@
         </w:tc>
         <w:tc>
           <w:tcPr>
-            <w:tcW w:type="dxa" w:w="1512"/>
+            <w:tcW w:type="dxa" w:w="1440"/>
           </w:tcPr>
           <w:p>
             <w:r/>
@@ -3076,7 +3076,7 @@
         </w:tc>
         <w:tc>
           <w:tcPr>
-            <w:tcW w:type="dxa" w:w="1440"/>
+            <w:tcW w:type="dxa" w:w="1368"/>
           </w:tcPr>
           <w:p>
             <w:r/>
@@ -3092,7 +3092,7 @@
         </w:tc>
         <w:tc>
           <w:tcPr>
-            <w:tcW w:type="dxa" w:w="4896"/>
+            <w:tcW w:type="dxa" w:w="4032"/>
           </w:tcPr>
           <w:p>
             <w:r/>
@@ -3116,13 +3116,13 @@
       <w:tr>
         <w:tc>
           <w:tcPr>
-            <w:tcW w:type="dxa" w:w="2376"/>
+            <w:tcW w:type="dxa" w:w="3384"/>
           </w:tcPr>
           <w:p>
             <w:r>
               <w:drawing>
                 <wp:inline xmlns:a="http://schemas.openxmlformats.org/drawingml/2006/main" xmlns:pic="http://schemas.openxmlformats.org/drawingml/2006/picture">
-                  <wp:extent cx="1371600" cy="1371600"/>
+                  <wp:extent cx="2011680" cy="2011680"/>
                   <wp:docPr id="27" name="Picture 27"/>
                   <wp:cNvGraphicFramePr>
                     <a:graphicFrameLocks noChangeAspect="1"/>
@@ -3143,7 +3143,7 @@
                         <pic:spPr>
                           <a:xfrm>
                             <a:off x="0" y="0"/>
-                            <a:ext cx="1371600" cy="1371600"/>
+                            <a:ext cx="2011680" cy="2011680"/>
                           </a:xfrm>
                           <a:prstGeom prst="rect"/>
                         </pic:spPr>
@@ -3157,7 +3157,7 @@
         </w:tc>
         <w:tc>
           <w:tcPr>
-            <w:tcW w:type="dxa" w:w="1512"/>
+            <w:tcW w:type="dxa" w:w="1440"/>
           </w:tcPr>
           <w:p>
             <w:r/>
@@ -3173,7 +3173,7 @@
         </w:tc>
         <w:tc>
           <w:tcPr>
-            <w:tcW w:type="dxa" w:w="1440"/>
+            <w:tcW w:type="dxa" w:w="1368"/>
             <w:shd w:val="clear" w:fill="FBF3DF"/>
           </w:tcPr>
           <w:p>
@@ -3190,7 +3190,7 @@
         </w:tc>
         <w:tc>
           <w:tcPr>
-            <w:tcW w:type="dxa" w:w="4896"/>
+            <w:tcW w:type="dxa" w:w="4032"/>
             <w:shd w:val="clear" w:fill="FBF3DF"/>
           </w:tcPr>
           <w:p>
@@ -3215,13 +3215,13 @@
       <w:tr>
         <w:tc>
           <w:tcPr>
-            <w:tcW w:type="dxa" w:w="2376"/>
+            <w:tcW w:type="dxa" w:w="3384"/>
           </w:tcPr>
           <w:p>
             <w:r>
               <w:drawing>
                 <wp:inline xmlns:a="http://schemas.openxmlformats.org/drawingml/2006/main" xmlns:pic="http://schemas.openxmlformats.org/drawingml/2006/picture">
-                  <wp:extent cx="1371600" cy="1371600"/>
+                  <wp:extent cx="2011680" cy="2011680"/>
                   <wp:docPr id="28" name="Picture 28"/>
                   <wp:cNvGraphicFramePr>
                     <a:graphicFrameLocks noChangeAspect="1"/>
@@ -3242,7 +3242,7 @@
                         <pic:spPr>
                           <a:xfrm>
                             <a:off x="0" y="0"/>
-                            <a:ext cx="1371600" cy="1371600"/>
+                            <a:ext cx="2011680" cy="2011680"/>
                           </a:xfrm>
                           <a:prstGeom prst="rect"/>
                         </pic:spPr>
@@ -3256,7 +3256,7 @@
         </w:tc>
         <w:tc>
           <w:tcPr>
-            <w:tcW w:type="dxa" w:w="1512"/>
+            <w:tcW w:type="dxa" w:w="1440"/>
           </w:tcPr>
           <w:p>
             <w:r/>
@@ -3272,7 +3272,7 @@
         </w:tc>
         <w:tc>
           <w:tcPr>
-            <w:tcW w:type="dxa" w:w="1440"/>
+            <w:tcW w:type="dxa" w:w="1368"/>
           </w:tcPr>
           <w:p>
             <w:r/>
@@ -3288,7 +3288,7 @@
         </w:tc>
         <w:tc>
           <w:tcPr>
-            <w:tcW w:type="dxa" w:w="4896"/>
+            <w:tcW w:type="dxa" w:w="4032"/>
           </w:tcPr>
           <w:p>
             <w:r/>
@@ -3312,13 +3312,13 @@
       <w:tr>
         <w:tc>
           <w:tcPr>
-            <w:tcW w:type="dxa" w:w="2376"/>
+            <w:tcW w:type="dxa" w:w="3384"/>
           </w:tcPr>
           <w:p>
             <w:r>
               <w:drawing>
                 <wp:inline xmlns:a="http://schemas.openxmlformats.org/drawingml/2006/main" xmlns:pic="http://schemas.openxmlformats.org/drawingml/2006/picture">
-                  <wp:extent cx="1371600" cy="1371600"/>
+                  <wp:extent cx="2011680" cy="2011680"/>
                   <wp:docPr id="29" name="Picture 29"/>
                   <wp:cNvGraphicFramePr>
                     <a:graphicFrameLocks noChangeAspect="1"/>
@@ -3339,7 +3339,7 @@
                         <pic:spPr>
                           <a:xfrm>
                             <a:off x="0" y="0"/>
-                            <a:ext cx="1371600" cy="1371600"/>
+                            <a:ext cx="2011680" cy="2011680"/>
                           </a:xfrm>
                           <a:prstGeom prst="rect"/>
                         </pic:spPr>
@@ -3353,7 +3353,7 @@
         </w:tc>
         <w:tc>
           <w:tcPr>
-            <w:tcW w:type="dxa" w:w="1512"/>
+            <w:tcW w:type="dxa" w:w="1440"/>
           </w:tcPr>
           <w:p>
             <w:r/>
@@ -3369,7 +3369,7 @@
         </w:tc>
         <w:tc>
           <w:tcPr>
-            <w:tcW w:type="dxa" w:w="1440"/>
+            <w:tcW w:type="dxa" w:w="1368"/>
             <w:shd w:val="clear" w:fill="FBF3DF"/>
           </w:tcPr>
           <w:p>
@@ -3386,7 +3386,7 @@
         </w:tc>
         <w:tc>
           <w:tcPr>
-            <w:tcW w:type="dxa" w:w="4896"/>
+            <w:tcW w:type="dxa" w:w="4032"/>
             <w:shd w:val="clear" w:fill="FBF3DF"/>
           </w:tcPr>
           <w:p>
@@ -3411,13 +3411,13 @@
       <w:tr>
         <w:tc>
           <w:tcPr>
-            <w:tcW w:type="dxa" w:w="2376"/>
+            <w:tcW w:type="dxa" w:w="3384"/>
           </w:tcPr>
           <w:p>
             <w:r>
               <w:drawing>
                 <wp:inline xmlns:a="http://schemas.openxmlformats.org/drawingml/2006/main" xmlns:pic="http://schemas.openxmlformats.org/drawingml/2006/picture">
-                  <wp:extent cx="1371600" cy="1371600"/>
+                  <wp:extent cx="2011680" cy="2011680"/>
                   <wp:docPr id="30" name="Picture 30"/>
                   <wp:cNvGraphicFramePr>
                     <a:graphicFrameLocks noChangeAspect="1"/>
@@ -3438,7 +3438,7 @@
                         <pic:spPr>
                           <a:xfrm>
                             <a:off x="0" y="0"/>
-                            <a:ext cx="1371600" cy="1371600"/>
+                            <a:ext cx="2011680" cy="2011680"/>
                           </a:xfrm>
                           <a:prstGeom prst="rect"/>
                         </pic:spPr>
@@ -3452,7 +3452,7 @@
         </w:tc>
         <w:tc>
           <w:tcPr>
-            <w:tcW w:type="dxa" w:w="1512"/>
+            <w:tcW w:type="dxa" w:w="1440"/>
           </w:tcPr>
           <w:p>
             <w:r/>
@@ -3468,7 +3468,7 @@
         </w:tc>
         <w:tc>
           <w:tcPr>
-            <w:tcW w:type="dxa" w:w="1440"/>
+            <w:tcW w:type="dxa" w:w="1368"/>
           </w:tcPr>
           <w:p>
             <w:r/>
@@ -3484,7 +3484,7 @@
         </w:tc>
         <w:tc>
           <w:tcPr>
-            <w:tcW w:type="dxa" w:w="4896"/>
+            <w:tcW w:type="dxa" w:w="4032"/>
           </w:tcPr>
           <w:p>
             <w:r/>
@@ -3508,13 +3508,13 @@
       <w:tr>
         <w:tc>
           <w:tcPr>
-            <w:tcW w:type="dxa" w:w="2376"/>
+            <w:tcW w:type="dxa" w:w="3384"/>
           </w:tcPr>
           <w:p>
             <w:r>
               <w:drawing>
                 <wp:inline xmlns:a="http://schemas.openxmlformats.org/drawingml/2006/main" xmlns:pic="http://schemas.openxmlformats.org/drawingml/2006/picture">
-                  <wp:extent cx="1371600" cy="1371600"/>
+                  <wp:extent cx="2011680" cy="2011680"/>
                   <wp:docPr id="31" name="Picture 31"/>
                   <wp:cNvGraphicFramePr>
                     <a:graphicFrameLocks noChangeAspect="1"/>
@@ -3535,7 +3535,7 @@
                         <pic:spPr>
                           <a:xfrm>
                             <a:off x="0" y="0"/>
-                            <a:ext cx="1371600" cy="1371600"/>
+                            <a:ext cx="2011680" cy="2011680"/>
                           </a:xfrm>
                           <a:prstGeom prst="rect"/>
                         </pic:spPr>
@@ -3549,7 +3549,7 @@
         </w:tc>
         <w:tc>
           <w:tcPr>
-            <w:tcW w:type="dxa" w:w="1512"/>
+            <w:tcW w:type="dxa" w:w="1440"/>
           </w:tcPr>
           <w:p>
             <w:r/>
@@ -3565,7 +3565,7 @@
         </w:tc>
         <w:tc>
           <w:tcPr>
-            <w:tcW w:type="dxa" w:w="1440"/>
+            <w:tcW w:type="dxa" w:w="1368"/>
           </w:tcPr>
           <w:p>
             <w:r/>
@@ -3581,7 +3581,7 @@
         </w:tc>
         <w:tc>
           <w:tcPr>
-            <w:tcW w:type="dxa" w:w="4896"/>
+            <w:tcW w:type="dxa" w:w="4032"/>
           </w:tcPr>
           <w:p>
             <w:r/>
@@ -3605,13 +3605,13 @@
       <w:tr>
         <w:tc>
           <w:tcPr>
-            <w:tcW w:type="dxa" w:w="2376"/>
+            <w:tcW w:type="dxa" w:w="3384"/>
           </w:tcPr>
           <w:p>
             <w:r>
               <w:drawing>
                 <wp:inline xmlns:a="http://schemas.openxmlformats.org/drawingml/2006/main" xmlns:pic="http://schemas.openxmlformats.org/drawingml/2006/picture">
-                  <wp:extent cx="1371600" cy="1371600"/>
+                  <wp:extent cx="2011680" cy="2011680"/>
                   <wp:docPr id="32" name="Picture 32"/>
                   <wp:cNvGraphicFramePr>
                     <a:graphicFrameLocks noChangeAspect="1"/>
@@ -3632,7 +3632,7 @@
                         <pic:spPr>
                           <a:xfrm>
                             <a:off x="0" y="0"/>
-                            <a:ext cx="1371600" cy="1371600"/>
+                            <a:ext cx="2011680" cy="2011680"/>
                           </a:xfrm>
                           <a:prstGeom prst="rect"/>
                         </pic:spPr>
@@ -3646,7 +3646,7 @@
         </w:tc>
         <w:tc>
           <w:tcPr>
-            <w:tcW w:type="dxa" w:w="1512"/>
+            <w:tcW w:type="dxa" w:w="1440"/>
           </w:tcPr>
           <w:p>
             <w:r/>
@@ -3662,7 +3662,7 @@
         </w:tc>
         <w:tc>
           <w:tcPr>
-            <w:tcW w:type="dxa" w:w="1440"/>
+            <w:tcW w:type="dxa" w:w="1368"/>
           </w:tcPr>
           <w:p>
             <w:r/>
@@ -3678,7 +3678,7 @@
         </w:tc>
         <w:tc>
           <w:tcPr>
-            <w:tcW w:type="dxa" w:w="4896"/>
+            <w:tcW w:type="dxa" w:w="4032"/>
           </w:tcPr>
           <w:p>
             <w:r/>
@@ -3702,13 +3702,13 @@
       <w:tr>
         <w:tc>
           <w:tcPr>
-            <w:tcW w:type="dxa" w:w="2376"/>
+            <w:tcW w:type="dxa" w:w="3384"/>
           </w:tcPr>
           <w:p>
             <w:r>
               <w:drawing>
                 <wp:inline xmlns:a="http://schemas.openxmlformats.org/drawingml/2006/main" xmlns:pic="http://schemas.openxmlformats.org/drawingml/2006/picture">
-                  <wp:extent cx="1371600" cy="1371600"/>
+                  <wp:extent cx="2011680" cy="2011680"/>
                   <wp:docPr id="33" name="Picture 33"/>
                   <wp:cNvGraphicFramePr>
                     <a:graphicFrameLocks noChangeAspect="1"/>
@@ -3729,7 +3729,7 @@
                         <pic:spPr>
                           <a:xfrm>
                             <a:off x="0" y="0"/>
-                            <a:ext cx="1371600" cy="1371600"/>
+                            <a:ext cx="2011680" cy="2011680"/>
                           </a:xfrm>
                           <a:prstGeom prst="rect"/>
                         </pic:spPr>
@@ -3743,7 +3743,7 @@
         </w:tc>
         <w:tc>
           <w:tcPr>
-            <w:tcW w:type="dxa" w:w="1512"/>
+            <w:tcW w:type="dxa" w:w="1440"/>
           </w:tcPr>
           <w:p>
             <w:r/>
@@ -3759,7 +3759,7 @@
         </w:tc>
         <w:tc>
           <w:tcPr>
-            <w:tcW w:type="dxa" w:w="1440"/>
+            <w:tcW w:type="dxa" w:w="1368"/>
           </w:tcPr>
           <w:p>
             <w:r/>
@@ -3775,7 +3775,7 @@
         </w:tc>
         <w:tc>
           <w:tcPr>
-            <w:tcW w:type="dxa" w:w="4896"/>
+            <w:tcW w:type="dxa" w:w="4032"/>
           </w:tcPr>
           <w:p>
             <w:r/>
@@ -3799,13 +3799,13 @@
       <w:tr>
         <w:tc>
           <w:tcPr>
-            <w:tcW w:type="dxa" w:w="2376"/>
+            <w:tcW w:type="dxa" w:w="3384"/>
           </w:tcPr>
           <w:p>
             <w:r>
               <w:drawing>
                 <wp:inline xmlns:a="http://schemas.openxmlformats.org/drawingml/2006/main" xmlns:pic="http://schemas.openxmlformats.org/drawingml/2006/picture">
-                  <wp:extent cx="1371600" cy="1371600"/>
+                  <wp:extent cx="2011680" cy="2011680"/>
                   <wp:docPr id="34" name="Picture 34"/>
                   <wp:cNvGraphicFramePr>
                     <a:graphicFrameLocks noChangeAspect="1"/>
@@ -3826,7 +3826,7 @@
                         <pic:spPr>
                           <a:xfrm>
                             <a:off x="0" y="0"/>
-                            <a:ext cx="1371600" cy="1371600"/>
+                            <a:ext cx="2011680" cy="2011680"/>
                           </a:xfrm>
                           <a:prstGeom prst="rect"/>
                         </pic:spPr>
@@ -3840,7 +3840,7 @@
         </w:tc>
         <w:tc>
           <w:tcPr>
-            <w:tcW w:type="dxa" w:w="1512"/>
+            <w:tcW w:type="dxa" w:w="1440"/>
           </w:tcPr>
           <w:p>
             <w:r/>
@@ -3856,7 +3856,7 @@
         </w:tc>
         <w:tc>
           <w:tcPr>
-            <w:tcW w:type="dxa" w:w="1440"/>
+            <w:tcW w:type="dxa" w:w="1368"/>
           </w:tcPr>
           <w:p>
             <w:r/>
@@ -3872,7 +3872,7 @@
         </w:tc>
         <w:tc>
           <w:tcPr>
-            <w:tcW w:type="dxa" w:w="4896"/>
+            <w:tcW w:type="dxa" w:w="4032"/>
           </w:tcPr>
           <w:p>
             <w:r/>
@@ -3896,13 +3896,13 @@
       <w:tr>
         <w:tc>
           <w:tcPr>
-            <w:tcW w:type="dxa" w:w="2376"/>
+            <w:tcW w:type="dxa" w:w="3384"/>
           </w:tcPr>
           <w:p>
             <w:r>
               <w:drawing>
                 <wp:inline xmlns:a="http://schemas.openxmlformats.org/drawingml/2006/main" xmlns:pic="http://schemas.openxmlformats.org/drawingml/2006/picture">
-                  <wp:extent cx="1371600" cy="1371600"/>
+                  <wp:extent cx="2011680" cy="2011680"/>
                   <wp:docPr id="35" name="Picture 35"/>
                   <wp:cNvGraphicFramePr>
                     <a:graphicFrameLocks noChangeAspect="1"/>
@@ -3923,7 +3923,7 @@
                         <pic:spPr>
                           <a:xfrm>
                             <a:off x="0" y="0"/>
-                            <a:ext cx="1371600" cy="1371600"/>
+                            <a:ext cx="2011680" cy="2011680"/>
                           </a:xfrm>
                           <a:prstGeom prst="rect"/>
                         </pic:spPr>
@@ -3937,7 +3937,7 @@
         </w:tc>
         <w:tc>
           <w:tcPr>
-            <w:tcW w:type="dxa" w:w="1512"/>
+            <w:tcW w:type="dxa" w:w="1440"/>
           </w:tcPr>
           <w:p>
             <w:r/>
@@ -3953,7 +3953,7 @@
         </w:tc>
         <w:tc>
           <w:tcPr>
-            <w:tcW w:type="dxa" w:w="1440"/>
+            <w:tcW w:type="dxa" w:w="1368"/>
           </w:tcPr>
           <w:p>
             <w:r/>
@@ -3969,7 +3969,7 @@
         </w:tc>
         <w:tc>
           <w:tcPr>
-            <w:tcW w:type="dxa" w:w="4896"/>
+            <w:tcW w:type="dxa" w:w="4032"/>
           </w:tcPr>
           <w:p>
             <w:r/>
@@ -3993,13 +3993,13 @@
       <w:tr>
         <w:tc>
           <w:tcPr>
-            <w:tcW w:type="dxa" w:w="2376"/>
+            <w:tcW w:type="dxa" w:w="3384"/>
           </w:tcPr>
           <w:p>
             <w:r>
               <w:drawing>
                 <wp:inline xmlns:a="http://schemas.openxmlformats.org/drawingml/2006/main" xmlns:pic="http://schemas.openxmlformats.org/drawingml/2006/picture">
-                  <wp:extent cx="1371600" cy="1371600"/>
+                  <wp:extent cx="2011680" cy="2011680"/>
                   <wp:docPr id="36" name="Picture 36"/>
                   <wp:cNvGraphicFramePr>
                     <a:graphicFrameLocks noChangeAspect="1"/>
@@ -4020,7 +4020,7 @@
                         <pic:spPr>
                           <a:xfrm>
                             <a:off x="0" y="0"/>
-                            <a:ext cx="1371600" cy="1371600"/>
+                            <a:ext cx="2011680" cy="2011680"/>
                           </a:xfrm>
                           <a:prstGeom prst="rect"/>
                         </pic:spPr>
@@ -4034,7 +4034,7 @@
         </w:tc>
         <w:tc>
           <w:tcPr>
-            <w:tcW w:type="dxa" w:w="1512"/>
+            <w:tcW w:type="dxa" w:w="1440"/>
           </w:tcPr>
           <w:p>
             <w:r/>
@@ -4050,7 +4050,7 @@
         </w:tc>
         <w:tc>
           <w:tcPr>
-            <w:tcW w:type="dxa" w:w="1440"/>
+            <w:tcW w:type="dxa" w:w="1368"/>
           </w:tcPr>
           <w:p>
             <w:r/>
@@ -4066,7 +4066,7 @@
         </w:tc>
         <w:tc>
           <w:tcPr>
-            <w:tcW w:type="dxa" w:w="4896"/>
+            <w:tcW w:type="dxa" w:w="4032"/>
           </w:tcPr>
           <w:p>
             <w:r/>
@@ -4090,13 +4090,13 @@
       <w:tr>
         <w:tc>
           <w:tcPr>
-            <w:tcW w:type="dxa" w:w="2376"/>
+            <w:tcW w:type="dxa" w:w="3384"/>
           </w:tcPr>
           <w:p>
             <w:r>
               <w:drawing>
                 <wp:inline xmlns:a="http://schemas.openxmlformats.org/drawingml/2006/main" xmlns:pic="http://schemas.openxmlformats.org/drawingml/2006/picture">
-                  <wp:extent cx="1371600" cy="1371600"/>
+                  <wp:extent cx="2011680" cy="2011680"/>
                   <wp:docPr id="37" name="Picture 37"/>
                   <wp:cNvGraphicFramePr>
                     <a:graphicFrameLocks noChangeAspect="1"/>
@@ -4117,7 +4117,7 @@
                         <pic:spPr>
                           <a:xfrm>
                             <a:off x="0" y="0"/>
-                            <a:ext cx="1371600" cy="1371600"/>
+                            <a:ext cx="2011680" cy="2011680"/>
                           </a:xfrm>
                           <a:prstGeom prst="rect"/>
                         </pic:spPr>
@@ -4131,7 +4131,7 @@
         </w:tc>
         <w:tc>
           <w:tcPr>
-            <w:tcW w:type="dxa" w:w="1512"/>
+            <w:tcW w:type="dxa" w:w="1440"/>
           </w:tcPr>
           <w:p>
             <w:r/>
@@ -4147,7 +4147,7 @@
         </w:tc>
         <w:tc>
           <w:tcPr>
-            <w:tcW w:type="dxa" w:w="1440"/>
+            <w:tcW w:type="dxa" w:w="1368"/>
           </w:tcPr>
           <w:p>
             <w:r/>
@@ -4163,7 +4163,7 @@
         </w:tc>
         <w:tc>
           <w:tcPr>
-            <w:tcW w:type="dxa" w:w="4896"/>
+            <w:tcW w:type="dxa" w:w="4032"/>
           </w:tcPr>
           <w:p>
             <w:r/>
@@ -4187,13 +4187,13 @@
       <w:tr>
         <w:tc>
           <w:tcPr>
-            <w:tcW w:type="dxa" w:w="2376"/>
+            <w:tcW w:type="dxa" w:w="3384"/>
           </w:tcPr>
           <w:p>
             <w:r>
               <w:drawing>
                 <wp:inline xmlns:a="http://schemas.openxmlformats.org/drawingml/2006/main" xmlns:pic="http://schemas.openxmlformats.org/drawingml/2006/picture">
-                  <wp:extent cx="1371600" cy="1371600"/>
+                  <wp:extent cx="2011680" cy="2011680"/>
                   <wp:docPr id="38" name="Picture 38"/>
                   <wp:cNvGraphicFramePr>
                     <a:graphicFrameLocks noChangeAspect="1"/>
@@ -4214,7 +4214,7 @@
                         <pic:spPr>
                           <a:xfrm>
                             <a:off x="0" y="0"/>
-                            <a:ext cx="1371600" cy="1371600"/>
+                            <a:ext cx="2011680" cy="2011680"/>
                           </a:xfrm>
                           <a:prstGeom prst="rect"/>
                         </pic:spPr>
@@ -4228,7 +4228,7 @@
         </w:tc>
         <w:tc>
           <w:tcPr>
-            <w:tcW w:type="dxa" w:w="1512"/>
+            <w:tcW w:type="dxa" w:w="1440"/>
           </w:tcPr>
           <w:p>
             <w:r/>
@@ -4244,7 +4244,7 @@
         </w:tc>
         <w:tc>
           <w:tcPr>
-            <w:tcW w:type="dxa" w:w="1440"/>
+            <w:tcW w:type="dxa" w:w="1368"/>
           </w:tcPr>
           <w:p>
             <w:r/>
@@ -4260,7 +4260,7 @@
         </w:tc>
         <w:tc>
           <w:tcPr>
-            <w:tcW w:type="dxa" w:w="4896"/>
+            <w:tcW w:type="dxa" w:w="4032"/>
           </w:tcPr>
           <w:p>
             <w:r/>
@@ -4284,13 +4284,13 @@
       <w:tr>
         <w:tc>
           <w:tcPr>
-            <w:tcW w:type="dxa" w:w="2376"/>
+            <w:tcW w:type="dxa" w:w="3384"/>
           </w:tcPr>
           <w:p>
             <w:r>
               <w:drawing>
                 <wp:inline xmlns:a="http://schemas.openxmlformats.org/drawingml/2006/main" xmlns:pic="http://schemas.openxmlformats.org/drawingml/2006/picture">
-                  <wp:extent cx="1371600" cy="1371600"/>
+                  <wp:extent cx="2011680" cy="2011680"/>
                   <wp:docPr id="39" name="Picture 39"/>
                   <wp:cNvGraphicFramePr>
                     <a:graphicFrameLocks noChangeAspect="1"/>
@@ -4311,7 +4311,7 @@
                         <pic:spPr>
                           <a:xfrm>
                             <a:off x="0" y="0"/>
-                            <a:ext cx="1371600" cy="1371600"/>
+                            <a:ext cx="2011680" cy="2011680"/>
                           </a:xfrm>
                           <a:prstGeom prst="rect"/>
                         </pic:spPr>
@@ -4325,7 +4325,7 @@
         </w:tc>
         <w:tc>
           <w:tcPr>
-            <w:tcW w:type="dxa" w:w="1512"/>
+            <w:tcW w:type="dxa" w:w="1440"/>
           </w:tcPr>
           <w:p>
             <w:r/>
@@ -4341,7 +4341,7 @@
         </w:tc>
         <w:tc>
           <w:tcPr>
-            <w:tcW w:type="dxa" w:w="1440"/>
+            <w:tcW w:type="dxa" w:w="1368"/>
           </w:tcPr>
           <w:p>
             <w:r/>
@@ -4357,7 +4357,7 @@
         </w:tc>
         <w:tc>
           <w:tcPr>
-            <w:tcW w:type="dxa" w:w="4896"/>
+            <w:tcW w:type="dxa" w:w="4032"/>
           </w:tcPr>
           <w:p>
             <w:r/>
@@ -4381,13 +4381,13 @@
       <w:tr>
         <w:tc>
           <w:tcPr>
-            <w:tcW w:type="dxa" w:w="2376"/>
+            <w:tcW w:type="dxa" w:w="3384"/>
           </w:tcPr>
           <w:p>
             <w:r>
               <w:drawing>
                 <wp:inline xmlns:a="http://schemas.openxmlformats.org/drawingml/2006/main" xmlns:pic="http://schemas.openxmlformats.org/drawingml/2006/picture">
-                  <wp:extent cx="1371600" cy="1371600"/>
+                  <wp:extent cx="2011680" cy="2011680"/>
                   <wp:docPr id="40" name="Picture 40"/>
                   <wp:cNvGraphicFramePr>
                     <a:graphicFrameLocks noChangeAspect="1"/>
@@ -4408,7 +4408,7 @@
                         <pic:spPr>
                           <a:xfrm>
                             <a:off x="0" y="0"/>
-                            <a:ext cx="1371600" cy="1371600"/>
+                            <a:ext cx="2011680" cy="2011680"/>
                           </a:xfrm>
                           <a:prstGeom prst="rect"/>
                         </pic:spPr>
@@ -4422,7 +4422,7 @@
         </w:tc>
         <w:tc>
           <w:tcPr>
-            <w:tcW w:type="dxa" w:w="1512"/>
+            <w:tcW w:type="dxa" w:w="1440"/>
           </w:tcPr>
           <w:p>
             <w:r/>
@@ -4438,7 +4438,7 @@
         </w:tc>
         <w:tc>
           <w:tcPr>
-            <w:tcW w:type="dxa" w:w="1440"/>
+            <w:tcW w:type="dxa" w:w="1368"/>
           </w:tcPr>
           <w:p>
             <w:r/>
@@ -4454,7 +4454,7 @@
         </w:tc>
         <w:tc>
           <w:tcPr>
-            <w:tcW w:type="dxa" w:w="4896"/>
+            <w:tcW w:type="dxa" w:w="4032"/>
           </w:tcPr>
           <w:p>
             <w:r/>
@@ -4478,13 +4478,13 @@
       <w:tr>
         <w:tc>
           <w:tcPr>
-            <w:tcW w:type="dxa" w:w="2376"/>
+            <w:tcW w:type="dxa" w:w="3384"/>
           </w:tcPr>
           <w:p>
             <w:r>
               <w:drawing>
                 <wp:inline xmlns:a="http://schemas.openxmlformats.org/drawingml/2006/main" xmlns:pic="http://schemas.openxmlformats.org/drawingml/2006/picture">
-                  <wp:extent cx="1371600" cy="1371600"/>
+                  <wp:extent cx="2011680" cy="2011680"/>
                   <wp:docPr id="41" name="Picture 41"/>
                   <wp:cNvGraphicFramePr>
                     <a:graphicFrameLocks noChangeAspect="1"/>
@@ -4505,7 +4505,7 @@
                         <pic:spPr>
                           <a:xfrm>
                             <a:off x="0" y="0"/>
-                            <a:ext cx="1371600" cy="1371600"/>
+                            <a:ext cx="2011680" cy="2011680"/>
                           </a:xfrm>
                           <a:prstGeom prst="rect"/>
                         </pic:spPr>
@@ -4519,7 +4519,7 @@
         </w:tc>
         <w:tc>
           <w:tcPr>
-            <w:tcW w:type="dxa" w:w="1512"/>
+            <w:tcW w:type="dxa" w:w="1440"/>
           </w:tcPr>
           <w:p>
             <w:r/>
@@ -4535,7 +4535,7 @@
         </w:tc>
         <w:tc>
           <w:tcPr>
-            <w:tcW w:type="dxa" w:w="1440"/>
+            <w:tcW w:type="dxa" w:w="1368"/>
           </w:tcPr>
           <w:p>
             <w:r/>
@@ -4551,7 +4551,7 @@
         </w:tc>
         <w:tc>
           <w:tcPr>
-            <w:tcW w:type="dxa" w:w="4896"/>
+            <w:tcW w:type="dxa" w:w="4032"/>
           </w:tcPr>
           <w:p>
             <w:r/>
@@ -4575,13 +4575,13 @@
       <w:tr>
         <w:tc>
           <w:tcPr>
-            <w:tcW w:type="dxa" w:w="2376"/>
+            <w:tcW w:type="dxa" w:w="3384"/>
           </w:tcPr>
           <w:p>
             <w:r>
               <w:drawing>
                 <wp:inline xmlns:a="http://schemas.openxmlformats.org/drawingml/2006/main" xmlns:pic="http://schemas.openxmlformats.org/drawingml/2006/picture">
-                  <wp:extent cx="1371600" cy="1371600"/>
+                  <wp:extent cx="2011680" cy="2011680"/>
                   <wp:docPr id="42" name="Picture 42"/>
                   <wp:cNvGraphicFramePr>
                     <a:graphicFrameLocks noChangeAspect="1"/>
@@ -4602,7 +4602,7 @@
                         <pic:spPr>
                           <a:xfrm>
                             <a:off x="0" y="0"/>
-                            <a:ext cx="1371600" cy="1371600"/>
+                            <a:ext cx="2011680" cy="2011680"/>
                           </a:xfrm>
                           <a:prstGeom prst="rect"/>
                         </pic:spPr>
@@ -4616,7 +4616,7 @@
         </w:tc>
         <w:tc>
           <w:tcPr>
-            <w:tcW w:type="dxa" w:w="1512"/>
+            <w:tcW w:type="dxa" w:w="1440"/>
           </w:tcPr>
           <w:p>
             <w:r/>
@@ -4632,7 +4632,7 @@
         </w:tc>
         <w:tc>
           <w:tcPr>
-            <w:tcW w:type="dxa" w:w="1440"/>
+            <w:tcW w:type="dxa" w:w="1368"/>
           </w:tcPr>
           <w:p>
             <w:r/>
@@ -4648,7 +4648,7 @@
         </w:tc>
         <w:tc>
           <w:tcPr>
-            <w:tcW w:type="dxa" w:w="4896"/>
+            <w:tcW w:type="dxa" w:w="4032"/>
           </w:tcPr>
           <w:p>
             <w:r/>
@@ -4672,13 +4672,13 @@
       <w:tr>
         <w:tc>
           <w:tcPr>
-            <w:tcW w:type="dxa" w:w="2376"/>
+            <w:tcW w:type="dxa" w:w="3384"/>
           </w:tcPr>
           <w:p>
             <w:r>
               <w:drawing>
                 <wp:inline xmlns:a="http://schemas.openxmlformats.org/drawingml/2006/main" xmlns:pic="http://schemas.openxmlformats.org/drawingml/2006/picture">
-                  <wp:extent cx="1371600" cy="1371600"/>
+                  <wp:extent cx="2011680" cy="2011680"/>
                   <wp:docPr id="43" name="Picture 43"/>
                   <wp:cNvGraphicFramePr>
                     <a:graphicFrameLocks noChangeAspect="1"/>
@@ -4699,7 +4699,7 @@
                         <pic:spPr>
                           <a:xfrm>
                             <a:off x="0" y="0"/>
-                            <a:ext cx="1371600" cy="1371600"/>
+                            <a:ext cx="2011680" cy="2011680"/>
                           </a:xfrm>
                           <a:prstGeom prst="rect"/>
                         </pic:spPr>
@@ -4713,7 +4713,7 @@
         </w:tc>
         <w:tc>
           <w:tcPr>
-            <w:tcW w:type="dxa" w:w="1512"/>
+            <w:tcW w:type="dxa" w:w="1440"/>
           </w:tcPr>
           <w:p>
             <w:r/>
@@ -4729,7 +4729,7 @@
         </w:tc>
         <w:tc>
           <w:tcPr>
-            <w:tcW w:type="dxa" w:w="1440"/>
+            <w:tcW w:type="dxa" w:w="1368"/>
           </w:tcPr>
           <w:p>
             <w:r/>
@@ -4745,7 +4745,7 @@
         </w:tc>
         <w:tc>
           <w:tcPr>
-            <w:tcW w:type="dxa" w:w="4896"/>
+            <w:tcW w:type="dxa" w:w="4032"/>
           </w:tcPr>
           <w:p>
             <w:r/>
@@ -4769,13 +4769,13 @@
       <w:tr>
         <w:tc>
           <w:tcPr>
-            <w:tcW w:type="dxa" w:w="2376"/>
+            <w:tcW w:type="dxa" w:w="3384"/>
           </w:tcPr>
           <w:p>
             <w:r>
               <w:drawing>
                 <wp:inline xmlns:a="http://schemas.openxmlformats.org/drawingml/2006/main" xmlns:pic="http://schemas.openxmlformats.org/drawingml/2006/picture">
-                  <wp:extent cx="1371600" cy="1371600"/>
+                  <wp:extent cx="2011680" cy="2011680"/>
                   <wp:docPr id="44" name="Picture 44"/>
                   <wp:cNvGraphicFramePr>
                     <a:graphicFrameLocks noChangeAspect="1"/>
@@ -4796,7 +4796,7 @@
                         <pic:spPr>
                           <a:xfrm>
                             <a:off x="0" y="0"/>
-                            <a:ext cx="1371600" cy="1371600"/>
+                            <a:ext cx="2011680" cy="2011680"/>
                           </a:xfrm>
                           <a:prstGeom prst="rect"/>
                         </pic:spPr>
@@ -4810,7 +4810,7 @@
         </w:tc>
         <w:tc>
           <w:tcPr>
-            <w:tcW w:type="dxa" w:w="1512"/>
+            <w:tcW w:type="dxa" w:w="1440"/>
           </w:tcPr>
           <w:p>
             <w:r/>
@@ -4826,7 +4826,7 @@
         </w:tc>
         <w:tc>
           <w:tcPr>
-            <w:tcW w:type="dxa" w:w="1440"/>
+            <w:tcW w:type="dxa" w:w="1368"/>
           </w:tcPr>
           <w:p>
             <w:r/>
@@ -4842,7 +4842,7 @@
         </w:tc>
         <w:tc>
           <w:tcPr>
-            <w:tcW w:type="dxa" w:w="4896"/>
+            <w:tcW w:type="dxa" w:w="4032"/>
           </w:tcPr>
           <w:p>
             <w:r/>
@@ -4866,13 +4866,13 @@
       <w:tr>
         <w:tc>
           <w:tcPr>
-            <w:tcW w:type="dxa" w:w="2376"/>
+            <w:tcW w:type="dxa" w:w="3384"/>
           </w:tcPr>
           <w:p>
             <w:r>
               <w:drawing>
                 <wp:inline xmlns:a="http://schemas.openxmlformats.org/drawingml/2006/main" xmlns:pic="http://schemas.openxmlformats.org/drawingml/2006/picture">
-                  <wp:extent cx="1371600" cy="1371600"/>
+                  <wp:extent cx="2011680" cy="2011680"/>
                   <wp:docPr id="45" name="Picture 45"/>
                   <wp:cNvGraphicFramePr>
                     <a:graphicFrameLocks noChangeAspect="1"/>
@@ -4893,7 +4893,7 @@
                         <pic:spPr>
                           <a:xfrm>
                             <a:off x="0" y="0"/>
-                            <a:ext cx="1371600" cy="1371600"/>
+                            <a:ext cx="2011680" cy="2011680"/>
                           </a:xfrm>
                           <a:prstGeom prst="rect"/>
                         </pic:spPr>
@@ -4907,7 +4907,7 @@
         </w:tc>
         <w:tc>
           <w:tcPr>
-            <w:tcW w:type="dxa" w:w="1512"/>
+            <w:tcW w:type="dxa" w:w="1440"/>
           </w:tcPr>
           <w:p>
             <w:r/>
@@ -4923,7 +4923,7 @@
         </w:tc>
         <w:tc>
           <w:tcPr>
-            <w:tcW w:type="dxa" w:w="1440"/>
+            <w:tcW w:type="dxa" w:w="1368"/>
           </w:tcPr>
           <w:p>
             <w:r/>
@@ -4939,7 +4939,7 @@
         </w:tc>
         <w:tc>
           <w:tcPr>
-            <w:tcW w:type="dxa" w:w="4896"/>
+            <w:tcW w:type="dxa" w:w="4032"/>
           </w:tcPr>
           <w:p>
             <w:r/>
@@ -4963,13 +4963,13 @@
       <w:tr>
         <w:tc>
           <w:tcPr>
-            <w:tcW w:type="dxa" w:w="2376"/>
+            <w:tcW w:type="dxa" w:w="3384"/>
           </w:tcPr>
           <w:p>
             <w:r>
               <w:drawing>
                 <wp:inline xmlns:a="http://schemas.openxmlformats.org/drawingml/2006/main" xmlns:pic="http://schemas.openxmlformats.org/drawingml/2006/picture">
-                  <wp:extent cx="1371600" cy="1371600"/>
+                  <wp:extent cx="2011680" cy="2011680"/>
                   <wp:docPr id="46" name="Picture 46"/>
                   <wp:cNvGraphicFramePr>
                     <a:graphicFrameLocks noChangeAspect="1"/>
@@ -4990,7 +4990,7 @@
                         <pic:spPr>
                           <a:xfrm>
                             <a:off x="0" y="0"/>
-                            <a:ext cx="1371600" cy="1371600"/>
+                            <a:ext cx="2011680" cy="2011680"/>
                           </a:xfrm>
                           <a:prstGeom prst="rect"/>
                         </pic:spPr>
@@ -5004,7 +5004,7 @@
         </w:tc>
         <w:tc>
           <w:tcPr>
-            <w:tcW w:type="dxa" w:w="1512"/>
+            <w:tcW w:type="dxa" w:w="1440"/>
           </w:tcPr>
           <w:p>
             <w:r/>
@@ -5020,7 +5020,7 @@
         </w:tc>
         <w:tc>
           <w:tcPr>
-            <w:tcW w:type="dxa" w:w="1440"/>
+            <w:tcW w:type="dxa" w:w="1368"/>
           </w:tcPr>
           <w:p>
             <w:r/>
@@ -5036,7 +5036,7 @@
         </w:tc>
         <w:tc>
           <w:tcPr>
-            <w:tcW w:type="dxa" w:w="4896"/>
+            <w:tcW w:type="dxa" w:w="4032"/>
           </w:tcPr>
           <w:p>
             <w:r/>
@@ -5060,13 +5060,13 @@
       <w:tr>
         <w:tc>
           <w:tcPr>
-            <w:tcW w:type="dxa" w:w="2376"/>
+            <w:tcW w:type="dxa" w:w="3384"/>
           </w:tcPr>
           <w:p>
             <w:r>
               <w:drawing>
                 <wp:inline xmlns:a="http://schemas.openxmlformats.org/drawingml/2006/main" xmlns:pic="http://schemas.openxmlformats.org/drawingml/2006/picture">
-                  <wp:extent cx="1371600" cy="1371600"/>
+                  <wp:extent cx="2011680" cy="2011680"/>
                   <wp:docPr id="47" name="Picture 47"/>
                   <wp:cNvGraphicFramePr>
                     <a:graphicFrameLocks noChangeAspect="1"/>
@@ -5087,7 +5087,7 @@
                         <pic:spPr>
                           <a:xfrm>
                             <a:off x="0" y="0"/>
-                            <a:ext cx="1371600" cy="1371600"/>
+                            <a:ext cx="2011680" cy="2011680"/>
                           </a:xfrm>
                           <a:prstGeom prst="rect"/>
                         </pic:spPr>
@@ -5101,7 +5101,7 @@
         </w:tc>
         <w:tc>
           <w:tcPr>
-            <w:tcW w:type="dxa" w:w="1512"/>
+            <w:tcW w:type="dxa" w:w="1440"/>
           </w:tcPr>
           <w:p>
             <w:r/>
@@ -5117,7 +5117,7 @@
         </w:tc>
         <w:tc>
           <w:tcPr>
-            <w:tcW w:type="dxa" w:w="1440"/>
+            <w:tcW w:type="dxa" w:w="1368"/>
           </w:tcPr>
           <w:p>
             <w:r/>
@@ -5133,7 +5133,7 @@
         </w:tc>
         <w:tc>
           <w:tcPr>
-            <w:tcW w:type="dxa" w:w="4896"/>
+            <w:tcW w:type="dxa" w:w="4032"/>
           </w:tcPr>
           <w:p>
             <w:r/>
@@ -5157,13 +5157,13 @@
       <w:tr>
         <w:tc>
           <w:tcPr>
-            <w:tcW w:type="dxa" w:w="2376"/>
+            <w:tcW w:type="dxa" w:w="3384"/>
           </w:tcPr>
           <w:p>
             <w:r>
               <w:drawing>
                 <wp:inline xmlns:a="http://schemas.openxmlformats.org/drawingml/2006/main" xmlns:pic="http://schemas.openxmlformats.org/drawingml/2006/picture">
-                  <wp:extent cx="1371600" cy="1371600"/>
+                  <wp:extent cx="2011680" cy="2011680"/>
                   <wp:docPr id="48" name="Picture 48"/>
                   <wp:cNvGraphicFramePr>
                     <a:graphicFrameLocks noChangeAspect="1"/>
@@ -5184,7 +5184,7 @@
                         <pic:spPr>
                           <a:xfrm>
                             <a:off x="0" y="0"/>
-                            <a:ext cx="1371600" cy="1371600"/>
+                            <a:ext cx="2011680" cy="2011680"/>
                           </a:xfrm>
                           <a:prstGeom prst="rect"/>
                         </pic:spPr>
@@ -5198,7 +5198,7 @@
         </w:tc>
         <w:tc>
           <w:tcPr>
-            <w:tcW w:type="dxa" w:w="1512"/>
+            <w:tcW w:type="dxa" w:w="1440"/>
           </w:tcPr>
           <w:p>
             <w:r/>
@@ -5214,7 +5214,7 @@
         </w:tc>
         <w:tc>
           <w:tcPr>
-            <w:tcW w:type="dxa" w:w="1440"/>
+            <w:tcW w:type="dxa" w:w="1368"/>
           </w:tcPr>
           <w:p>
             <w:r/>
@@ -5230,7 +5230,7 @@
         </w:tc>
         <w:tc>
           <w:tcPr>
-            <w:tcW w:type="dxa" w:w="4896"/>
+            <w:tcW w:type="dxa" w:w="4032"/>
           </w:tcPr>
           <w:p>
             <w:r/>

</xml_diff>